<commit_message>
Add bootstrap uncertainty to Assignment 3 evaluation
</commit_message>
<xml_diff>
--- a/odev3/PROJE_ILERLEME_RAPORU_3.docx
+++ b/odev3/PROJE_ILERLEME_RAPORU_3.docx
@@ -1073,7 +1073,7 @@
                 <w:rFonts w:ascii="Arial" w:hAnsi="Arial"/>
                 <w:sz w:val="16"/>
               </w:rPr>
-              <w:t>Hazır (7.1 KB)</w:t>
+              <w:t>Hazır (8.1 KB)</w:t>
             </w:r>
           </w:p>
         </w:tc>
@@ -1421,7 +1421,7 @@
                 <w:rFonts w:ascii="Arial" w:hAnsi="Arial"/>
                 <w:sz w:val="16"/>
               </w:rPr>
-              <w:t>Hazır (7.1 KB)</w:t>
+              <w:t>Hazır (8.1 KB)</w:t>
             </w:r>
           </w:p>
         </w:tc>
@@ -29074,6 +29074,818 @@
       </w:tr>
     </w:tbl>
     <w:p/>
+    <w:p>
+      <w:r>
+        <w:rPr>
+          <w:b/>
+        </w:rPr>
+        <w:t>Sınıf-korumalı bootstrap ile held-out test güven aralıkları</w:t>
+      </w:r>
+    </w:p>
+    <w:tbl>
+      <w:tblPr>
+        <w:tblStyle w:val="TableGrid"/>
+        <w:tblW w:type="auto" w:w="0"/>
+        <w:tblLook w:firstColumn="1" w:firstRow="1" w:lastColumn="0" w:lastRow="0" w:noHBand="0" w:noVBand="1" w:val="04A0"/>
+      </w:tblPr>
+      <w:tblGrid>
+        <w:gridCol w:w="1728"/>
+        <w:gridCol w:w="1728"/>
+        <w:gridCol w:w="1728"/>
+        <w:gridCol w:w="1728"/>
+        <w:gridCol w:w="1728"/>
+        <w:gridCol w:w="1728"/>
+      </w:tblGrid>
+      <w:tr>
+        <w:tc>
+          <w:tcPr>
+            <w:tcW w:type="dxa" w:w="1728"/>
+          </w:tcPr>
+          <w:p>
+            <w:r>
+              <w:rPr>
+                <w:rFonts w:ascii="Arial" w:hAnsi="Arial"/>
+                <w:b/>
+                <w:sz w:val="16"/>
+              </w:rPr>
+              <w:t>Veri seti</w:t>
+            </w:r>
+          </w:p>
+        </w:tc>
+        <w:tc>
+          <w:tcPr>
+            <w:tcW w:type="dxa" w:w="1728"/>
+          </w:tcPr>
+          <w:p>
+            <w:r>
+              <w:rPr>
+                <w:rFonts w:ascii="Arial" w:hAnsi="Arial"/>
+                <w:b/>
+                <w:sz w:val="16"/>
+              </w:rPr>
+              <w:t>Metrik</w:t>
+            </w:r>
+          </w:p>
+        </w:tc>
+        <w:tc>
+          <w:tcPr>
+            <w:tcW w:type="dxa" w:w="1728"/>
+          </w:tcPr>
+          <w:p>
+            <w:r>
+              <w:rPr>
+                <w:rFonts w:ascii="Arial" w:hAnsi="Arial"/>
+                <w:b/>
+                <w:sz w:val="16"/>
+              </w:rPr>
+              <w:t>Tahmin</w:t>
+            </w:r>
+          </w:p>
+        </w:tc>
+        <w:tc>
+          <w:tcPr>
+            <w:tcW w:type="dxa" w:w="1728"/>
+          </w:tcPr>
+          <w:p>
+            <w:r>
+              <w:rPr>
+                <w:rFonts w:ascii="Arial" w:hAnsi="Arial"/>
+                <w:b/>
+                <w:sz w:val="16"/>
+              </w:rPr>
+              <w:t>Alt sınır</w:t>
+            </w:r>
+          </w:p>
+        </w:tc>
+        <w:tc>
+          <w:tcPr>
+            <w:tcW w:type="dxa" w:w="1728"/>
+          </w:tcPr>
+          <w:p>
+            <w:r>
+              <w:rPr>
+                <w:rFonts w:ascii="Arial" w:hAnsi="Arial"/>
+                <w:b/>
+                <w:sz w:val="16"/>
+              </w:rPr>
+              <w:t>Üst sınır</w:t>
+            </w:r>
+          </w:p>
+        </w:tc>
+        <w:tc>
+          <w:tcPr>
+            <w:tcW w:type="dxa" w:w="1728"/>
+          </w:tcPr>
+          <w:p>
+            <w:r>
+              <w:rPr>
+                <w:rFonts w:ascii="Arial" w:hAnsi="Arial"/>
+                <w:b/>
+                <w:sz w:val="16"/>
+              </w:rPr>
+              <w:t>Güven</w:t>
+            </w:r>
+          </w:p>
+        </w:tc>
+      </w:tr>
+      <w:tr>
+        <w:tc>
+          <w:tcPr>
+            <w:tcW w:type="dxa" w:w="1728"/>
+          </w:tcPr>
+          <w:p>
+            <w:r>
+              <w:rPr>
+                <w:rFonts w:ascii="Arial" w:hAnsi="Arial"/>
+                <w:sz w:val="16"/>
+              </w:rPr>
+              <w:t>CREMA-D</w:t>
+            </w:r>
+          </w:p>
+        </w:tc>
+        <w:tc>
+          <w:tcPr>
+            <w:tcW w:type="dxa" w:w="1728"/>
+          </w:tcPr>
+          <w:p>
+            <w:r>
+              <w:rPr>
+                <w:rFonts w:ascii="Arial" w:hAnsi="Arial"/>
+                <w:sz w:val="16"/>
+              </w:rPr>
+              <w:t>Doğruluk</w:t>
+            </w:r>
+          </w:p>
+        </w:tc>
+        <w:tc>
+          <w:tcPr>
+            <w:tcW w:type="dxa" w:w="1728"/>
+          </w:tcPr>
+          <w:p>
+            <w:r>
+              <w:rPr>
+                <w:rFonts w:ascii="Arial" w:hAnsi="Arial"/>
+                <w:sz w:val="16"/>
+              </w:rPr>
+              <w:t>0.4424</w:t>
+            </w:r>
+          </w:p>
+        </w:tc>
+        <w:tc>
+          <w:tcPr>
+            <w:tcW w:type="dxa" w:w="1728"/>
+          </w:tcPr>
+          <w:p>
+            <w:r>
+              <w:rPr>
+                <w:rFonts w:ascii="Arial" w:hAnsi="Arial"/>
+                <w:sz w:val="16"/>
+              </w:rPr>
+              <w:t>0.3925</w:t>
+            </w:r>
+          </w:p>
+        </w:tc>
+        <w:tc>
+          <w:tcPr>
+            <w:tcW w:type="dxa" w:w="1728"/>
+          </w:tcPr>
+          <w:p>
+            <w:r>
+              <w:rPr>
+                <w:rFonts w:ascii="Arial" w:hAnsi="Arial"/>
+                <w:sz w:val="16"/>
+              </w:rPr>
+              <w:t>0.4922</w:t>
+            </w:r>
+          </w:p>
+        </w:tc>
+        <w:tc>
+          <w:tcPr>
+            <w:tcW w:type="dxa" w:w="1728"/>
+          </w:tcPr>
+          <w:p>
+            <w:r>
+              <w:rPr>
+                <w:rFonts w:ascii="Arial" w:hAnsi="Arial"/>
+                <w:sz w:val="16"/>
+              </w:rPr>
+              <w:t>0.9500</w:t>
+            </w:r>
+          </w:p>
+        </w:tc>
+      </w:tr>
+      <w:tr>
+        <w:tc>
+          <w:tcPr>
+            <w:tcW w:type="dxa" w:w="1728"/>
+          </w:tcPr>
+          <w:p>
+            <w:r>
+              <w:rPr>
+                <w:rFonts w:ascii="Arial" w:hAnsi="Arial"/>
+                <w:sz w:val="16"/>
+              </w:rPr>
+              <w:t>CREMA-D</w:t>
+            </w:r>
+          </w:p>
+        </w:tc>
+        <w:tc>
+          <w:tcPr>
+            <w:tcW w:type="dxa" w:w="1728"/>
+          </w:tcPr>
+          <w:p>
+            <w:r>
+              <w:rPr>
+                <w:rFonts w:ascii="Arial" w:hAnsi="Arial"/>
+                <w:sz w:val="16"/>
+              </w:rPr>
+              <w:t>Dengeli doğruluk</w:t>
+            </w:r>
+          </w:p>
+        </w:tc>
+        <w:tc>
+          <w:tcPr>
+            <w:tcW w:type="dxa" w:w="1728"/>
+          </w:tcPr>
+          <w:p>
+            <w:r>
+              <w:rPr>
+                <w:rFonts w:ascii="Arial" w:hAnsi="Arial"/>
+                <w:sz w:val="16"/>
+              </w:rPr>
+              <w:t>0.4416</w:t>
+            </w:r>
+          </w:p>
+        </w:tc>
+        <w:tc>
+          <w:tcPr>
+            <w:tcW w:type="dxa" w:w="1728"/>
+          </w:tcPr>
+          <w:p>
+            <w:r>
+              <w:rPr>
+                <w:rFonts w:ascii="Arial" w:hAnsi="Arial"/>
+                <w:sz w:val="16"/>
+              </w:rPr>
+              <w:t>0.3913</w:t>
+            </w:r>
+          </w:p>
+        </w:tc>
+        <w:tc>
+          <w:tcPr>
+            <w:tcW w:type="dxa" w:w="1728"/>
+          </w:tcPr>
+          <w:p>
+            <w:r>
+              <w:rPr>
+                <w:rFonts w:ascii="Arial" w:hAnsi="Arial"/>
+                <w:sz w:val="16"/>
+              </w:rPr>
+              <w:t>0.4906</w:t>
+            </w:r>
+          </w:p>
+        </w:tc>
+        <w:tc>
+          <w:tcPr>
+            <w:tcW w:type="dxa" w:w="1728"/>
+          </w:tcPr>
+          <w:p>
+            <w:r>
+              <w:rPr>
+                <w:rFonts w:ascii="Arial" w:hAnsi="Arial"/>
+                <w:sz w:val="16"/>
+              </w:rPr>
+              <w:t>0.9500</w:t>
+            </w:r>
+          </w:p>
+        </w:tc>
+      </w:tr>
+      <w:tr>
+        <w:tc>
+          <w:tcPr>
+            <w:tcW w:type="dxa" w:w="1728"/>
+          </w:tcPr>
+          <w:p>
+            <w:r>
+              <w:rPr>
+                <w:rFonts w:ascii="Arial" w:hAnsi="Arial"/>
+                <w:sz w:val="16"/>
+              </w:rPr>
+              <w:t>CREMA-D</w:t>
+            </w:r>
+          </w:p>
+        </w:tc>
+        <w:tc>
+          <w:tcPr>
+            <w:tcW w:type="dxa" w:w="1728"/>
+          </w:tcPr>
+          <w:p>
+            <w:r>
+              <w:rPr>
+                <w:rFonts w:ascii="Arial" w:hAnsi="Arial"/>
+                <w:sz w:val="16"/>
+              </w:rPr>
+              <w:t>Macro-F1</w:t>
+            </w:r>
+          </w:p>
+        </w:tc>
+        <w:tc>
+          <w:tcPr>
+            <w:tcW w:type="dxa" w:w="1728"/>
+          </w:tcPr>
+          <w:p>
+            <w:r>
+              <w:rPr>
+                <w:rFonts w:ascii="Arial" w:hAnsi="Arial"/>
+                <w:sz w:val="16"/>
+              </w:rPr>
+              <w:t>0.4299</w:t>
+            </w:r>
+          </w:p>
+        </w:tc>
+        <w:tc>
+          <w:tcPr>
+            <w:tcW w:type="dxa" w:w="1728"/>
+          </w:tcPr>
+          <w:p>
+            <w:r>
+              <w:rPr>
+                <w:rFonts w:ascii="Arial" w:hAnsi="Arial"/>
+                <w:sz w:val="16"/>
+              </w:rPr>
+              <w:t>0.3754</w:t>
+            </w:r>
+          </w:p>
+        </w:tc>
+        <w:tc>
+          <w:tcPr>
+            <w:tcW w:type="dxa" w:w="1728"/>
+          </w:tcPr>
+          <w:p>
+            <w:r>
+              <w:rPr>
+                <w:rFonts w:ascii="Arial" w:hAnsi="Arial"/>
+                <w:sz w:val="16"/>
+              </w:rPr>
+              <w:t>0.4795</w:t>
+            </w:r>
+          </w:p>
+        </w:tc>
+        <w:tc>
+          <w:tcPr>
+            <w:tcW w:type="dxa" w:w="1728"/>
+          </w:tcPr>
+          <w:p>
+            <w:r>
+              <w:rPr>
+                <w:rFonts w:ascii="Arial" w:hAnsi="Arial"/>
+                <w:sz w:val="16"/>
+              </w:rPr>
+              <w:t>0.9500</w:t>
+            </w:r>
+          </w:p>
+        </w:tc>
+      </w:tr>
+      <w:tr>
+        <w:tc>
+          <w:tcPr>
+            <w:tcW w:type="dxa" w:w="1728"/>
+          </w:tcPr>
+          <w:p>
+            <w:r>
+              <w:rPr>
+                <w:rFonts w:ascii="Arial" w:hAnsi="Arial"/>
+                <w:sz w:val="16"/>
+              </w:rPr>
+              <w:t>CREMA-D</w:t>
+            </w:r>
+          </w:p>
+        </w:tc>
+        <w:tc>
+          <w:tcPr>
+            <w:tcW w:type="dxa" w:w="1728"/>
+          </w:tcPr>
+          <w:p>
+            <w:r>
+              <w:rPr>
+                <w:rFonts w:ascii="Arial" w:hAnsi="Arial"/>
+                <w:sz w:val="16"/>
+              </w:rPr>
+              <w:t>Weighted-F1</w:t>
+            </w:r>
+          </w:p>
+        </w:tc>
+        <w:tc>
+          <w:tcPr>
+            <w:tcW w:type="dxa" w:w="1728"/>
+          </w:tcPr>
+          <w:p>
+            <w:r>
+              <w:rPr>
+                <w:rFonts w:ascii="Arial" w:hAnsi="Arial"/>
+                <w:sz w:val="16"/>
+              </w:rPr>
+              <w:t>0.4283</w:t>
+            </w:r>
+          </w:p>
+        </w:tc>
+        <w:tc>
+          <w:tcPr>
+            <w:tcW w:type="dxa" w:w="1728"/>
+          </w:tcPr>
+          <w:p>
+            <w:r>
+              <w:rPr>
+                <w:rFonts w:ascii="Arial" w:hAnsi="Arial"/>
+                <w:sz w:val="16"/>
+              </w:rPr>
+              <w:t>0.3748</w:t>
+            </w:r>
+          </w:p>
+        </w:tc>
+        <w:tc>
+          <w:tcPr>
+            <w:tcW w:type="dxa" w:w="1728"/>
+          </w:tcPr>
+          <w:p>
+            <w:r>
+              <w:rPr>
+                <w:rFonts w:ascii="Arial" w:hAnsi="Arial"/>
+                <w:sz w:val="16"/>
+              </w:rPr>
+              <w:t>0.4773</w:t>
+            </w:r>
+          </w:p>
+        </w:tc>
+        <w:tc>
+          <w:tcPr>
+            <w:tcW w:type="dxa" w:w="1728"/>
+          </w:tcPr>
+          <w:p>
+            <w:r>
+              <w:rPr>
+                <w:rFonts w:ascii="Arial" w:hAnsi="Arial"/>
+                <w:sz w:val="16"/>
+              </w:rPr>
+              <w:t>0.9500</w:t>
+            </w:r>
+          </w:p>
+        </w:tc>
+      </w:tr>
+      <w:tr>
+        <w:tc>
+          <w:tcPr>
+            <w:tcW w:type="dxa" w:w="1728"/>
+          </w:tcPr>
+          <w:p>
+            <w:r>
+              <w:rPr>
+                <w:rFonts w:ascii="Arial" w:hAnsi="Arial"/>
+                <w:sz w:val="16"/>
+              </w:rPr>
+              <w:t>MELD</w:t>
+            </w:r>
+          </w:p>
+        </w:tc>
+        <w:tc>
+          <w:tcPr>
+            <w:tcW w:type="dxa" w:w="1728"/>
+          </w:tcPr>
+          <w:p>
+            <w:r>
+              <w:rPr>
+                <w:rFonts w:ascii="Arial" w:hAnsi="Arial"/>
+                <w:sz w:val="16"/>
+              </w:rPr>
+              <w:t>Doğruluk</w:t>
+            </w:r>
+          </w:p>
+        </w:tc>
+        <w:tc>
+          <w:tcPr>
+            <w:tcW w:type="dxa" w:w="1728"/>
+          </w:tcPr>
+          <w:p>
+            <w:r>
+              <w:rPr>
+                <w:rFonts w:ascii="Arial" w:hAnsi="Arial"/>
+                <w:sz w:val="16"/>
+              </w:rPr>
+              <w:t>0.1907</w:t>
+            </w:r>
+          </w:p>
+        </w:tc>
+        <w:tc>
+          <w:tcPr>
+            <w:tcW w:type="dxa" w:w="1728"/>
+          </w:tcPr>
+          <w:p>
+            <w:r>
+              <w:rPr>
+                <w:rFonts w:ascii="Arial" w:hAnsi="Arial"/>
+                <w:sz w:val="16"/>
+              </w:rPr>
+              <w:t>0.1535</w:t>
+            </w:r>
+          </w:p>
+        </w:tc>
+        <w:tc>
+          <w:tcPr>
+            <w:tcW w:type="dxa" w:w="1728"/>
+          </w:tcPr>
+          <w:p>
+            <w:r>
+              <w:rPr>
+                <w:rFonts w:ascii="Arial" w:hAnsi="Arial"/>
+                <w:sz w:val="16"/>
+              </w:rPr>
+              <w:t>0.2302</w:t>
+            </w:r>
+          </w:p>
+        </w:tc>
+        <w:tc>
+          <w:tcPr>
+            <w:tcW w:type="dxa" w:w="1728"/>
+          </w:tcPr>
+          <w:p>
+            <w:r>
+              <w:rPr>
+                <w:rFonts w:ascii="Arial" w:hAnsi="Arial"/>
+                <w:sz w:val="16"/>
+              </w:rPr>
+              <w:t>0.9500</w:t>
+            </w:r>
+          </w:p>
+        </w:tc>
+      </w:tr>
+      <w:tr>
+        <w:tc>
+          <w:tcPr>
+            <w:tcW w:type="dxa" w:w="1728"/>
+          </w:tcPr>
+          <w:p>
+            <w:r>
+              <w:rPr>
+                <w:rFonts w:ascii="Arial" w:hAnsi="Arial"/>
+                <w:sz w:val="16"/>
+              </w:rPr>
+              <w:t>MELD</w:t>
+            </w:r>
+          </w:p>
+        </w:tc>
+        <w:tc>
+          <w:tcPr>
+            <w:tcW w:type="dxa" w:w="1728"/>
+          </w:tcPr>
+          <w:p>
+            <w:r>
+              <w:rPr>
+                <w:rFonts w:ascii="Arial" w:hAnsi="Arial"/>
+                <w:sz w:val="16"/>
+              </w:rPr>
+              <w:t>Dengeli doğruluk</w:t>
+            </w:r>
+          </w:p>
+        </w:tc>
+        <w:tc>
+          <w:tcPr>
+            <w:tcW w:type="dxa" w:w="1728"/>
+          </w:tcPr>
+          <w:p>
+            <w:r>
+              <w:rPr>
+                <w:rFonts w:ascii="Arial" w:hAnsi="Arial"/>
+                <w:sz w:val="16"/>
+              </w:rPr>
+              <w:t>0.1891</w:t>
+            </w:r>
+          </w:p>
+        </w:tc>
+        <w:tc>
+          <w:tcPr>
+            <w:tcW w:type="dxa" w:w="1728"/>
+          </w:tcPr>
+          <w:p>
+            <w:r>
+              <w:rPr>
+                <w:rFonts w:ascii="Arial" w:hAnsi="Arial"/>
+                <w:sz w:val="16"/>
+              </w:rPr>
+              <w:t>0.1509</w:t>
+            </w:r>
+          </w:p>
+        </w:tc>
+        <w:tc>
+          <w:tcPr>
+            <w:tcW w:type="dxa" w:w="1728"/>
+          </w:tcPr>
+          <w:p>
+            <w:r>
+              <w:rPr>
+                <w:rFonts w:ascii="Arial" w:hAnsi="Arial"/>
+                <w:sz w:val="16"/>
+              </w:rPr>
+              <w:t>0.2287</w:t>
+            </w:r>
+          </w:p>
+        </w:tc>
+        <w:tc>
+          <w:tcPr>
+            <w:tcW w:type="dxa" w:w="1728"/>
+          </w:tcPr>
+          <w:p>
+            <w:r>
+              <w:rPr>
+                <w:rFonts w:ascii="Arial" w:hAnsi="Arial"/>
+                <w:sz w:val="16"/>
+              </w:rPr>
+              <w:t>0.9500</w:t>
+            </w:r>
+          </w:p>
+        </w:tc>
+      </w:tr>
+      <w:tr>
+        <w:tc>
+          <w:tcPr>
+            <w:tcW w:type="dxa" w:w="1728"/>
+          </w:tcPr>
+          <w:p>
+            <w:r>
+              <w:rPr>
+                <w:rFonts w:ascii="Arial" w:hAnsi="Arial"/>
+                <w:sz w:val="16"/>
+              </w:rPr>
+              <w:t>MELD</w:t>
+            </w:r>
+          </w:p>
+        </w:tc>
+        <w:tc>
+          <w:tcPr>
+            <w:tcW w:type="dxa" w:w="1728"/>
+          </w:tcPr>
+          <w:p>
+            <w:r>
+              <w:rPr>
+                <w:rFonts w:ascii="Arial" w:hAnsi="Arial"/>
+                <w:sz w:val="16"/>
+              </w:rPr>
+              <w:t>Macro-F1</w:t>
+            </w:r>
+          </w:p>
+        </w:tc>
+        <w:tc>
+          <w:tcPr>
+            <w:tcW w:type="dxa" w:w="1728"/>
+          </w:tcPr>
+          <w:p>
+            <w:r>
+              <w:rPr>
+                <w:rFonts w:ascii="Arial" w:hAnsi="Arial"/>
+                <w:sz w:val="16"/>
+              </w:rPr>
+              <w:t>0.1874</w:t>
+            </w:r>
+          </w:p>
+        </w:tc>
+        <w:tc>
+          <w:tcPr>
+            <w:tcW w:type="dxa" w:w="1728"/>
+          </w:tcPr>
+          <w:p>
+            <w:r>
+              <w:rPr>
+                <w:rFonts w:ascii="Arial" w:hAnsi="Arial"/>
+                <w:sz w:val="16"/>
+              </w:rPr>
+              <w:t>0.1496</w:t>
+            </w:r>
+          </w:p>
+        </w:tc>
+        <w:tc>
+          <w:tcPr>
+            <w:tcW w:type="dxa" w:w="1728"/>
+          </w:tcPr>
+          <w:p>
+            <w:r>
+              <w:rPr>
+                <w:rFonts w:ascii="Arial" w:hAnsi="Arial"/>
+                <w:sz w:val="16"/>
+              </w:rPr>
+              <w:t>0.2256</w:t>
+            </w:r>
+          </w:p>
+        </w:tc>
+        <w:tc>
+          <w:tcPr>
+            <w:tcW w:type="dxa" w:w="1728"/>
+          </w:tcPr>
+          <w:p>
+            <w:r>
+              <w:rPr>
+                <w:rFonts w:ascii="Arial" w:hAnsi="Arial"/>
+                <w:sz w:val="16"/>
+              </w:rPr>
+              <w:t>0.9500</w:t>
+            </w:r>
+          </w:p>
+        </w:tc>
+      </w:tr>
+      <w:tr>
+        <w:tc>
+          <w:tcPr>
+            <w:tcW w:type="dxa" w:w="1728"/>
+          </w:tcPr>
+          <w:p>
+            <w:r>
+              <w:rPr>
+                <w:rFonts w:ascii="Arial" w:hAnsi="Arial"/>
+                <w:sz w:val="16"/>
+              </w:rPr>
+              <w:t>MELD</w:t>
+            </w:r>
+          </w:p>
+        </w:tc>
+        <w:tc>
+          <w:tcPr>
+            <w:tcW w:type="dxa" w:w="1728"/>
+          </w:tcPr>
+          <w:p>
+            <w:r>
+              <w:rPr>
+                <w:rFonts w:ascii="Arial" w:hAnsi="Arial"/>
+                <w:sz w:val="16"/>
+              </w:rPr>
+              <w:t>Weighted-F1</w:t>
+            </w:r>
+          </w:p>
+        </w:tc>
+        <w:tc>
+          <w:tcPr>
+            <w:tcW w:type="dxa" w:w="1728"/>
+          </w:tcPr>
+          <w:p>
+            <w:r>
+              <w:rPr>
+                <w:rFonts w:ascii="Arial" w:hAnsi="Arial"/>
+                <w:sz w:val="16"/>
+              </w:rPr>
+              <w:t>0.1892</w:t>
+            </w:r>
+          </w:p>
+        </w:tc>
+        <w:tc>
+          <w:tcPr>
+            <w:tcW w:type="dxa" w:w="1728"/>
+          </w:tcPr>
+          <w:p>
+            <w:r>
+              <w:rPr>
+                <w:rFonts w:ascii="Arial" w:hAnsi="Arial"/>
+                <w:sz w:val="16"/>
+              </w:rPr>
+              <w:t>0.1512</w:t>
+            </w:r>
+          </w:p>
+        </w:tc>
+        <w:tc>
+          <w:tcPr>
+            <w:tcW w:type="dxa" w:w="1728"/>
+          </w:tcPr>
+          <w:p>
+            <w:r>
+              <w:rPr>
+                <w:rFonts w:ascii="Arial" w:hAnsi="Arial"/>
+                <w:sz w:val="16"/>
+              </w:rPr>
+              <w:t>0.2271</w:t>
+            </w:r>
+          </w:p>
+        </w:tc>
+        <w:tc>
+          <w:tcPr>
+            <w:tcW w:type="dxa" w:w="1728"/>
+          </w:tcPr>
+          <w:p>
+            <w:r>
+              <w:rPr>
+                <w:rFonts w:ascii="Arial" w:hAnsi="Arial"/>
+                <w:sz w:val="16"/>
+              </w:rPr>
+              <w:t>0.9500</w:t>
+            </w:r>
+          </w:p>
+        </w:tc>
+      </w:tr>
+    </w:tbl>
+    <w:p/>
+    <w:p>
+      <w:pPr>
+        <w:spacing w:after="120"/>
+      </w:pPr>
+      <w:r>
+        <w:t>Güven aralıkları test katındaki her duygu sınıfının örnek sayısını koruyan 2000 tekrarlı percentile bootstrap ile, seed 42 ve %95 güven düzeyinde hesaplanmıştır. Test katı model veya hiperparametre seçimi için kullanılmamıştır.</w:t>
+      </w:r>
+    </w:p>
     <w:p>
       <w:r>
         <w:rPr>

</xml_diff>

<commit_message>
Update Assignment 3 report with calibration results
</commit_message>
<xml_diff>
--- a/odev3/PROJE_ILERLEME_RAPORU_3.docx
+++ b/odev3/PROJE_ILERLEME_RAPORU_3.docx
@@ -504,7 +504,7 @@
                 <w:rFonts w:ascii="Arial" w:hAnsi="Arial"/>
                 <w:sz w:val="16"/>
               </w:rPr>
-              <w:t>odev3/search_space.py</w:t>
+              <w:t>odev3/uncertainty.py</w:t>
             </w:r>
           </w:p>
         </w:tc>
@@ -518,7 +518,7 @@
                 <w:rFonts w:ascii="Arial" w:hAnsi="Arial"/>
                 <w:sz w:val="16"/>
               </w:rPr>
-              <w:t>16 temel tarama adayını ve kazanan çevresindeki 14 yerel adayı üretir.</w:t>
+              <w:t>Held-out sınıflandırma metrikleri için sınıf-korumalı bootstrap güven aralıklarını hesaplar.</w:t>
             </w:r>
           </w:p>
         </w:tc>
@@ -534,7 +534,7 @@
                 <w:rFonts w:ascii="Arial" w:hAnsi="Arial"/>
                 <w:sz w:val="16"/>
               </w:rPr>
-              <w:t>odev3/feature_ablation.py</w:t>
+              <w:t>odev3/calibration.py</w:t>
             </w:r>
           </w:p>
         </w:tc>
@@ -548,7 +548,7 @@
                 <w:rFonts w:ascii="Arial" w:hAnsi="Arial"/>
                 <w:sz w:val="16"/>
               </w:rPr>
-              <w:t>64/96 kare ve crop/resize Mel temsillerini yalnız geçerleme setinde karşılaştırır.</w:t>
+              <w:t>Test olasılıklarından NLL, Brier, ECE ve güven aralığı özetlerini üretir.</w:t>
             </w:r>
           </w:p>
         </w:tc>
@@ -564,6 +564,66 @@
                 <w:rFonts w:ascii="Arial" w:hAnsi="Arial"/>
                 <w:sz w:val="16"/>
               </w:rPr>
+              <w:t>odev3/search_space.py</w:t>
+            </w:r>
+          </w:p>
+        </w:tc>
+        <w:tc>
+          <w:tcPr>
+            <w:tcW w:type="dxa" w:w="5184"/>
+          </w:tcPr>
+          <w:p>
+            <w:r>
+              <w:rPr>
+                <w:rFonts w:ascii="Arial" w:hAnsi="Arial"/>
+                <w:sz w:val="16"/>
+              </w:rPr>
+              <w:t>16 temel tarama adayını ve kazanan çevresindeki 14 yerel adayı üretir.</w:t>
+            </w:r>
+          </w:p>
+        </w:tc>
+      </w:tr>
+      <w:tr>
+        <w:tc>
+          <w:tcPr>
+            <w:tcW w:type="dxa" w:w="5184"/>
+          </w:tcPr>
+          <w:p>
+            <w:r>
+              <w:rPr>
+                <w:rFonts w:ascii="Arial" w:hAnsi="Arial"/>
+                <w:sz w:val="16"/>
+              </w:rPr>
+              <w:t>odev3/feature_ablation.py</w:t>
+            </w:r>
+          </w:p>
+        </w:tc>
+        <w:tc>
+          <w:tcPr>
+            <w:tcW w:type="dxa" w:w="5184"/>
+          </w:tcPr>
+          <w:p>
+            <w:r>
+              <w:rPr>
+                <w:rFonts w:ascii="Arial" w:hAnsi="Arial"/>
+                <w:sz w:val="16"/>
+              </w:rPr>
+              <w:t>64/80/96 Mel, 64/96 kare ve crop/resize temsillerini yalnız geçerleme setinde karşılaştırır.</w:t>
+            </w:r>
+          </w:p>
+        </w:tc>
+      </w:tr>
+      <w:tr>
+        <w:tc>
+          <w:tcPr>
+            <w:tcW w:type="dxa" w:w="5184"/>
+          </w:tcPr>
+          <w:p>
+            <w:r>
+              <w:rPr>
+                <w:rFonts w:ascii="Arial" w:hAnsi="Arial"/>
+                <w:sz w:val="16"/>
+              </w:rPr>
               <w:t>odev3/pipeline.py</w:t>
             </w:r>
           </w:p>
@@ -578,7 +638,7 @@
                 <w:rFonts w:ascii="Arial" w:hAnsi="Arial"/>
                 <w:sz w:val="16"/>
               </w:rPr>
-              <w:t>Speaker-independent bölmeleri, resume durumunu, model kaydını, tahminleri ve grafik çıktılarını yönetir.</w:t>
+              <w:t>Speaker-independent bölmeleri, resume durumunu, model kaydını, tahminleri, belirsizliği ve kalibrasyonu yönetir.</w:t>
             </w:r>
           </w:p>
         </w:tc>
@@ -987,7 +1047,7 @@
                 <w:rFonts w:ascii="Arial" w:hAnsi="Arial"/>
                 <w:sz w:val="16"/>
               </w:rPr>
-              <w:t>odev3/outputs/cremad/test_confusion_matrix.png</w:t>
+              <w:t>odev3/outputs/cremad/test_uncertainty.json</w:t>
             </w:r>
           </w:p>
         </w:tc>
@@ -1001,7 +1061,7 @@
                 <w:rFonts w:ascii="Arial" w:hAnsi="Arial"/>
                 <w:sz w:val="16"/>
               </w:rPr>
-              <w:t>Normalize test karmaşıklık matrisi</w:t>
+              <w:t>Test metriklerinin %95 bootstrap güven aralıkları</w:t>
             </w:r>
           </w:p>
         </w:tc>
@@ -1015,7 +1075,7 @@
                 <w:rFonts w:ascii="Arial" w:hAnsi="Arial"/>
                 <w:sz w:val="16"/>
               </w:rPr>
-              <w:t>Hazır (81.1 KB)</w:t>
+              <w:t>Hazır (0.8 KB)</w:t>
             </w:r>
           </w:p>
         </w:tc>
@@ -1045,7 +1105,7 @@
                 <w:rFonts w:ascii="Arial" w:hAnsi="Arial"/>
                 <w:sz w:val="16"/>
               </w:rPr>
-              <w:t>odev3/outputs/cremad/result.json</w:t>
+              <w:t>odev3/outputs/cremad/test_calibration.json</w:t>
             </w:r>
           </w:p>
         </w:tc>
@@ -1059,7 +1119,7 @@
                 <w:rFonts w:ascii="Arial" w:hAnsi="Arial"/>
                 <w:sz w:val="16"/>
               </w:rPr>
-              <w:t>Bölme, yöntem, model ve metrik özeti</w:t>
+              <w:t>NLL, Brier, ECE ve güven aralığı kalibrasyon özeti</w:t>
             </w:r>
           </w:p>
         </w:tc>
@@ -1073,7 +1133,7 @@
                 <w:rFonts w:ascii="Arial" w:hAnsi="Arial"/>
                 <w:sz w:val="16"/>
               </w:rPr>
-              <w:t>Hazır (8.1 KB)</w:t>
+              <w:t>Hazır (3.0 KB)</w:t>
             </w:r>
           </w:p>
         </w:tc>
@@ -1089,7 +1149,7 @@
                 <w:rFonts w:ascii="Arial" w:hAnsi="Arial"/>
                 <w:sz w:val="16"/>
               </w:rPr>
-              <w:t>MELD</w:t>
+              <w:t>CREMA-D</w:t>
             </w:r>
           </w:p>
         </w:tc>
@@ -1103,7 +1163,7 @@
                 <w:rFonts w:ascii="Arial" w:hAnsi="Arial"/>
                 <w:sz w:val="16"/>
               </w:rPr>
-              <w:t>odev3/outputs/meld/best_model.pt</w:t>
+              <w:t>odev3/outputs/cremad/test_confusion_matrix.png</w:t>
             </w:r>
           </w:p>
         </w:tc>
@@ -1117,7 +1177,7 @@
                 <w:rFonts w:ascii="Arial" w:hAnsi="Arial"/>
                 <w:sz w:val="16"/>
               </w:rPr>
-              <w:t>En iyi MLP, normalizasyon ve sınıf ağırlıkları</w:t>
+              <w:t>Normalize test karmaşıklık matrisi</w:t>
             </w:r>
           </w:p>
         </w:tc>
@@ -1131,7 +1191,7 @@
                 <w:rFonts w:ascii="Arial" w:hAnsi="Arial"/>
                 <w:sz w:val="16"/>
               </w:rPr>
-              <w:t>Hazır (8.6 MB)</w:t>
+              <w:t>Hazır (81.1 KB)</w:t>
             </w:r>
           </w:p>
         </w:tc>
@@ -1147,7 +1207,7 @@
                 <w:rFonts w:ascii="Arial" w:hAnsi="Arial"/>
                 <w:sz w:val="16"/>
               </w:rPr>
-              <w:t>MELD</w:t>
+              <w:t>CREMA-D</w:t>
             </w:r>
           </w:p>
         </w:tc>
@@ -1161,7 +1221,7 @@
                 <w:rFonts w:ascii="Arial" w:hAnsi="Arial"/>
                 <w:sz w:val="16"/>
               </w:rPr>
-              <w:t>odev3/outputs/meld/validation_results.csv</w:t>
+              <w:t>odev3/outputs/cremad/result.json</w:t>
             </w:r>
           </w:p>
         </w:tc>
@@ -1175,7 +1235,7 @@
                 <w:rFonts w:ascii="Arial" w:hAnsi="Arial"/>
                 <w:sz w:val="16"/>
               </w:rPr>
-              <w:t>32 geçerleme deneyinin tam tablosu</w:t>
+              <w:t>Bölme, yöntem, model ve metrik özeti</w:t>
             </w:r>
           </w:p>
         </w:tc>
@@ -1189,7 +1249,7 @@
                 <w:rFonts w:ascii="Arial" w:hAnsi="Arial"/>
                 <w:sz w:val="16"/>
               </w:rPr>
-              <w:t>Hazır (7.0 KB)</w:t>
+              <w:t>Hazır (11.4 KB)</w:t>
             </w:r>
           </w:p>
         </w:tc>
@@ -1219,7 +1279,7 @@
                 <w:rFonts w:ascii="Arial" w:hAnsi="Arial"/>
                 <w:sz w:val="16"/>
               </w:rPr>
-              <w:t>odev3/outputs/meld/best_training_history.csv</w:t>
+              <w:t>odev3/outputs/meld/best_model.pt</w:t>
             </w:r>
           </w:p>
         </w:tc>
@@ -1233,7 +1293,7 @@
                 <w:rFonts w:ascii="Arial" w:hAnsi="Arial"/>
                 <w:sz w:val="16"/>
               </w:rPr>
-              <w:t>Seçilen koşunun epoch geçmişi</w:t>
+              <w:t>En iyi MLP, normalizasyon ve sınıf ağırlıkları</w:t>
             </w:r>
           </w:p>
         </w:tc>
@@ -1247,7 +1307,7 @@
                 <w:rFonts w:ascii="Arial" w:hAnsi="Arial"/>
                 <w:sz w:val="16"/>
               </w:rPr>
-              <w:t>Hazır (2.3 KB)</w:t>
+              <w:t>Hazır (8.6 MB)</w:t>
             </w:r>
           </w:p>
         </w:tc>
@@ -1277,7 +1337,7 @@
                 <w:rFonts w:ascii="Arial" w:hAnsi="Arial"/>
                 <w:sz w:val="16"/>
               </w:rPr>
-              <w:t>odev3/outputs/meld/test_predictions.csv</w:t>
+              <w:t>odev3/outputs/meld/validation_results.csv</w:t>
             </w:r>
           </w:p>
         </w:tc>
@@ -1291,7 +1351,7 @@
                 <w:rFonts w:ascii="Arial" w:hAnsi="Arial"/>
                 <w:sz w:val="16"/>
               </w:rPr>
-              <w:t>Test örneği tahmin ve olasılıkları</w:t>
+              <w:t>32 geçerleme deneyinin tam tablosu</w:t>
             </w:r>
           </w:p>
         </w:tc>
@@ -1305,7 +1365,7 @@
                 <w:rFonts w:ascii="Arial" w:hAnsi="Arial"/>
                 <w:sz w:val="16"/>
               </w:rPr>
-              <w:t>Hazır (61.1 KB)</w:t>
+              <w:t>Hazır (7.0 KB)</w:t>
             </w:r>
           </w:p>
         </w:tc>
@@ -1335,7 +1395,7 @@
                 <w:rFonts w:ascii="Arial" w:hAnsi="Arial"/>
                 <w:sz w:val="16"/>
               </w:rPr>
-              <w:t>odev3/outputs/meld/test_confusion_matrix.png</w:t>
+              <w:t>odev3/outputs/meld/best_training_history.csv</w:t>
             </w:r>
           </w:p>
         </w:tc>
@@ -1349,7 +1409,7 @@
                 <w:rFonts w:ascii="Arial" w:hAnsi="Arial"/>
                 <w:sz w:val="16"/>
               </w:rPr>
-              <w:t>Normalize test karmaşıklık matrisi</w:t>
+              <w:t>Seçilen koşunun epoch geçmişi</w:t>
             </w:r>
           </w:p>
         </w:tc>
@@ -1363,7 +1423,7 @@
                 <w:rFonts w:ascii="Arial" w:hAnsi="Arial"/>
                 <w:sz w:val="16"/>
               </w:rPr>
-              <w:t>Hazır (79.0 KB)</w:t>
+              <w:t>Hazır (2.3 KB)</w:t>
             </w:r>
           </w:p>
         </w:tc>
@@ -1393,6 +1453,238 @@
                 <w:rFonts w:ascii="Arial" w:hAnsi="Arial"/>
                 <w:sz w:val="16"/>
               </w:rPr>
+              <w:t>odev3/outputs/meld/test_predictions.csv</w:t>
+            </w:r>
+          </w:p>
+        </w:tc>
+        <w:tc>
+          <w:tcPr>
+            <w:tcW w:type="dxa" w:w="2592"/>
+          </w:tcPr>
+          <w:p>
+            <w:r>
+              <w:rPr>
+                <w:rFonts w:ascii="Arial" w:hAnsi="Arial"/>
+                <w:sz w:val="16"/>
+              </w:rPr>
+              <w:t>Test örneği tahmin ve olasılıkları</w:t>
+            </w:r>
+          </w:p>
+        </w:tc>
+        <w:tc>
+          <w:tcPr>
+            <w:tcW w:type="dxa" w:w="2592"/>
+          </w:tcPr>
+          <w:p>
+            <w:r>
+              <w:rPr>
+                <w:rFonts w:ascii="Arial" w:hAnsi="Arial"/>
+                <w:sz w:val="16"/>
+              </w:rPr>
+              <w:t>Hazır (61.1 KB)</w:t>
+            </w:r>
+          </w:p>
+        </w:tc>
+      </w:tr>
+      <w:tr>
+        <w:tc>
+          <w:tcPr>
+            <w:tcW w:type="dxa" w:w="2592"/>
+          </w:tcPr>
+          <w:p>
+            <w:r>
+              <w:rPr>
+                <w:rFonts w:ascii="Arial" w:hAnsi="Arial"/>
+                <w:sz w:val="16"/>
+              </w:rPr>
+              <w:t>MELD</w:t>
+            </w:r>
+          </w:p>
+        </w:tc>
+        <w:tc>
+          <w:tcPr>
+            <w:tcW w:type="dxa" w:w="2592"/>
+          </w:tcPr>
+          <w:p>
+            <w:r>
+              <w:rPr>
+                <w:rFonts w:ascii="Arial" w:hAnsi="Arial"/>
+                <w:sz w:val="16"/>
+              </w:rPr>
+              <w:t>odev3/outputs/meld/test_uncertainty.json</w:t>
+            </w:r>
+          </w:p>
+        </w:tc>
+        <w:tc>
+          <w:tcPr>
+            <w:tcW w:type="dxa" w:w="2592"/>
+          </w:tcPr>
+          <w:p>
+            <w:r>
+              <w:rPr>
+                <w:rFonts w:ascii="Arial" w:hAnsi="Arial"/>
+                <w:sz w:val="16"/>
+              </w:rPr>
+              <w:t>Test metriklerinin %95 bootstrap güven aralıkları</w:t>
+            </w:r>
+          </w:p>
+        </w:tc>
+        <w:tc>
+          <w:tcPr>
+            <w:tcW w:type="dxa" w:w="2592"/>
+          </w:tcPr>
+          <w:p>
+            <w:r>
+              <w:rPr>
+                <w:rFonts w:ascii="Arial" w:hAnsi="Arial"/>
+                <w:sz w:val="16"/>
+              </w:rPr>
+              <w:t>Hazır (0.8 KB)</w:t>
+            </w:r>
+          </w:p>
+        </w:tc>
+      </w:tr>
+      <w:tr>
+        <w:tc>
+          <w:tcPr>
+            <w:tcW w:type="dxa" w:w="2592"/>
+          </w:tcPr>
+          <w:p>
+            <w:r>
+              <w:rPr>
+                <w:rFonts w:ascii="Arial" w:hAnsi="Arial"/>
+                <w:sz w:val="16"/>
+              </w:rPr>
+              <w:t>MELD</w:t>
+            </w:r>
+          </w:p>
+        </w:tc>
+        <w:tc>
+          <w:tcPr>
+            <w:tcW w:type="dxa" w:w="2592"/>
+          </w:tcPr>
+          <w:p>
+            <w:r>
+              <w:rPr>
+                <w:rFonts w:ascii="Arial" w:hAnsi="Arial"/>
+                <w:sz w:val="16"/>
+              </w:rPr>
+              <w:t>odev3/outputs/meld/test_calibration.json</w:t>
+            </w:r>
+          </w:p>
+        </w:tc>
+        <w:tc>
+          <w:tcPr>
+            <w:tcW w:type="dxa" w:w="2592"/>
+          </w:tcPr>
+          <w:p>
+            <w:r>
+              <w:rPr>
+                <w:rFonts w:ascii="Arial" w:hAnsi="Arial"/>
+                <w:sz w:val="16"/>
+              </w:rPr>
+              <w:t>NLL, Brier, ECE ve güven aralığı kalibrasyon özeti</w:t>
+            </w:r>
+          </w:p>
+        </w:tc>
+        <w:tc>
+          <w:tcPr>
+            <w:tcW w:type="dxa" w:w="2592"/>
+          </w:tcPr>
+          <w:p>
+            <w:r>
+              <w:rPr>
+                <w:rFonts w:ascii="Arial" w:hAnsi="Arial"/>
+                <w:sz w:val="16"/>
+              </w:rPr>
+              <w:t>Hazır (2.8 KB)</w:t>
+            </w:r>
+          </w:p>
+        </w:tc>
+      </w:tr>
+      <w:tr>
+        <w:tc>
+          <w:tcPr>
+            <w:tcW w:type="dxa" w:w="2592"/>
+          </w:tcPr>
+          <w:p>
+            <w:r>
+              <w:rPr>
+                <w:rFonts w:ascii="Arial" w:hAnsi="Arial"/>
+                <w:sz w:val="16"/>
+              </w:rPr>
+              <w:t>MELD</w:t>
+            </w:r>
+          </w:p>
+        </w:tc>
+        <w:tc>
+          <w:tcPr>
+            <w:tcW w:type="dxa" w:w="2592"/>
+          </w:tcPr>
+          <w:p>
+            <w:r>
+              <w:rPr>
+                <w:rFonts w:ascii="Arial" w:hAnsi="Arial"/>
+                <w:sz w:val="16"/>
+              </w:rPr>
+              <w:t>odev3/outputs/meld/test_confusion_matrix.png</w:t>
+            </w:r>
+          </w:p>
+        </w:tc>
+        <w:tc>
+          <w:tcPr>
+            <w:tcW w:type="dxa" w:w="2592"/>
+          </w:tcPr>
+          <w:p>
+            <w:r>
+              <w:rPr>
+                <w:rFonts w:ascii="Arial" w:hAnsi="Arial"/>
+                <w:sz w:val="16"/>
+              </w:rPr>
+              <w:t>Normalize test karmaşıklık matrisi</w:t>
+            </w:r>
+          </w:p>
+        </w:tc>
+        <w:tc>
+          <w:tcPr>
+            <w:tcW w:type="dxa" w:w="2592"/>
+          </w:tcPr>
+          <w:p>
+            <w:r>
+              <w:rPr>
+                <w:rFonts w:ascii="Arial" w:hAnsi="Arial"/>
+                <w:sz w:val="16"/>
+              </w:rPr>
+              <w:t>Hazır (79.0 KB)</w:t>
+            </w:r>
+          </w:p>
+        </w:tc>
+      </w:tr>
+      <w:tr>
+        <w:tc>
+          <w:tcPr>
+            <w:tcW w:type="dxa" w:w="2592"/>
+          </w:tcPr>
+          <w:p>
+            <w:r>
+              <w:rPr>
+                <w:rFonts w:ascii="Arial" w:hAnsi="Arial"/>
+                <w:sz w:val="16"/>
+              </w:rPr>
+              <w:t>MELD</w:t>
+            </w:r>
+          </w:p>
+        </w:tc>
+        <w:tc>
+          <w:tcPr>
+            <w:tcW w:type="dxa" w:w="2592"/>
+          </w:tcPr>
+          <w:p>
+            <w:r>
+              <w:rPr>
+                <w:rFonts w:ascii="Arial" w:hAnsi="Arial"/>
+                <w:sz w:val="16"/>
+              </w:rPr>
               <w:t>odev3/outputs/meld/result.json</w:t>
             </w:r>
           </w:p>
@@ -1421,7 +1713,7 @@
                 <w:rFonts w:ascii="Arial" w:hAnsi="Arial"/>
                 <w:sz w:val="16"/>
               </w:rPr>
-              <w:t>Hazır (8.1 KB)</w:t>
+              <w:t>Hazır (11.2 KB)</w:t>
             </w:r>
           </w:p>
         </w:tc>
@@ -2882,6 +3174,30 @@
     </w:p>
     <w:p>
       <w:pPr>
+        <w:pStyle w:val="ListBullet"/>
+      </w:pPr>
+      <w:r>
+        <w:t>Negatif log-olabilirlik (NLL): doğru sınıfa verilen olasılığı cezalandırır; düşük değer daha iyidir.</w:t>
+      </w:r>
+    </w:p>
+    <w:p>
+      <w:pPr>
+        <w:pStyle w:val="ListBullet"/>
+      </w:pPr>
+      <w:r>
+        <w:t>Çok sınıflı Brier skoru: altı olasılığın one-hot hedefe toplam karesel uzaklığıdır; düşük değer daha iyidir.</w:t>
+      </w:r>
+    </w:p>
+    <w:p>
+      <w:pPr>
+        <w:pStyle w:val="ListBullet"/>
+      </w:pPr>
+      <w:r>
+        <w:t>Expected Calibration Error (ECE): 10 eşit genişlikli güven bininde doğruluk-güven farkının örnek oranıyla ağırlıklı ortalamasıdır; düşük değer daha iyidir.</w:t>
+      </w:r>
+    </w:p>
+    <w:p>
+      <w:pPr>
         <w:pStyle w:val="Heading1"/>
       </w:pPr>
       <w:r>
@@ -2909,7 +3225,7 @@
         <w:spacing w:after="120"/>
       </w:pPr>
       <w:r>
-        <w:t>Zaman temsilini test setine dokunmadan seçmek için Mel bant sayısı ve referans MLP sabit tutulmuş; 64/96 kare ile merkez crop-pad/tüm konuşmayı resize seçenekleri karşılaştırılmıştır.</w:t>
+        <w:t>Zaman ve frekans temsilini test setine dokunmadan incelemek için referans MLP ile seed 42 sabit tutulmuş; 64/80/96 Mel bandı, 64/96 kare ve merkez crop-pad/tüm konuşmayı resize seçeneklerinden oluşan sekiz aday karşılaştırılmıştır.</w:t>
       </w:r>
     </w:p>
     <w:p>
@@ -2927,21 +3243,22 @@
         <w:tblLook w:firstColumn="1" w:firstRow="1" w:lastColumn="0" w:lastRow="0" w:noHBand="0" w:noVBand="1" w:val="04A0"/>
       </w:tblPr>
       <w:tblGrid>
-        <w:gridCol w:w="1037"/>
-        <w:gridCol w:w="1037"/>
-        <w:gridCol w:w="1037"/>
-        <w:gridCol w:w="1037"/>
-        <w:gridCol w:w="1037"/>
-        <w:gridCol w:w="1037"/>
-        <w:gridCol w:w="1037"/>
-        <w:gridCol w:w="1037"/>
-        <w:gridCol w:w="1037"/>
-        <w:gridCol w:w="1037"/>
+        <w:gridCol w:w="943"/>
+        <w:gridCol w:w="943"/>
+        <w:gridCol w:w="943"/>
+        <w:gridCol w:w="943"/>
+        <w:gridCol w:w="943"/>
+        <w:gridCol w:w="943"/>
+        <w:gridCol w:w="943"/>
+        <w:gridCol w:w="943"/>
+        <w:gridCol w:w="943"/>
+        <w:gridCol w:w="943"/>
+        <w:gridCol w:w="943"/>
       </w:tblGrid>
       <w:tr>
         <w:tc>
           <w:tcPr>
-            <w:tcW w:type="dxa" w:w="1037"/>
+            <w:tcW w:type="dxa" w:w="943"/>
           </w:tcPr>
           <w:p>
             <w:r>
@@ -2956,7 +3273,7 @@
         </w:tc>
         <w:tc>
           <w:tcPr>
-            <w:tcW w:type="dxa" w:w="1037"/>
+            <w:tcW w:type="dxa" w:w="943"/>
           </w:tcPr>
           <w:p>
             <w:r>
@@ -2971,7 +3288,7 @@
         </w:tc>
         <w:tc>
           <w:tcPr>
-            <w:tcW w:type="dxa" w:w="1037"/>
+            <w:tcW w:type="dxa" w:w="943"/>
           </w:tcPr>
           <w:p>
             <w:r>
@@ -2986,7 +3303,7 @@
         </w:tc>
         <w:tc>
           <w:tcPr>
-            <w:tcW w:type="dxa" w:w="1037"/>
+            <w:tcW w:type="dxa" w:w="943"/>
           </w:tcPr>
           <w:p>
             <w:r>
@@ -2995,13 +3312,28 @@
                 <w:b/>
                 <w:sz w:val="12"/>
               </w:rPr>
+              <w:t>Mel</w:t>
+            </w:r>
+          </w:p>
+        </w:tc>
+        <w:tc>
+          <w:tcPr>
+            <w:tcW w:type="dxa" w:w="943"/>
+          </w:tcPr>
+          <w:p>
+            <w:r>
+              <w:rPr>
+                <w:rFonts w:ascii="Arial" w:hAnsi="Arial"/>
+                <w:b/>
+                <w:sz w:val="12"/>
+              </w:rPr>
               <w:t>Kare</w:t>
             </w:r>
           </w:p>
         </w:tc>
         <w:tc>
           <w:tcPr>
-            <w:tcW w:type="dxa" w:w="1037"/>
+            <w:tcW w:type="dxa" w:w="943"/>
           </w:tcPr>
           <w:p>
             <w:r>
@@ -3016,7 +3348,7 @@
         </w:tc>
         <w:tc>
           <w:tcPr>
-            <w:tcW w:type="dxa" w:w="1037"/>
+            <w:tcW w:type="dxa" w:w="943"/>
           </w:tcPr>
           <w:p>
             <w:r>
@@ -3031,7 +3363,7 @@
         </w:tc>
         <w:tc>
           <w:tcPr>
-            <w:tcW w:type="dxa" w:w="1037"/>
+            <w:tcW w:type="dxa" w:w="943"/>
           </w:tcPr>
           <w:p>
             <w:r>
@@ -3046,7 +3378,7 @@
         </w:tc>
         <w:tc>
           <w:tcPr>
-            <w:tcW w:type="dxa" w:w="1037"/>
+            <w:tcW w:type="dxa" w:w="943"/>
           </w:tcPr>
           <w:p>
             <w:r>
@@ -3061,7 +3393,7 @@
         </w:tc>
         <w:tc>
           <w:tcPr>
-            <w:tcW w:type="dxa" w:w="1037"/>
+            <w:tcW w:type="dxa" w:w="943"/>
           </w:tcPr>
           <w:p>
             <w:r>
@@ -3076,7 +3408,7 @@
         </w:tc>
         <w:tc>
           <w:tcPr>
-            <w:tcW w:type="dxa" w:w="1037"/>
+            <w:tcW w:type="dxa" w:w="943"/>
           </w:tcPr>
           <w:p>
             <w:r>
@@ -3093,7 +3425,7 @@
       <w:tr>
         <w:tc>
           <w:tcPr>
-            <w:tcW w:type="dxa" w:w="1037"/>
+            <w:tcW w:type="dxa" w:w="943"/>
           </w:tcPr>
           <w:p>
             <w:r>
@@ -3107,7 +3439,7 @@
         </w:tc>
         <w:tc>
           <w:tcPr>
-            <w:tcW w:type="dxa" w:w="1037"/>
+            <w:tcW w:type="dxa" w:w="943"/>
           </w:tcPr>
           <w:p>
             <w:r>
@@ -3121,7 +3453,7 @@
         </w:tc>
         <w:tc>
           <w:tcPr>
-            <w:tcW w:type="dxa" w:w="1037"/>
+            <w:tcW w:type="dxa" w:w="943"/>
           </w:tcPr>
           <w:p>
             <w:r>
@@ -3135,7 +3467,7 @@
         </w:tc>
         <w:tc>
           <w:tcPr>
-            <w:tcW w:type="dxa" w:w="1037"/>
+            <w:tcW w:type="dxa" w:w="943"/>
           </w:tcPr>
           <w:p>
             <w:r>
@@ -3149,7 +3481,21 @@
         </w:tc>
         <w:tc>
           <w:tcPr>
-            <w:tcW w:type="dxa" w:w="1037"/>
+            <w:tcW w:type="dxa" w:w="943"/>
+          </w:tcPr>
+          <w:p>
+            <w:r>
+              <w:rPr>
+                <w:rFonts w:ascii="Arial" w:hAnsi="Arial"/>
+                <w:sz w:val="12"/>
+              </w:rPr>
+              <w:t>64</w:t>
+            </w:r>
+          </w:p>
+        </w:tc>
+        <w:tc>
+          <w:tcPr>
+            <w:tcW w:type="dxa" w:w="943"/>
           </w:tcPr>
           <w:p>
             <w:r>
@@ -3163,7 +3509,7 @@
         </w:tc>
         <w:tc>
           <w:tcPr>
-            <w:tcW w:type="dxa" w:w="1037"/>
+            <w:tcW w:type="dxa" w:w="943"/>
           </w:tcPr>
           <w:p>
             <w:r>
@@ -3177,7 +3523,7 @@
         </w:tc>
         <w:tc>
           <w:tcPr>
-            <w:tcW w:type="dxa" w:w="1037"/>
+            <w:tcW w:type="dxa" w:w="943"/>
           </w:tcPr>
           <w:p>
             <w:r>
@@ -3191,7 +3537,7 @@
         </w:tc>
         <w:tc>
           <w:tcPr>
-            <w:tcW w:type="dxa" w:w="1037"/>
+            <w:tcW w:type="dxa" w:w="943"/>
           </w:tcPr>
           <w:p>
             <w:r>
@@ -3205,7 +3551,7 @@
         </w:tc>
         <w:tc>
           <w:tcPr>
-            <w:tcW w:type="dxa" w:w="1037"/>
+            <w:tcW w:type="dxa" w:w="943"/>
           </w:tcPr>
           <w:p>
             <w:r>
@@ -3219,7 +3565,7 @@
         </w:tc>
         <w:tc>
           <w:tcPr>
-            <w:tcW w:type="dxa" w:w="1037"/>
+            <w:tcW w:type="dxa" w:w="943"/>
           </w:tcPr>
           <w:p>
             <w:r>
@@ -3235,7 +3581,7 @@
       <w:tr>
         <w:tc>
           <w:tcPr>
-            <w:tcW w:type="dxa" w:w="1037"/>
+            <w:tcW w:type="dxa" w:w="943"/>
           </w:tcPr>
           <w:p>
             <w:r>
@@ -3249,7 +3595,7 @@
         </w:tc>
         <w:tc>
           <w:tcPr>
-            <w:tcW w:type="dxa" w:w="1037"/>
+            <w:tcW w:type="dxa" w:w="943"/>
           </w:tcPr>
           <w:p>
             <w:r>
@@ -3263,7 +3609,7 @@
         </w:tc>
         <w:tc>
           <w:tcPr>
-            <w:tcW w:type="dxa" w:w="1037"/>
+            <w:tcW w:type="dxa" w:w="943"/>
           </w:tcPr>
           <w:p>
             <w:r>
@@ -3277,7 +3623,7 @@
         </w:tc>
         <w:tc>
           <w:tcPr>
-            <w:tcW w:type="dxa" w:w="1037"/>
+            <w:tcW w:type="dxa" w:w="943"/>
           </w:tcPr>
           <w:p>
             <w:r>
@@ -3291,7 +3637,21 @@
         </w:tc>
         <w:tc>
           <w:tcPr>
-            <w:tcW w:type="dxa" w:w="1037"/>
+            <w:tcW w:type="dxa" w:w="943"/>
+          </w:tcPr>
+          <w:p>
+            <w:r>
+              <w:rPr>
+                <w:rFonts w:ascii="Arial" w:hAnsi="Arial"/>
+                <w:sz w:val="12"/>
+              </w:rPr>
+              <w:t>64</w:t>
+            </w:r>
+          </w:p>
+        </w:tc>
+        <w:tc>
+          <w:tcPr>
+            <w:tcW w:type="dxa" w:w="943"/>
           </w:tcPr>
           <w:p>
             <w:r>
@@ -3305,7 +3665,7 @@
         </w:tc>
         <w:tc>
           <w:tcPr>
-            <w:tcW w:type="dxa" w:w="1037"/>
+            <w:tcW w:type="dxa" w:w="943"/>
           </w:tcPr>
           <w:p>
             <w:r>
@@ -3319,7 +3679,7 @@
         </w:tc>
         <w:tc>
           <w:tcPr>
-            <w:tcW w:type="dxa" w:w="1037"/>
+            <w:tcW w:type="dxa" w:w="943"/>
           </w:tcPr>
           <w:p>
             <w:r>
@@ -3333,7 +3693,7 @@
         </w:tc>
         <w:tc>
           <w:tcPr>
-            <w:tcW w:type="dxa" w:w="1037"/>
+            <w:tcW w:type="dxa" w:w="943"/>
           </w:tcPr>
           <w:p>
             <w:r>
@@ -3347,7 +3707,7 @@
         </w:tc>
         <w:tc>
           <w:tcPr>
-            <w:tcW w:type="dxa" w:w="1037"/>
+            <w:tcW w:type="dxa" w:w="943"/>
           </w:tcPr>
           <w:p>
             <w:r>
@@ -3361,15 +3721,15 @@
         </w:tc>
         <w:tc>
           <w:tcPr>
-            <w:tcW w:type="dxa" w:w="1037"/>
-          </w:tcPr>
-          <w:p>
-            <w:r>
-              <w:rPr>
-                <w:rFonts w:ascii="Arial" w:hAnsi="Arial"/>
-                <w:sz w:val="12"/>
-              </w:rPr>
-              <w:t>Evet</w:t>
+            <w:tcW w:type="dxa" w:w="943"/>
+          </w:tcPr>
+          <w:p>
+            <w:r>
+              <w:rPr>
+                <w:rFonts w:ascii="Arial" w:hAnsi="Arial"/>
+                <w:sz w:val="12"/>
+              </w:rPr>
+              <w:t>Hayır</w:t>
             </w:r>
           </w:p>
         </w:tc>
@@ -3377,7 +3737,7 @@
       <w:tr>
         <w:tc>
           <w:tcPr>
-            <w:tcW w:type="dxa" w:w="1037"/>
+            <w:tcW w:type="dxa" w:w="943"/>
           </w:tcPr>
           <w:p>
             <w:r>
@@ -3391,7 +3751,7 @@
         </w:tc>
         <w:tc>
           <w:tcPr>
-            <w:tcW w:type="dxa" w:w="1037"/>
+            <w:tcW w:type="dxa" w:w="943"/>
           </w:tcPr>
           <w:p>
             <w:r>
@@ -3405,7 +3765,7 @@
         </w:tc>
         <w:tc>
           <w:tcPr>
-            <w:tcW w:type="dxa" w:w="1037"/>
+            <w:tcW w:type="dxa" w:w="943"/>
           </w:tcPr>
           <w:p>
             <w:r>
@@ -3419,7 +3779,21 @@
         </w:tc>
         <w:tc>
           <w:tcPr>
-            <w:tcW w:type="dxa" w:w="1037"/>
+            <w:tcW w:type="dxa" w:w="943"/>
+          </w:tcPr>
+          <w:p>
+            <w:r>
+              <w:rPr>
+                <w:rFonts w:ascii="Arial" w:hAnsi="Arial"/>
+                <w:sz w:val="12"/>
+              </w:rPr>
+              <w:t>64</w:t>
+            </w:r>
+          </w:p>
+        </w:tc>
+        <w:tc>
+          <w:tcPr>
+            <w:tcW w:type="dxa" w:w="943"/>
           </w:tcPr>
           <w:p>
             <w:r>
@@ -3433,7 +3807,7 @@
         </w:tc>
         <w:tc>
           <w:tcPr>
-            <w:tcW w:type="dxa" w:w="1037"/>
+            <w:tcW w:type="dxa" w:w="943"/>
           </w:tcPr>
           <w:p>
             <w:r>
@@ -3447,7 +3821,7 @@
         </w:tc>
         <w:tc>
           <w:tcPr>
-            <w:tcW w:type="dxa" w:w="1037"/>
+            <w:tcW w:type="dxa" w:w="943"/>
           </w:tcPr>
           <w:p>
             <w:r>
@@ -3461,7 +3835,7 @@
         </w:tc>
         <w:tc>
           <w:tcPr>
-            <w:tcW w:type="dxa" w:w="1037"/>
+            <w:tcW w:type="dxa" w:w="943"/>
           </w:tcPr>
           <w:p>
             <w:r>
@@ -3475,7 +3849,7 @@
         </w:tc>
         <w:tc>
           <w:tcPr>
-            <w:tcW w:type="dxa" w:w="1037"/>
+            <w:tcW w:type="dxa" w:w="943"/>
           </w:tcPr>
           <w:p>
             <w:r>
@@ -3489,7 +3863,7 @@
         </w:tc>
         <w:tc>
           <w:tcPr>
-            <w:tcW w:type="dxa" w:w="1037"/>
+            <w:tcW w:type="dxa" w:w="943"/>
           </w:tcPr>
           <w:p>
             <w:r>
@@ -3503,7 +3877,7 @@
         </w:tc>
         <w:tc>
           <w:tcPr>
-            <w:tcW w:type="dxa" w:w="1037"/>
+            <w:tcW w:type="dxa" w:w="943"/>
           </w:tcPr>
           <w:p>
             <w:r>
@@ -3519,7 +3893,7 @@
       <w:tr>
         <w:tc>
           <w:tcPr>
-            <w:tcW w:type="dxa" w:w="1037"/>
+            <w:tcW w:type="dxa" w:w="943"/>
           </w:tcPr>
           <w:p>
             <w:r>
@@ -3533,7 +3907,7 @@
         </w:tc>
         <w:tc>
           <w:tcPr>
-            <w:tcW w:type="dxa" w:w="1037"/>
+            <w:tcW w:type="dxa" w:w="943"/>
           </w:tcPr>
           <w:p>
             <w:r>
@@ -3547,7 +3921,7 @@
         </w:tc>
         <w:tc>
           <w:tcPr>
-            <w:tcW w:type="dxa" w:w="1037"/>
+            <w:tcW w:type="dxa" w:w="943"/>
           </w:tcPr>
           <w:p>
             <w:r>
@@ -3561,7 +3935,21 @@
         </w:tc>
         <w:tc>
           <w:tcPr>
-            <w:tcW w:type="dxa" w:w="1037"/>
+            <w:tcW w:type="dxa" w:w="943"/>
+          </w:tcPr>
+          <w:p>
+            <w:r>
+              <w:rPr>
+                <w:rFonts w:ascii="Arial" w:hAnsi="Arial"/>
+                <w:sz w:val="12"/>
+              </w:rPr>
+              <w:t>64</w:t>
+            </w:r>
+          </w:p>
+        </w:tc>
+        <w:tc>
+          <w:tcPr>
+            <w:tcW w:type="dxa" w:w="943"/>
           </w:tcPr>
           <w:p>
             <w:r>
@@ -3575,7 +3963,7 @@
         </w:tc>
         <w:tc>
           <w:tcPr>
-            <w:tcW w:type="dxa" w:w="1037"/>
+            <w:tcW w:type="dxa" w:w="943"/>
           </w:tcPr>
           <w:p>
             <w:r>
@@ -3589,7 +3977,7 @@
         </w:tc>
         <w:tc>
           <w:tcPr>
-            <w:tcW w:type="dxa" w:w="1037"/>
+            <w:tcW w:type="dxa" w:w="943"/>
           </w:tcPr>
           <w:p>
             <w:r>
@@ -3603,7 +3991,7 @@
         </w:tc>
         <w:tc>
           <w:tcPr>
-            <w:tcW w:type="dxa" w:w="1037"/>
+            <w:tcW w:type="dxa" w:w="943"/>
           </w:tcPr>
           <w:p>
             <w:r>
@@ -3617,7 +4005,7 @@
         </w:tc>
         <w:tc>
           <w:tcPr>
-            <w:tcW w:type="dxa" w:w="1037"/>
+            <w:tcW w:type="dxa" w:w="943"/>
           </w:tcPr>
           <w:p>
             <w:r>
@@ -3631,7 +4019,7 @@
         </w:tc>
         <w:tc>
           <w:tcPr>
-            <w:tcW w:type="dxa" w:w="1037"/>
+            <w:tcW w:type="dxa" w:w="943"/>
           </w:tcPr>
           <w:p>
             <w:r>
@@ -3645,7 +4033,7 @@
         </w:tc>
         <w:tc>
           <w:tcPr>
-            <w:tcW w:type="dxa" w:w="1037"/>
+            <w:tcW w:type="dxa" w:w="943"/>
           </w:tcPr>
           <w:p>
             <w:r>
@@ -3661,35 +4049,35 @@
       <w:tr>
         <w:tc>
           <w:tcPr>
-            <w:tcW w:type="dxa" w:w="1037"/>
-          </w:tcPr>
-          <w:p>
-            <w:r>
-              <w:rPr>
-                <w:rFonts w:ascii="Arial" w:hAnsi="Arial"/>
-                <w:sz w:val="12"/>
-              </w:rPr>
-              <w:t>MELD</w:t>
-            </w:r>
-          </w:p>
-        </w:tc>
-        <w:tc>
-          <w:tcPr>
-            <w:tcW w:type="dxa" w:w="1037"/>
-          </w:tcPr>
-          <w:p>
-            <w:r>
-              <w:rPr>
-                <w:rFonts w:ascii="Arial" w:hAnsi="Arial"/>
-                <w:sz w:val="12"/>
-              </w:rPr>
-              <w:t>1</w:t>
-            </w:r>
-          </w:p>
-        </w:tc>
-        <w:tc>
-          <w:tcPr>
-            <w:tcW w:type="dxa" w:w="1037"/>
+            <w:tcW w:type="dxa" w:w="943"/>
+          </w:tcPr>
+          <w:p>
+            <w:r>
+              <w:rPr>
+                <w:rFonts w:ascii="Arial" w:hAnsi="Arial"/>
+                <w:sz w:val="12"/>
+              </w:rPr>
+              <w:t>CREMA-D</w:t>
+            </w:r>
+          </w:p>
+        </w:tc>
+        <w:tc>
+          <w:tcPr>
+            <w:tcW w:type="dxa" w:w="943"/>
+          </w:tcPr>
+          <w:p>
+            <w:r>
+              <w:rPr>
+                <w:rFonts w:ascii="Arial" w:hAnsi="Arial"/>
+                <w:sz w:val="12"/>
+              </w:rPr>
+              <w:t>5</w:t>
+            </w:r>
+          </w:p>
+        </w:tc>
+        <w:tc>
+          <w:tcPr>
+            <w:tcW w:type="dxa" w:w="943"/>
           </w:tcPr>
           <w:p>
             <w:r>
@@ -3703,7 +4091,21 @@
         </w:tc>
         <w:tc>
           <w:tcPr>
-            <w:tcW w:type="dxa" w:w="1037"/>
+            <w:tcW w:type="dxa" w:w="943"/>
+          </w:tcPr>
+          <w:p>
+            <w:r>
+              <w:rPr>
+                <w:rFonts w:ascii="Arial" w:hAnsi="Arial"/>
+                <w:sz w:val="12"/>
+              </w:rPr>
+              <w:t>80</w:t>
+            </w:r>
+          </w:p>
+        </w:tc>
+        <w:tc>
+          <w:tcPr>
+            <w:tcW w:type="dxa" w:w="943"/>
           </w:tcPr>
           <w:p>
             <w:r>
@@ -3717,85 +4119,85 @@
         </w:tc>
         <w:tc>
           <w:tcPr>
-            <w:tcW w:type="dxa" w:w="1037"/>
-          </w:tcPr>
-          <w:p>
-            <w:r>
-              <w:rPr>
-                <w:rFonts w:ascii="Arial" w:hAnsi="Arial"/>
-                <w:sz w:val="12"/>
-              </w:rPr>
-              <w:t>4096</w:t>
-            </w:r>
-          </w:p>
-        </w:tc>
-        <w:tc>
-          <w:tcPr>
-            <w:tcW w:type="dxa" w:w="1037"/>
-          </w:tcPr>
-          <w:p>
-            <w:r>
-              <w:rPr>
-                <w:rFonts w:ascii="Arial" w:hAnsi="Arial"/>
-                <w:sz w:val="12"/>
-              </w:rPr>
-              <w:t>3</w:t>
-            </w:r>
-          </w:p>
-        </w:tc>
-        <w:tc>
-          <w:tcPr>
-            <w:tcW w:type="dxa" w:w="1037"/>
-          </w:tcPr>
-          <w:p>
-            <w:r>
-              <w:rPr>
-                <w:rFonts w:ascii="Arial" w:hAnsi="Arial"/>
-                <w:sz w:val="12"/>
-              </w:rPr>
-              <w:t>0.2611</w:t>
-            </w:r>
-          </w:p>
-        </w:tc>
-        <w:tc>
-          <w:tcPr>
-            <w:tcW w:type="dxa" w:w="1037"/>
-          </w:tcPr>
-          <w:p>
-            <w:r>
-              <w:rPr>
-                <w:rFonts w:ascii="Arial" w:hAnsi="Arial"/>
-                <w:sz w:val="12"/>
-              </w:rPr>
-              <w:t>0.2728</w:t>
-            </w:r>
-          </w:p>
-        </w:tc>
-        <w:tc>
-          <w:tcPr>
-            <w:tcW w:type="dxa" w:w="1037"/>
-          </w:tcPr>
-          <w:p>
-            <w:r>
-              <w:rPr>
-                <w:rFonts w:ascii="Arial" w:hAnsi="Arial"/>
-                <w:sz w:val="12"/>
-              </w:rPr>
-              <w:t>0.2525</w:t>
-            </w:r>
-          </w:p>
-        </w:tc>
-        <w:tc>
-          <w:tcPr>
-            <w:tcW w:type="dxa" w:w="1037"/>
-          </w:tcPr>
-          <w:p>
-            <w:r>
-              <w:rPr>
-                <w:rFonts w:ascii="Arial" w:hAnsi="Arial"/>
-                <w:sz w:val="12"/>
-              </w:rPr>
-              <w:t>Evet</w:t>
+            <w:tcW w:type="dxa" w:w="943"/>
+          </w:tcPr>
+          <w:p>
+            <w:r>
+              <w:rPr>
+                <w:rFonts w:ascii="Arial" w:hAnsi="Arial"/>
+                <w:sz w:val="12"/>
+              </w:rPr>
+              <w:t>5120</w:t>
+            </w:r>
+          </w:p>
+        </w:tc>
+        <w:tc>
+          <w:tcPr>
+            <w:tcW w:type="dxa" w:w="943"/>
+          </w:tcPr>
+          <w:p>
+            <w:r>
+              <w:rPr>
+                <w:rFonts w:ascii="Arial" w:hAnsi="Arial"/>
+                <w:sz w:val="12"/>
+              </w:rPr>
+              <w:t>7</w:t>
+            </w:r>
+          </w:p>
+        </w:tc>
+        <w:tc>
+          <w:tcPr>
+            <w:tcW w:type="dxa" w:w="943"/>
+          </w:tcPr>
+          <w:p>
+            <w:r>
+              <w:rPr>
+                <w:rFonts w:ascii="Arial" w:hAnsi="Arial"/>
+                <w:sz w:val="12"/>
+              </w:rPr>
+              <w:t>0.4659</w:t>
+            </w:r>
+          </w:p>
+        </w:tc>
+        <w:tc>
+          <w:tcPr>
+            <w:tcW w:type="dxa" w:w="943"/>
+          </w:tcPr>
+          <w:p>
+            <w:r>
+              <w:rPr>
+                <w:rFonts w:ascii="Arial" w:hAnsi="Arial"/>
+                <w:sz w:val="12"/>
+              </w:rPr>
+              <w:t>0.4623</w:t>
+            </w:r>
+          </w:p>
+        </w:tc>
+        <w:tc>
+          <w:tcPr>
+            <w:tcW w:type="dxa" w:w="943"/>
+          </w:tcPr>
+          <w:p>
+            <w:r>
+              <w:rPr>
+                <w:rFonts w:ascii="Arial" w:hAnsi="Arial"/>
+                <w:sz w:val="12"/>
+              </w:rPr>
+              <w:t>0.4549</w:t>
+            </w:r>
+          </w:p>
+        </w:tc>
+        <w:tc>
+          <w:tcPr>
+            <w:tcW w:type="dxa" w:w="943"/>
+          </w:tcPr>
+          <w:p>
+            <w:r>
+              <w:rPr>
+                <w:rFonts w:ascii="Arial" w:hAnsi="Arial"/>
+                <w:sz w:val="12"/>
+              </w:rPr>
+              <w:t>Hayır</w:t>
             </w:r>
           </w:p>
         </w:tc>
@@ -3803,35 +4205,35 @@
       <w:tr>
         <w:tc>
           <w:tcPr>
-            <w:tcW w:type="dxa" w:w="1037"/>
-          </w:tcPr>
-          <w:p>
-            <w:r>
-              <w:rPr>
-                <w:rFonts w:ascii="Arial" w:hAnsi="Arial"/>
-                <w:sz w:val="12"/>
-              </w:rPr>
-              <w:t>MELD</w:t>
-            </w:r>
-          </w:p>
-        </w:tc>
-        <w:tc>
-          <w:tcPr>
-            <w:tcW w:type="dxa" w:w="1037"/>
-          </w:tcPr>
-          <w:p>
-            <w:r>
-              <w:rPr>
-                <w:rFonts w:ascii="Arial" w:hAnsi="Arial"/>
-                <w:sz w:val="12"/>
-              </w:rPr>
-              <w:t>2</w:t>
-            </w:r>
-          </w:p>
-        </w:tc>
-        <w:tc>
-          <w:tcPr>
-            <w:tcW w:type="dxa" w:w="1037"/>
+            <w:tcW w:type="dxa" w:w="943"/>
+          </w:tcPr>
+          <w:p>
+            <w:r>
+              <w:rPr>
+                <w:rFonts w:ascii="Arial" w:hAnsi="Arial"/>
+                <w:sz w:val="12"/>
+              </w:rPr>
+              <w:t>CREMA-D</w:t>
+            </w:r>
+          </w:p>
+        </w:tc>
+        <w:tc>
+          <w:tcPr>
+            <w:tcW w:type="dxa" w:w="943"/>
+          </w:tcPr>
+          <w:p>
+            <w:r>
+              <w:rPr>
+                <w:rFonts w:ascii="Arial" w:hAnsi="Arial"/>
+                <w:sz w:val="12"/>
+              </w:rPr>
+              <w:t>6</w:t>
+            </w:r>
+          </w:p>
+        </w:tc>
+        <w:tc>
+          <w:tcPr>
+            <w:tcW w:type="dxa" w:w="943"/>
           </w:tcPr>
           <w:p>
             <w:r>
@@ -3845,7 +4247,21 @@
         </w:tc>
         <w:tc>
           <w:tcPr>
-            <w:tcW w:type="dxa" w:w="1037"/>
+            <w:tcW w:type="dxa" w:w="943"/>
+          </w:tcPr>
+          <w:p>
+            <w:r>
+              <w:rPr>
+                <w:rFonts w:ascii="Arial" w:hAnsi="Arial"/>
+                <w:sz w:val="12"/>
+              </w:rPr>
+              <w:t>80</w:t>
+            </w:r>
+          </w:p>
+        </w:tc>
+        <w:tc>
+          <w:tcPr>
+            <w:tcW w:type="dxa" w:w="943"/>
           </w:tcPr>
           <w:p>
             <w:r>
@@ -3859,77 +4275,77 @@
         </w:tc>
         <w:tc>
           <w:tcPr>
-            <w:tcW w:type="dxa" w:w="1037"/>
-          </w:tcPr>
-          <w:p>
-            <w:r>
-              <w:rPr>
-                <w:rFonts w:ascii="Arial" w:hAnsi="Arial"/>
-                <w:sz w:val="12"/>
-              </w:rPr>
-              <w:t>4096</w:t>
-            </w:r>
-          </w:p>
-        </w:tc>
-        <w:tc>
-          <w:tcPr>
-            <w:tcW w:type="dxa" w:w="1037"/>
-          </w:tcPr>
-          <w:p>
-            <w:r>
-              <w:rPr>
-                <w:rFonts w:ascii="Arial" w:hAnsi="Arial"/>
-                <w:sz w:val="12"/>
-              </w:rPr>
-              <w:t>2</w:t>
-            </w:r>
-          </w:p>
-        </w:tc>
-        <w:tc>
-          <w:tcPr>
-            <w:tcW w:type="dxa" w:w="1037"/>
-          </w:tcPr>
-          <w:p>
-            <w:r>
-              <w:rPr>
-                <w:rFonts w:ascii="Arial" w:hAnsi="Arial"/>
-                <w:sz w:val="12"/>
-              </w:rPr>
-              <w:t>0.2192</w:t>
-            </w:r>
-          </w:p>
-        </w:tc>
-        <w:tc>
-          <w:tcPr>
-            <w:tcW w:type="dxa" w:w="1037"/>
-          </w:tcPr>
-          <w:p>
-            <w:r>
-              <w:rPr>
-                <w:rFonts w:ascii="Arial" w:hAnsi="Arial"/>
-                <w:sz w:val="12"/>
-              </w:rPr>
-              <w:t>0.2142</w:t>
-            </w:r>
-          </w:p>
-        </w:tc>
-        <w:tc>
-          <w:tcPr>
-            <w:tcW w:type="dxa" w:w="1037"/>
-          </w:tcPr>
-          <w:p>
-            <w:r>
-              <w:rPr>
-                <w:rFonts w:ascii="Arial" w:hAnsi="Arial"/>
-                <w:sz w:val="12"/>
-              </w:rPr>
-              <w:t>0.2084</w:t>
-            </w:r>
-          </w:p>
-        </w:tc>
-        <w:tc>
-          <w:tcPr>
-            <w:tcW w:type="dxa" w:w="1037"/>
+            <w:tcW w:type="dxa" w:w="943"/>
+          </w:tcPr>
+          <w:p>
+            <w:r>
+              <w:rPr>
+                <w:rFonts w:ascii="Arial" w:hAnsi="Arial"/>
+                <w:sz w:val="12"/>
+              </w:rPr>
+              <w:t>5120</w:t>
+            </w:r>
+          </w:p>
+        </w:tc>
+        <w:tc>
+          <w:tcPr>
+            <w:tcW w:type="dxa" w:w="943"/>
+          </w:tcPr>
+          <w:p>
+            <w:r>
+              <w:rPr>
+                <w:rFonts w:ascii="Arial" w:hAnsi="Arial"/>
+                <w:sz w:val="12"/>
+              </w:rPr>
+              <w:t>29</w:t>
+            </w:r>
+          </w:p>
+        </w:tc>
+        <w:tc>
+          <w:tcPr>
+            <w:tcW w:type="dxa" w:w="943"/>
+          </w:tcPr>
+          <w:p>
+            <w:r>
+              <w:rPr>
+                <w:rFonts w:ascii="Arial" w:hAnsi="Arial"/>
+                <w:sz w:val="12"/>
+              </w:rPr>
+              <w:t>0.4683</w:t>
+            </w:r>
+          </w:p>
+        </w:tc>
+        <w:tc>
+          <w:tcPr>
+            <w:tcW w:type="dxa" w:w="943"/>
+          </w:tcPr>
+          <w:p>
+            <w:r>
+              <w:rPr>
+                <w:rFonts w:ascii="Arial" w:hAnsi="Arial"/>
+                <w:sz w:val="12"/>
+              </w:rPr>
+              <w:t>0.4675</w:t>
+            </w:r>
+          </w:p>
+        </w:tc>
+        <w:tc>
+          <w:tcPr>
+            <w:tcW w:type="dxa" w:w="943"/>
+          </w:tcPr>
+          <w:p>
+            <w:r>
+              <w:rPr>
+                <w:rFonts w:ascii="Arial" w:hAnsi="Arial"/>
+                <w:sz w:val="12"/>
+              </w:rPr>
+              <w:t>0.4652</w:t>
+            </w:r>
+          </w:p>
+        </w:tc>
+        <w:tc>
+          <w:tcPr>
+            <w:tcW w:type="dxa" w:w="943"/>
           </w:tcPr>
           <w:p>
             <w:r>
@@ -3945,35 +4361,35 @@
       <w:tr>
         <w:tc>
           <w:tcPr>
-            <w:tcW w:type="dxa" w:w="1037"/>
-          </w:tcPr>
-          <w:p>
-            <w:r>
-              <w:rPr>
-                <w:rFonts w:ascii="Arial" w:hAnsi="Arial"/>
-                <w:sz w:val="12"/>
-              </w:rPr>
-              <w:t>MELD</w:t>
-            </w:r>
-          </w:p>
-        </w:tc>
-        <w:tc>
-          <w:tcPr>
-            <w:tcW w:type="dxa" w:w="1037"/>
-          </w:tcPr>
-          <w:p>
-            <w:r>
-              <w:rPr>
-                <w:rFonts w:ascii="Arial" w:hAnsi="Arial"/>
-                <w:sz w:val="12"/>
-              </w:rPr>
-              <w:t>3</w:t>
-            </w:r>
-          </w:p>
-        </w:tc>
-        <w:tc>
-          <w:tcPr>
-            <w:tcW w:type="dxa" w:w="1037"/>
+            <w:tcW w:type="dxa" w:w="943"/>
+          </w:tcPr>
+          <w:p>
+            <w:r>
+              <w:rPr>
+                <w:rFonts w:ascii="Arial" w:hAnsi="Arial"/>
+                <w:sz w:val="12"/>
+              </w:rPr>
+              <w:t>CREMA-D</w:t>
+            </w:r>
+          </w:p>
+        </w:tc>
+        <w:tc>
+          <w:tcPr>
+            <w:tcW w:type="dxa" w:w="943"/>
+          </w:tcPr>
+          <w:p>
+            <w:r>
+              <w:rPr>
+                <w:rFonts w:ascii="Arial" w:hAnsi="Arial"/>
+                <w:sz w:val="12"/>
+              </w:rPr>
+              <w:t>7</w:t>
+            </w:r>
+          </w:p>
+        </w:tc>
+        <w:tc>
+          <w:tcPr>
+            <w:tcW w:type="dxa" w:w="943"/>
           </w:tcPr>
           <w:p>
             <w:r>
@@ -3987,7 +4403,7 @@
         </w:tc>
         <w:tc>
           <w:tcPr>
-            <w:tcW w:type="dxa" w:w="1037"/>
+            <w:tcW w:type="dxa" w:w="943"/>
           </w:tcPr>
           <w:p>
             <w:r>
@@ -4001,7 +4417,21 @@
         </w:tc>
         <w:tc>
           <w:tcPr>
-            <w:tcW w:type="dxa" w:w="1037"/>
+            <w:tcW w:type="dxa" w:w="943"/>
+          </w:tcPr>
+          <w:p>
+            <w:r>
+              <w:rPr>
+                <w:rFonts w:ascii="Arial" w:hAnsi="Arial"/>
+                <w:sz w:val="12"/>
+              </w:rPr>
+              <w:t>64</w:t>
+            </w:r>
+          </w:p>
+        </w:tc>
+        <w:tc>
+          <w:tcPr>
+            <w:tcW w:type="dxa" w:w="943"/>
           </w:tcPr>
           <w:p>
             <w:r>
@@ -4015,71 +4445,71 @@
         </w:tc>
         <w:tc>
           <w:tcPr>
-            <w:tcW w:type="dxa" w:w="1037"/>
-          </w:tcPr>
-          <w:p>
-            <w:r>
-              <w:rPr>
-                <w:rFonts w:ascii="Arial" w:hAnsi="Arial"/>
-                <w:sz w:val="12"/>
-              </w:rPr>
-              <w:t>6</w:t>
-            </w:r>
-          </w:p>
-        </w:tc>
-        <w:tc>
-          <w:tcPr>
-            <w:tcW w:type="dxa" w:w="1037"/>
-          </w:tcPr>
-          <w:p>
-            <w:r>
-              <w:rPr>
-                <w:rFonts w:ascii="Arial" w:hAnsi="Arial"/>
-                <w:sz w:val="12"/>
-              </w:rPr>
-              <w:t>0.2192</w:t>
-            </w:r>
-          </w:p>
-        </w:tc>
-        <w:tc>
-          <w:tcPr>
-            <w:tcW w:type="dxa" w:w="1037"/>
-          </w:tcPr>
-          <w:p>
-            <w:r>
-              <w:rPr>
-                <w:rFonts w:ascii="Arial" w:hAnsi="Arial"/>
-                <w:sz w:val="12"/>
-              </w:rPr>
-              <w:t>0.2131</w:t>
-            </w:r>
-          </w:p>
-        </w:tc>
-        <w:tc>
-          <w:tcPr>
-            <w:tcW w:type="dxa" w:w="1037"/>
-          </w:tcPr>
-          <w:p>
-            <w:r>
-              <w:rPr>
-                <w:rFonts w:ascii="Arial" w:hAnsi="Arial"/>
-                <w:sz w:val="12"/>
-              </w:rPr>
-              <w:t>0.2099</w:t>
-            </w:r>
-          </w:p>
-        </w:tc>
-        <w:tc>
-          <w:tcPr>
-            <w:tcW w:type="dxa" w:w="1037"/>
-          </w:tcPr>
-          <w:p>
-            <w:r>
-              <w:rPr>
-                <w:rFonts w:ascii="Arial" w:hAnsi="Arial"/>
-                <w:sz w:val="12"/>
-              </w:rPr>
-              <w:t>Hayır</w:t>
+            <w:tcW w:type="dxa" w:w="943"/>
+          </w:tcPr>
+          <w:p>
+            <w:r>
+              <w:rPr>
+                <w:rFonts w:ascii="Arial" w:hAnsi="Arial"/>
+                <w:sz w:val="12"/>
+              </w:rPr>
+              <w:t>14</w:t>
+            </w:r>
+          </w:p>
+        </w:tc>
+        <w:tc>
+          <w:tcPr>
+            <w:tcW w:type="dxa" w:w="943"/>
+          </w:tcPr>
+          <w:p>
+            <w:r>
+              <w:rPr>
+                <w:rFonts w:ascii="Arial" w:hAnsi="Arial"/>
+                <w:sz w:val="12"/>
+              </w:rPr>
+              <w:t>0.4805</w:t>
+            </w:r>
+          </w:p>
+        </w:tc>
+        <w:tc>
+          <w:tcPr>
+            <w:tcW w:type="dxa" w:w="943"/>
+          </w:tcPr>
+          <w:p>
+            <w:r>
+              <w:rPr>
+                <w:rFonts w:ascii="Arial" w:hAnsi="Arial"/>
+                <w:sz w:val="12"/>
+              </w:rPr>
+              <w:t>0.4810</w:t>
+            </w:r>
+          </w:p>
+        </w:tc>
+        <w:tc>
+          <w:tcPr>
+            <w:tcW w:type="dxa" w:w="943"/>
+          </w:tcPr>
+          <w:p>
+            <w:r>
+              <w:rPr>
+                <w:rFonts w:ascii="Arial" w:hAnsi="Arial"/>
+                <w:sz w:val="12"/>
+              </w:rPr>
+              <w:t>0.4707</w:t>
+            </w:r>
+          </w:p>
+        </w:tc>
+        <w:tc>
+          <w:tcPr>
+            <w:tcW w:type="dxa" w:w="943"/>
+          </w:tcPr>
+          <w:p>
+            <w:r>
+              <w:rPr>
+                <w:rFonts w:ascii="Arial" w:hAnsi="Arial"/>
+                <w:sz w:val="12"/>
+              </w:rPr>
+              <w:t>Evet</w:t>
             </w:r>
           </w:p>
         </w:tc>
@@ -4087,7 +4517,163 @@
       <w:tr>
         <w:tc>
           <w:tcPr>
-            <w:tcW w:type="dxa" w:w="1037"/>
+            <w:tcW w:type="dxa" w:w="943"/>
+          </w:tcPr>
+          <w:p>
+            <w:r>
+              <w:rPr>
+                <w:rFonts w:ascii="Arial" w:hAnsi="Arial"/>
+                <w:sz w:val="12"/>
+              </w:rPr>
+              <w:t>CREMA-D</w:t>
+            </w:r>
+          </w:p>
+        </w:tc>
+        <w:tc>
+          <w:tcPr>
+            <w:tcW w:type="dxa" w:w="943"/>
+          </w:tcPr>
+          <w:p>
+            <w:r>
+              <w:rPr>
+                <w:rFonts w:ascii="Arial" w:hAnsi="Arial"/>
+                <w:sz w:val="12"/>
+              </w:rPr>
+              <w:t>8</w:t>
+            </w:r>
+          </w:p>
+        </w:tc>
+        <w:tc>
+          <w:tcPr>
+            <w:tcW w:type="dxa" w:w="943"/>
+          </w:tcPr>
+          <w:p>
+            <w:r>
+              <w:rPr>
+                <w:rFonts w:ascii="Arial" w:hAnsi="Arial"/>
+                <w:sz w:val="12"/>
+              </w:rPr>
+              <w:t>resize</w:t>
+            </w:r>
+          </w:p>
+        </w:tc>
+        <w:tc>
+          <w:tcPr>
+            <w:tcW w:type="dxa" w:w="943"/>
+          </w:tcPr>
+          <w:p>
+            <w:r>
+              <w:rPr>
+                <w:rFonts w:ascii="Arial" w:hAnsi="Arial"/>
+                <w:sz w:val="12"/>
+              </w:rPr>
+              <w:t>96</w:t>
+            </w:r>
+          </w:p>
+        </w:tc>
+        <w:tc>
+          <w:tcPr>
+            <w:tcW w:type="dxa" w:w="943"/>
+          </w:tcPr>
+          <w:p>
+            <w:r>
+              <w:rPr>
+                <w:rFonts w:ascii="Arial" w:hAnsi="Arial"/>
+                <w:sz w:val="12"/>
+              </w:rPr>
+              <w:t>64</w:t>
+            </w:r>
+          </w:p>
+        </w:tc>
+        <w:tc>
+          <w:tcPr>
+            <w:tcW w:type="dxa" w:w="943"/>
+          </w:tcPr>
+          <w:p>
+            <w:r>
+              <w:rPr>
+                <w:rFonts w:ascii="Arial" w:hAnsi="Arial"/>
+                <w:sz w:val="12"/>
+              </w:rPr>
+              <w:t>6144</w:t>
+            </w:r>
+          </w:p>
+        </w:tc>
+        <w:tc>
+          <w:tcPr>
+            <w:tcW w:type="dxa" w:w="943"/>
+          </w:tcPr>
+          <w:p>
+            <w:r>
+              <w:rPr>
+                <w:rFonts w:ascii="Arial" w:hAnsi="Arial"/>
+                <w:sz w:val="12"/>
+              </w:rPr>
+              <w:t>31</w:t>
+            </w:r>
+          </w:p>
+        </w:tc>
+        <w:tc>
+          <w:tcPr>
+            <w:tcW w:type="dxa" w:w="943"/>
+          </w:tcPr>
+          <w:p>
+            <w:r>
+              <w:rPr>
+                <w:rFonts w:ascii="Arial" w:hAnsi="Arial"/>
+                <w:sz w:val="12"/>
+              </w:rPr>
+              <w:t>0.4683</w:t>
+            </w:r>
+          </w:p>
+        </w:tc>
+        <w:tc>
+          <w:tcPr>
+            <w:tcW w:type="dxa" w:w="943"/>
+          </w:tcPr>
+          <w:p>
+            <w:r>
+              <w:rPr>
+                <w:rFonts w:ascii="Arial" w:hAnsi="Arial"/>
+                <w:sz w:val="12"/>
+              </w:rPr>
+              <w:t>0.4663</w:t>
+            </w:r>
+          </w:p>
+        </w:tc>
+        <w:tc>
+          <w:tcPr>
+            <w:tcW w:type="dxa" w:w="943"/>
+          </w:tcPr>
+          <w:p>
+            <w:r>
+              <w:rPr>
+                <w:rFonts w:ascii="Arial" w:hAnsi="Arial"/>
+                <w:sz w:val="12"/>
+              </w:rPr>
+              <w:t>0.4669</w:t>
+            </w:r>
+          </w:p>
+        </w:tc>
+        <w:tc>
+          <w:tcPr>
+            <w:tcW w:type="dxa" w:w="943"/>
+          </w:tcPr>
+          <w:p>
+            <w:r>
+              <w:rPr>
+                <w:rFonts w:ascii="Arial" w:hAnsi="Arial"/>
+                <w:sz w:val="12"/>
+              </w:rPr>
+              <w:t>Hayır</w:t>
+            </w:r>
+          </w:p>
+        </w:tc>
+      </w:tr>
+      <w:tr>
+        <w:tc>
+          <w:tcPr>
+            <w:tcW w:type="dxa" w:w="943"/>
           </w:tcPr>
           <w:p>
             <w:r>
@@ -4101,7 +4687,475 @@
         </w:tc>
         <w:tc>
           <w:tcPr>
-            <w:tcW w:type="dxa" w:w="1037"/>
+            <w:tcW w:type="dxa" w:w="943"/>
+          </w:tcPr>
+          <w:p>
+            <w:r>
+              <w:rPr>
+                <w:rFonts w:ascii="Arial" w:hAnsi="Arial"/>
+                <w:sz w:val="12"/>
+              </w:rPr>
+              <w:t>1</w:t>
+            </w:r>
+          </w:p>
+        </w:tc>
+        <w:tc>
+          <w:tcPr>
+            <w:tcW w:type="dxa" w:w="943"/>
+          </w:tcPr>
+          <w:p>
+            <w:r>
+              <w:rPr>
+                <w:rFonts w:ascii="Arial" w:hAnsi="Arial"/>
+                <w:sz w:val="12"/>
+              </w:rPr>
+              <w:t>crop_pad</w:t>
+            </w:r>
+          </w:p>
+        </w:tc>
+        <w:tc>
+          <w:tcPr>
+            <w:tcW w:type="dxa" w:w="943"/>
+          </w:tcPr>
+          <w:p>
+            <w:r>
+              <w:rPr>
+                <w:rFonts w:ascii="Arial" w:hAnsi="Arial"/>
+                <w:sz w:val="12"/>
+              </w:rPr>
+              <w:t>64</w:t>
+            </w:r>
+          </w:p>
+        </w:tc>
+        <w:tc>
+          <w:tcPr>
+            <w:tcW w:type="dxa" w:w="943"/>
+          </w:tcPr>
+          <w:p>
+            <w:r>
+              <w:rPr>
+                <w:rFonts w:ascii="Arial" w:hAnsi="Arial"/>
+                <w:sz w:val="12"/>
+              </w:rPr>
+              <w:t>64</w:t>
+            </w:r>
+          </w:p>
+        </w:tc>
+        <w:tc>
+          <w:tcPr>
+            <w:tcW w:type="dxa" w:w="943"/>
+          </w:tcPr>
+          <w:p>
+            <w:r>
+              <w:rPr>
+                <w:rFonts w:ascii="Arial" w:hAnsi="Arial"/>
+                <w:sz w:val="12"/>
+              </w:rPr>
+              <w:t>4096</w:t>
+            </w:r>
+          </w:p>
+        </w:tc>
+        <w:tc>
+          <w:tcPr>
+            <w:tcW w:type="dxa" w:w="943"/>
+          </w:tcPr>
+          <w:p>
+            <w:r>
+              <w:rPr>
+                <w:rFonts w:ascii="Arial" w:hAnsi="Arial"/>
+                <w:sz w:val="12"/>
+              </w:rPr>
+              <w:t>3</w:t>
+            </w:r>
+          </w:p>
+        </w:tc>
+        <w:tc>
+          <w:tcPr>
+            <w:tcW w:type="dxa" w:w="943"/>
+          </w:tcPr>
+          <w:p>
+            <w:r>
+              <w:rPr>
+                <w:rFonts w:ascii="Arial" w:hAnsi="Arial"/>
+                <w:sz w:val="12"/>
+              </w:rPr>
+              <w:t>0.2611</w:t>
+            </w:r>
+          </w:p>
+        </w:tc>
+        <w:tc>
+          <w:tcPr>
+            <w:tcW w:type="dxa" w:w="943"/>
+          </w:tcPr>
+          <w:p>
+            <w:r>
+              <w:rPr>
+                <w:rFonts w:ascii="Arial" w:hAnsi="Arial"/>
+                <w:sz w:val="12"/>
+              </w:rPr>
+              <w:t>0.2728</w:t>
+            </w:r>
+          </w:p>
+        </w:tc>
+        <w:tc>
+          <w:tcPr>
+            <w:tcW w:type="dxa" w:w="943"/>
+          </w:tcPr>
+          <w:p>
+            <w:r>
+              <w:rPr>
+                <w:rFonts w:ascii="Arial" w:hAnsi="Arial"/>
+                <w:sz w:val="12"/>
+              </w:rPr>
+              <w:t>0.2525</w:t>
+            </w:r>
+          </w:p>
+        </w:tc>
+        <w:tc>
+          <w:tcPr>
+            <w:tcW w:type="dxa" w:w="943"/>
+          </w:tcPr>
+          <w:p>
+            <w:r>
+              <w:rPr>
+                <w:rFonts w:ascii="Arial" w:hAnsi="Arial"/>
+                <w:sz w:val="12"/>
+              </w:rPr>
+              <w:t>Evet</w:t>
+            </w:r>
+          </w:p>
+        </w:tc>
+      </w:tr>
+      <w:tr>
+        <w:tc>
+          <w:tcPr>
+            <w:tcW w:type="dxa" w:w="943"/>
+          </w:tcPr>
+          <w:p>
+            <w:r>
+              <w:rPr>
+                <w:rFonts w:ascii="Arial" w:hAnsi="Arial"/>
+                <w:sz w:val="12"/>
+              </w:rPr>
+              <w:t>MELD</w:t>
+            </w:r>
+          </w:p>
+        </w:tc>
+        <w:tc>
+          <w:tcPr>
+            <w:tcW w:type="dxa" w:w="943"/>
+          </w:tcPr>
+          <w:p>
+            <w:r>
+              <w:rPr>
+                <w:rFonts w:ascii="Arial" w:hAnsi="Arial"/>
+                <w:sz w:val="12"/>
+              </w:rPr>
+              <w:t>2</w:t>
+            </w:r>
+          </w:p>
+        </w:tc>
+        <w:tc>
+          <w:tcPr>
+            <w:tcW w:type="dxa" w:w="943"/>
+          </w:tcPr>
+          <w:p>
+            <w:r>
+              <w:rPr>
+                <w:rFonts w:ascii="Arial" w:hAnsi="Arial"/>
+                <w:sz w:val="12"/>
+              </w:rPr>
+              <w:t>resize</w:t>
+            </w:r>
+          </w:p>
+        </w:tc>
+        <w:tc>
+          <w:tcPr>
+            <w:tcW w:type="dxa" w:w="943"/>
+          </w:tcPr>
+          <w:p>
+            <w:r>
+              <w:rPr>
+                <w:rFonts w:ascii="Arial" w:hAnsi="Arial"/>
+                <w:sz w:val="12"/>
+              </w:rPr>
+              <w:t>64</w:t>
+            </w:r>
+          </w:p>
+        </w:tc>
+        <w:tc>
+          <w:tcPr>
+            <w:tcW w:type="dxa" w:w="943"/>
+          </w:tcPr>
+          <w:p>
+            <w:r>
+              <w:rPr>
+                <w:rFonts w:ascii="Arial" w:hAnsi="Arial"/>
+                <w:sz w:val="12"/>
+              </w:rPr>
+              <w:t>64</w:t>
+            </w:r>
+          </w:p>
+        </w:tc>
+        <w:tc>
+          <w:tcPr>
+            <w:tcW w:type="dxa" w:w="943"/>
+          </w:tcPr>
+          <w:p>
+            <w:r>
+              <w:rPr>
+                <w:rFonts w:ascii="Arial" w:hAnsi="Arial"/>
+                <w:sz w:val="12"/>
+              </w:rPr>
+              <w:t>4096</w:t>
+            </w:r>
+          </w:p>
+        </w:tc>
+        <w:tc>
+          <w:tcPr>
+            <w:tcW w:type="dxa" w:w="943"/>
+          </w:tcPr>
+          <w:p>
+            <w:r>
+              <w:rPr>
+                <w:rFonts w:ascii="Arial" w:hAnsi="Arial"/>
+                <w:sz w:val="12"/>
+              </w:rPr>
+              <w:t>2</w:t>
+            </w:r>
+          </w:p>
+        </w:tc>
+        <w:tc>
+          <w:tcPr>
+            <w:tcW w:type="dxa" w:w="943"/>
+          </w:tcPr>
+          <w:p>
+            <w:r>
+              <w:rPr>
+                <w:rFonts w:ascii="Arial" w:hAnsi="Arial"/>
+                <w:sz w:val="12"/>
+              </w:rPr>
+              <w:t>0.2192</w:t>
+            </w:r>
+          </w:p>
+        </w:tc>
+        <w:tc>
+          <w:tcPr>
+            <w:tcW w:type="dxa" w:w="943"/>
+          </w:tcPr>
+          <w:p>
+            <w:r>
+              <w:rPr>
+                <w:rFonts w:ascii="Arial" w:hAnsi="Arial"/>
+                <w:sz w:val="12"/>
+              </w:rPr>
+              <w:t>0.2142</w:t>
+            </w:r>
+          </w:p>
+        </w:tc>
+        <w:tc>
+          <w:tcPr>
+            <w:tcW w:type="dxa" w:w="943"/>
+          </w:tcPr>
+          <w:p>
+            <w:r>
+              <w:rPr>
+                <w:rFonts w:ascii="Arial" w:hAnsi="Arial"/>
+                <w:sz w:val="12"/>
+              </w:rPr>
+              <w:t>0.2084</w:t>
+            </w:r>
+          </w:p>
+        </w:tc>
+        <w:tc>
+          <w:tcPr>
+            <w:tcW w:type="dxa" w:w="943"/>
+          </w:tcPr>
+          <w:p>
+            <w:r>
+              <w:rPr>
+                <w:rFonts w:ascii="Arial" w:hAnsi="Arial"/>
+                <w:sz w:val="12"/>
+              </w:rPr>
+              <w:t>Hayır</w:t>
+            </w:r>
+          </w:p>
+        </w:tc>
+      </w:tr>
+      <w:tr>
+        <w:tc>
+          <w:tcPr>
+            <w:tcW w:type="dxa" w:w="943"/>
+          </w:tcPr>
+          <w:p>
+            <w:r>
+              <w:rPr>
+                <w:rFonts w:ascii="Arial" w:hAnsi="Arial"/>
+                <w:sz w:val="12"/>
+              </w:rPr>
+              <w:t>MELD</w:t>
+            </w:r>
+          </w:p>
+        </w:tc>
+        <w:tc>
+          <w:tcPr>
+            <w:tcW w:type="dxa" w:w="943"/>
+          </w:tcPr>
+          <w:p>
+            <w:r>
+              <w:rPr>
+                <w:rFonts w:ascii="Arial" w:hAnsi="Arial"/>
+                <w:sz w:val="12"/>
+              </w:rPr>
+              <w:t>3</w:t>
+            </w:r>
+          </w:p>
+        </w:tc>
+        <w:tc>
+          <w:tcPr>
+            <w:tcW w:type="dxa" w:w="943"/>
+          </w:tcPr>
+          <w:p>
+            <w:r>
+              <w:rPr>
+                <w:rFonts w:ascii="Arial" w:hAnsi="Arial"/>
+                <w:sz w:val="12"/>
+              </w:rPr>
+              <w:t>crop_pad</w:t>
+            </w:r>
+          </w:p>
+        </w:tc>
+        <w:tc>
+          <w:tcPr>
+            <w:tcW w:type="dxa" w:w="943"/>
+          </w:tcPr>
+          <w:p>
+            <w:r>
+              <w:rPr>
+                <w:rFonts w:ascii="Arial" w:hAnsi="Arial"/>
+                <w:sz w:val="12"/>
+              </w:rPr>
+              <w:t>64</w:t>
+            </w:r>
+          </w:p>
+        </w:tc>
+        <w:tc>
+          <w:tcPr>
+            <w:tcW w:type="dxa" w:w="943"/>
+          </w:tcPr>
+          <w:p>
+            <w:r>
+              <w:rPr>
+                <w:rFonts w:ascii="Arial" w:hAnsi="Arial"/>
+                <w:sz w:val="12"/>
+              </w:rPr>
+              <w:t>96</w:t>
+            </w:r>
+          </w:p>
+        </w:tc>
+        <w:tc>
+          <w:tcPr>
+            <w:tcW w:type="dxa" w:w="943"/>
+          </w:tcPr>
+          <w:p>
+            <w:r>
+              <w:rPr>
+                <w:rFonts w:ascii="Arial" w:hAnsi="Arial"/>
+                <w:sz w:val="12"/>
+              </w:rPr>
+              <w:t>6144</w:t>
+            </w:r>
+          </w:p>
+        </w:tc>
+        <w:tc>
+          <w:tcPr>
+            <w:tcW w:type="dxa" w:w="943"/>
+          </w:tcPr>
+          <w:p>
+            <w:r>
+              <w:rPr>
+                <w:rFonts w:ascii="Arial" w:hAnsi="Arial"/>
+                <w:sz w:val="12"/>
+              </w:rPr>
+              <w:t>6</w:t>
+            </w:r>
+          </w:p>
+        </w:tc>
+        <w:tc>
+          <w:tcPr>
+            <w:tcW w:type="dxa" w:w="943"/>
+          </w:tcPr>
+          <w:p>
+            <w:r>
+              <w:rPr>
+                <w:rFonts w:ascii="Arial" w:hAnsi="Arial"/>
+                <w:sz w:val="12"/>
+              </w:rPr>
+              <w:t>0.2192</w:t>
+            </w:r>
+          </w:p>
+        </w:tc>
+        <w:tc>
+          <w:tcPr>
+            <w:tcW w:type="dxa" w:w="943"/>
+          </w:tcPr>
+          <w:p>
+            <w:r>
+              <w:rPr>
+                <w:rFonts w:ascii="Arial" w:hAnsi="Arial"/>
+                <w:sz w:val="12"/>
+              </w:rPr>
+              <w:t>0.2131</w:t>
+            </w:r>
+          </w:p>
+        </w:tc>
+        <w:tc>
+          <w:tcPr>
+            <w:tcW w:type="dxa" w:w="943"/>
+          </w:tcPr>
+          <w:p>
+            <w:r>
+              <w:rPr>
+                <w:rFonts w:ascii="Arial" w:hAnsi="Arial"/>
+                <w:sz w:val="12"/>
+              </w:rPr>
+              <w:t>0.2099</w:t>
+            </w:r>
+          </w:p>
+        </w:tc>
+        <w:tc>
+          <w:tcPr>
+            <w:tcW w:type="dxa" w:w="943"/>
+          </w:tcPr>
+          <w:p>
+            <w:r>
+              <w:rPr>
+                <w:rFonts w:ascii="Arial" w:hAnsi="Arial"/>
+                <w:sz w:val="12"/>
+              </w:rPr>
+              <w:t>Hayır</w:t>
+            </w:r>
+          </w:p>
+        </w:tc>
+      </w:tr>
+      <w:tr>
+        <w:tc>
+          <w:tcPr>
+            <w:tcW w:type="dxa" w:w="943"/>
+          </w:tcPr>
+          <w:p>
+            <w:r>
+              <w:rPr>
+                <w:rFonts w:ascii="Arial" w:hAnsi="Arial"/>
+                <w:sz w:val="12"/>
+              </w:rPr>
+              <w:t>MELD</w:t>
+            </w:r>
+          </w:p>
+        </w:tc>
+        <w:tc>
+          <w:tcPr>
+            <w:tcW w:type="dxa" w:w="943"/>
           </w:tcPr>
           <w:p>
             <w:r>
@@ -4115,7 +5169,7 @@
         </w:tc>
         <w:tc>
           <w:tcPr>
-            <w:tcW w:type="dxa" w:w="1037"/>
+            <w:tcW w:type="dxa" w:w="943"/>
           </w:tcPr>
           <w:p>
             <w:r>
@@ -4129,7 +5183,21 @@
         </w:tc>
         <w:tc>
           <w:tcPr>
-            <w:tcW w:type="dxa" w:w="1037"/>
+            <w:tcW w:type="dxa" w:w="943"/>
+          </w:tcPr>
+          <w:p>
+            <w:r>
+              <w:rPr>
+                <w:rFonts w:ascii="Arial" w:hAnsi="Arial"/>
+                <w:sz w:val="12"/>
+              </w:rPr>
+              <w:t>64</w:t>
+            </w:r>
+          </w:p>
+        </w:tc>
+        <w:tc>
+          <w:tcPr>
+            <w:tcW w:type="dxa" w:w="943"/>
           </w:tcPr>
           <w:p>
             <w:r>
@@ -4143,7 +5211,7 @@
         </w:tc>
         <w:tc>
           <w:tcPr>
-            <w:tcW w:type="dxa" w:w="1037"/>
+            <w:tcW w:type="dxa" w:w="943"/>
           </w:tcPr>
           <w:p>
             <w:r>
@@ -4157,7 +5225,7 @@
         </w:tc>
         <w:tc>
           <w:tcPr>
-            <w:tcW w:type="dxa" w:w="1037"/>
+            <w:tcW w:type="dxa" w:w="943"/>
           </w:tcPr>
           <w:p>
             <w:r>
@@ -4171,7 +5239,7 @@
         </w:tc>
         <w:tc>
           <w:tcPr>
-            <w:tcW w:type="dxa" w:w="1037"/>
+            <w:tcW w:type="dxa" w:w="943"/>
           </w:tcPr>
           <w:p>
             <w:r>
@@ -4185,7 +5253,7 @@
         </w:tc>
         <w:tc>
           <w:tcPr>
-            <w:tcW w:type="dxa" w:w="1037"/>
+            <w:tcW w:type="dxa" w:w="943"/>
           </w:tcPr>
           <w:p>
             <w:r>
@@ -4199,7 +5267,7 @@
         </w:tc>
         <w:tc>
           <w:tcPr>
-            <w:tcW w:type="dxa" w:w="1037"/>
+            <w:tcW w:type="dxa" w:w="943"/>
           </w:tcPr>
           <w:p>
             <w:r>
@@ -4213,7 +5281,631 @@
         </w:tc>
         <w:tc>
           <w:tcPr>
-            <w:tcW w:type="dxa" w:w="1037"/>
+            <w:tcW w:type="dxa" w:w="943"/>
+          </w:tcPr>
+          <w:p>
+            <w:r>
+              <w:rPr>
+                <w:rFonts w:ascii="Arial" w:hAnsi="Arial"/>
+                <w:sz w:val="12"/>
+              </w:rPr>
+              <w:t>Hayır</w:t>
+            </w:r>
+          </w:p>
+        </w:tc>
+      </w:tr>
+      <w:tr>
+        <w:tc>
+          <w:tcPr>
+            <w:tcW w:type="dxa" w:w="943"/>
+          </w:tcPr>
+          <w:p>
+            <w:r>
+              <w:rPr>
+                <w:rFonts w:ascii="Arial" w:hAnsi="Arial"/>
+                <w:sz w:val="12"/>
+              </w:rPr>
+              <w:t>MELD</w:t>
+            </w:r>
+          </w:p>
+        </w:tc>
+        <w:tc>
+          <w:tcPr>
+            <w:tcW w:type="dxa" w:w="943"/>
+          </w:tcPr>
+          <w:p>
+            <w:r>
+              <w:rPr>
+                <w:rFonts w:ascii="Arial" w:hAnsi="Arial"/>
+                <w:sz w:val="12"/>
+              </w:rPr>
+              <w:t>5</w:t>
+            </w:r>
+          </w:p>
+        </w:tc>
+        <w:tc>
+          <w:tcPr>
+            <w:tcW w:type="dxa" w:w="943"/>
+          </w:tcPr>
+          <w:p>
+            <w:r>
+              <w:rPr>
+                <w:rFonts w:ascii="Arial" w:hAnsi="Arial"/>
+                <w:sz w:val="12"/>
+              </w:rPr>
+              <w:t>crop_pad</w:t>
+            </w:r>
+          </w:p>
+        </w:tc>
+        <w:tc>
+          <w:tcPr>
+            <w:tcW w:type="dxa" w:w="943"/>
+          </w:tcPr>
+          <w:p>
+            <w:r>
+              <w:rPr>
+                <w:rFonts w:ascii="Arial" w:hAnsi="Arial"/>
+                <w:sz w:val="12"/>
+              </w:rPr>
+              <w:t>80</w:t>
+            </w:r>
+          </w:p>
+        </w:tc>
+        <w:tc>
+          <w:tcPr>
+            <w:tcW w:type="dxa" w:w="943"/>
+          </w:tcPr>
+          <w:p>
+            <w:r>
+              <w:rPr>
+                <w:rFonts w:ascii="Arial" w:hAnsi="Arial"/>
+                <w:sz w:val="12"/>
+              </w:rPr>
+              <w:t>64</w:t>
+            </w:r>
+          </w:p>
+        </w:tc>
+        <w:tc>
+          <w:tcPr>
+            <w:tcW w:type="dxa" w:w="943"/>
+          </w:tcPr>
+          <w:p>
+            <w:r>
+              <w:rPr>
+                <w:rFonts w:ascii="Arial" w:hAnsi="Arial"/>
+                <w:sz w:val="12"/>
+              </w:rPr>
+              <w:t>5120</w:t>
+            </w:r>
+          </w:p>
+        </w:tc>
+        <w:tc>
+          <w:tcPr>
+            <w:tcW w:type="dxa" w:w="943"/>
+          </w:tcPr>
+          <w:p>
+            <w:r>
+              <w:rPr>
+                <w:rFonts w:ascii="Arial" w:hAnsi="Arial"/>
+                <w:sz w:val="12"/>
+              </w:rPr>
+              <w:t>13</w:t>
+            </w:r>
+          </w:p>
+        </w:tc>
+        <w:tc>
+          <w:tcPr>
+            <w:tcW w:type="dxa" w:w="943"/>
+          </w:tcPr>
+          <w:p>
+            <w:r>
+              <w:rPr>
+                <w:rFonts w:ascii="Arial" w:hAnsi="Arial"/>
+                <w:sz w:val="12"/>
+              </w:rPr>
+              <w:t>0.2241</w:t>
+            </w:r>
+          </w:p>
+        </w:tc>
+        <w:tc>
+          <w:tcPr>
+            <w:tcW w:type="dxa" w:w="943"/>
+          </w:tcPr>
+          <w:p>
+            <w:r>
+              <w:rPr>
+                <w:rFonts w:ascii="Arial" w:hAnsi="Arial"/>
+                <w:sz w:val="12"/>
+              </w:rPr>
+              <w:t>0.2249</w:t>
+            </w:r>
+          </w:p>
+        </w:tc>
+        <w:tc>
+          <w:tcPr>
+            <w:tcW w:type="dxa" w:w="943"/>
+          </w:tcPr>
+          <w:p>
+            <w:r>
+              <w:rPr>
+                <w:rFonts w:ascii="Arial" w:hAnsi="Arial"/>
+                <w:sz w:val="12"/>
+              </w:rPr>
+              <w:t>0.2204</w:t>
+            </w:r>
+          </w:p>
+        </w:tc>
+        <w:tc>
+          <w:tcPr>
+            <w:tcW w:type="dxa" w:w="943"/>
+          </w:tcPr>
+          <w:p>
+            <w:r>
+              <w:rPr>
+                <w:rFonts w:ascii="Arial" w:hAnsi="Arial"/>
+                <w:sz w:val="12"/>
+              </w:rPr>
+              <w:t>Hayır</w:t>
+            </w:r>
+          </w:p>
+        </w:tc>
+      </w:tr>
+      <w:tr>
+        <w:tc>
+          <w:tcPr>
+            <w:tcW w:type="dxa" w:w="943"/>
+          </w:tcPr>
+          <w:p>
+            <w:r>
+              <w:rPr>
+                <w:rFonts w:ascii="Arial" w:hAnsi="Arial"/>
+                <w:sz w:val="12"/>
+              </w:rPr>
+              <w:t>MELD</w:t>
+            </w:r>
+          </w:p>
+        </w:tc>
+        <w:tc>
+          <w:tcPr>
+            <w:tcW w:type="dxa" w:w="943"/>
+          </w:tcPr>
+          <w:p>
+            <w:r>
+              <w:rPr>
+                <w:rFonts w:ascii="Arial" w:hAnsi="Arial"/>
+                <w:sz w:val="12"/>
+              </w:rPr>
+              <w:t>6</w:t>
+            </w:r>
+          </w:p>
+        </w:tc>
+        <w:tc>
+          <w:tcPr>
+            <w:tcW w:type="dxa" w:w="943"/>
+          </w:tcPr>
+          <w:p>
+            <w:r>
+              <w:rPr>
+                <w:rFonts w:ascii="Arial" w:hAnsi="Arial"/>
+                <w:sz w:val="12"/>
+              </w:rPr>
+              <w:t>resize</w:t>
+            </w:r>
+          </w:p>
+        </w:tc>
+        <w:tc>
+          <w:tcPr>
+            <w:tcW w:type="dxa" w:w="943"/>
+          </w:tcPr>
+          <w:p>
+            <w:r>
+              <w:rPr>
+                <w:rFonts w:ascii="Arial" w:hAnsi="Arial"/>
+                <w:sz w:val="12"/>
+              </w:rPr>
+              <w:t>80</w:t>
+            </w:r>
+          </w:p>
+        </w:tc>
+        <w:tc>
+          <w:tcPr>
+            <w:tcW w:type="dxa" w:w="943"/>
+          </w:tcPr>
+          <w:p>
+            <w:r>
+              <w:rPr>
+                <w:rFonts w:ascii="Arial" w:hAnsi="Arial"/>
+                <w:sz w:val="12"/>
+              </w:rPr>
+              <w:t>64</w:t>
+            </w:r>
+          </w:p>
+        </w:tc>
+        <w:tc>
+          <w:tcPr>
+            <w:tcW w:type="dxa" w:w="943"/>
+          </w:tcPr>
+          <w:p>
+            <w:r>
+              <w:rPr>
+                <w:rFonts w:ascii="Arial" w:hAnsi="Arial"/>
+                <w:sz w:val="12"/>
+              </w:rPr>
+              <w:t>5120</w:t>
+            </w:r>
+          </w:p>
+        </w:tc>
+        <w:tc>
+          <w:tcPr>
+            <w:tcW w:type="dxa" w:w="943"/>
+          </w:tcPr>
+          <w:p>
+            <w:r>
+              <w:rPr>
+                <w:rFonts w:ascii="Arial" w:hAnsi="Arial"/>
+                <w:sz w:val="12"/>
+              </w:rPr>
+              <w:t>2</w:t>
+            </w:r>
+          </w:p>
+        </w:tc>
+        <w:tc>
+          <w:tcPr>
+            <w:tcW w:type="dxa" w:w="943"/>
+          </w:tcPr>
+          <w:p>
+            <w:r>
+              <w:rPr>
+                <w:rFonts w:ascii="Arial" w:hAnsi="Arial"/>
+                <w:sz w:val="12"/>
+              </w:rPr>
+              <w:t>0.2438</w:t>
+            </w:r>
+          </w:p>
+        </w:tc>
+        <w:tc>
+          <w:tcPr>
+            <w:tcW w:type="dxa" w:w="943"/>
+          </w:tcPr>
+          <w:p>
+            <w:r>
+              <w:rPr>
+                <w:rFonts w:ascii="Arial" w:hAnsi="Arial"/>
+                <w:sz w:val="12"/>
+              </w:rPr>
+              <w:t>0.2415</w:t>
+            </w:r>
+          </w:p>
+        </w:tc>
+        <w:tc>
+          <w:tcPr>
+            <w:tcW w:type="dxa" w:w="943"/>
+          </w:tcPr>
+          <w:p>
+            <w:r>
+              <w:rPr>
+                <w:rFonts w:ascii="Arial" w:hAnsi="Arial"/>
+                <w:sz w:val="12"/>
+              </w:rPr>
+              <w:t>0.2386</w:t>
+            </w:r>
+          </w:p>
+        </w:tc>
+        <w:tc>
+          <w:tcPr>
+            <w:tcW w:type="dxa" w:w="943"/>
+          </w:tcPr>
+          <w:p>
+            <w:r>
+              <w:rPr>
+                <w:rFonts w:ascii="Arial" w:hAnsi="Arial"/>
+                <w:sz w:val="12"/>
+              </w:rPr>
+              <w:t>Hayır</w:t>
+            </w:r>
+          </w:p>
+        </w:tc>
+      </w:tr>
+      <w:tr>
+        <w:tc>
+          <w:tcPr>
+            <w:tcW w:type="dxa" w:w="943"/>
+          </w:tcPr>
+          <w:p>
+            <w:r>
+              <w:rPr>
+                <w:rFonts w:ascii="Arial" w:hAnsi="Arial"/>
+                <w:sz w:val="12"/>
+              </w:rPr>
+              <w:t>MELD</w:t>
+            </w:r>
+          </w:p>
+        </w:tc>
+        <w:tc>
+          <w:tcPr>
+            <w:tcW w:type="dxa" w:w="943"/>
+          </w:tcPr>
+          <w:p>
+            <w:r>
+              <w:rPr>
+                <w:rFonts w:ascii="Arial" w:hAnsi="Arial"/>
+                <w:sz w:val="12"/>
+              </w:rPr>
+              <w:t>7</w:t>
+            </w:r>
+          </w:p>
+        </w:tc>
+        <w:tc>
+          <w:tcPr>
+            <w:tcW w:type="dxa" w:w="943"/>
+          </w:tcPr>
+          <w:p>
+            <w:r>
+              <w:rPr>
+                <w:rFonts w:ascii="Arial" w:hAnsi="Arial"/>
+                <w:sz w:val="12"/>
+              </w:rPr>
+              <w:t>crop_pad</w:t>
+            </w:r>
+          </w:p>
+        </w:tc>
+        <w:tc>
+          <w:tcPr>
+            <w:tcW w:type="dxa" w:w="943"/>
+          </w:tcPr>
+          <w:p>
+            <w:r>
+              <w:rPr>
+                <w:rFonts w:ascii="Arial" w:hAnsi="Arial"/>
+                <w:sz w:val="12"/>
+              </w:rPr>
+              <w:t>96</w:t>
+            </w:r>
+          </w:p>
+        </w:tc>
+        <w:tc>
+          <w:tcPr>
+            <w:tcW w:type="dxa" w:w="943"/>
+          </w:tcPr>
+          <w:p>
+            <w:r>
+              <w:rPr>
+                <w:rFonts w:ascii="Arial" w:hAnsi="Arial"/>
+                <w:sz w:val="12"/>
+              </w:rPr>
+              <w:t>64</w:t>
+            </w:r>
+          </w:p>
+        </w:tc>
+        <w:tc>
+          <w:tcPr>
+            <w:tcW w:type="dxa" w:w="943"/>
+          </w:tcPr>
+          <w:p>
+            <w:r>
+              <w:rPr>
+                <w:rFonts w:ascii="Arial" w:hAnsi="Arial"/>
+                <w:sz w:val="12"/>
+              </w:rPr>
+              <w:t>6144</w:t>
+            </w:r>
+          </w:p>
+        </w:tc>
+        <w:tc>
+          <w:tcPr>
+            <w:tcW w:type="dxa" w:w="943"/>
+          </w:tcPr>
+          <w:p>
+            <w:r>
+              <w:rPr>
+                <w:rFonts w:ascii="Arial" w:hAnsi="Arial"/>
+                <w:sz w:val="12"/>
+              </w:rPr>
+              <w:t>5</w:t>
+            </w:r>
+          </w:p>
+        </w:tc>
+        <w:tc>
+          <w:tcPr>
+            <w:tcW w:type="dxa" w:w="943"/>
+          </w:tcPr>
+          <w:p>
+            <w:r>
+              <w:rPr>
+                <w:rFonts w:ascii="Arial" w:hAnsi="Arial"/>
+                <w:sz w:val="12"/>
+              </w:rPr>
+              <w:t>0.2241</w:t>
+            </w:r>
+          </w:p>
+        </w:tc>
+        <w:tc>
+          <w:tcPr>
+            <w:tcW w:type="dxa" w:w="943"/>
+          </w:tcPr>
+          <w:p>
+            <w:r>
+              <w:rPr>
+                <w:rFonts w:ascii="Arial" w:hAnsi="Arial"/>
+                <w:sz w:val="12"/>
+              </w:rPr>
+              <w:t>0.2245</w:t>
+            </w:r>
+          </w:p>
+        </w:tc>
+        <w:tc>
+          <w:tcPr>
+            <w:tcW w:type="dxa" w:w="943"/>
+          </w:tcPr>
+          <w:p>
+            <w:r>
+              <w:rPr>
+                <w:rFonts w:ascii="Arial" w:hAnsi="Arial"/>
+                <w:sz w:val="12"/>
+              </w:rPr>
+              <w:t>0.2231</w:t>
+            </w:r>
+          </w:p>
+        </w:tc>
+        <w:tc>
+          <w:tcPr>
+            <w:tcW w:type="dxa" w:w="943"/>
+          </w:tcPr>
+          <w:p>
+            <w:r>
+              <w:rPr>
+                <w:rFonts w:ascii="Arial" w:hAnsi="Arial"/>
+                <w:sz w:val="12"/>
+              </w:rPr>
+              <w:t>Hayır</w:t>
+            </w:r>
+          </w:p>
+        </w:tc>
+      </w:tr>
+      <w:tr>
+        <w:tc>
+          <w:tcPr>
+            <w:tcW w:type="dxa" w:w="943"/>
+          </w:tcPr>
+          <w:p>
+            <w:r>
+              <w:rPr>
+                <w:rFonts w:ascii="Arial" w:hAnsi="Arial"/>
+                <w:sz w:val="12"/>
+              </w:rPr>
+              <w:t>MELD</w:t>
+            </w:r>
+          </w:p>
+        </w:tc>
+        <w:tc>
+          <w:tcPr>
+            <w:tcW w:type="dxa" w:w="943"/>
+          </w:tcPr>
+          <w:p>
+            <w:r>
+              <w:rPr>
+                <w:rFonts w:ascii="Arial" w:hAnsi="Arial"/>
+                <w:sz w:val="12"/>
+              </w:rPr>
+              <w:t>8</w:t>
+            </w:r>
+          </w:p>
+        </w:tc>
+        <w:tc>
+          <w:tcPr>
+            <w:tcW w:type="dxa" w:w="943"/>
+          </w:tcPr>
+          <w:p>
+            <w:r>
+              <w:rPr>
+                <w:rFonts w:ascii="Arial" w:hAnsi="Arial"/>
+                <w:sz w:val="12"/>
+              </w:rPr>
+              <w:t>resize</w:t>
+            </w:r>
+          </w:p>
+        </w:tc>
+        <w:tc>
+          <w:tcPr>
+            <w:tcW w:type="dxa" w:w="943"/>
+          </w:tcPr>
+          <w:p>
+            <w:r>
+              <w:rPr>
+                <w:rFonts w:ascii="Arial" w:hAnsi="Arial"/>
+                <w:sz w:val="12"/>
+              </w:rPr>
+              <w:t>96</w:t>
+            </w:r>
+          </w:p>
+        </w:tc>
+        <w:tc>
+          <w:tcPr>
+            <w:tcW w:type="dxa" w:w="943"/>
+          </w:tcPr>
+          <w:p>
+            <w:r>
+              <w:rPr>
+                <w:rFonts w:ascii="Arial" w:hAnsi="Arial"/>
+                <w:sz w:val="12"/>
+              </w:rPr>
+              <w:t>64</w:t>
+            </w:r>
+          </w:p>
+        </w:tc>
+        <w:tc>
+          <w:tcPr>
+            <w:tcW w:type="dxa" w:w="943"/>
+          </w:tcPr>
+          <w:p>
+            <w:r>
+              <w:rPr>
+                <w:rFonts w:ascii="Arial" w:hAnsi="Arial"/>
+                <w:sz w:val="12"/>
+              </w:rPr>
+              <w:t>6144</w:t>
+            </w:r>
+          </w:p>
+        </w:tc>
+        <w:tc>
+          <w:tcPr>
+            <w:tcW w:type="dxa" w:w="943"/>
+          </w:tcPr>
+          <w:p>
+            <w:r>
+              <w:rPr>
+                <w:rFonts w:ascii="Arial" w:hAnsi="Arial"/>
+                <w:sz w:val="12"/>
+              </w:rPr>
+              <w:t>4</w:t>
+            </w:r>
+          </w:p>
+        </w:tc>
+        <w:tc>
+          <w:tcPr>
+            <w:tcW w:type="dxa" w:w="943"/>
+          </w:tcPr>
+          <w:p>
+            <w:r>
+              <w:rPr>
+                <w:rFonts w:ascii="Arial" w:hAnsi="Arial"/>
+                <w:sz w:val="12"/>
+              </w:rPr>
+              <w:t>0.2167</w:t>
+            </w:r>
+          </w:p>
+        </w:tc>
+        <w:tc>
+          <w:tcPr>
+            <w:tcW w:type="dxa" w:w="943"/>
+          </w:tcPr>
+          <w:p>
+            <w:r>
+              <w:rPr>
+                <w:rFonts w:ascii="Arial" w:hAnsi="Arial"/>
+                <w:sz w:val="12"/>
+              </w:rPr>
+              <w:t>0.2167</w:t>
+            </w:r>
+          </w:p>
+        </w:tc>
+        <w:tc>
+          <w:tcPr>
+            <w:tcW w:type="dxa" w:w="943"/>
+          </w:tcPr>
+          <w:p>
+            <w:r>
+              <w:rPr>
+                <w:rFonts w:ascii="Arial" w:hAnsi="Arial"/>
+                <w:sz w:val="12"/>
+              </w:rPr>
+              <w:t>0.2064</w:t>
+            </w:r>
+          </w:p>
+        </w:tc>
+        <w:tc>
+          <w:tcPr>
+            <w:tcW w:type="dxa" w:w="943"/>
           </w:tcPr>
           <w:p>
             <w:r>
@@ -4233,7 +5925,7 @@
         <w:spacing w:after="120"/>
       </w:pPr>
       <w:r>
-        <w:t>CREMA-D’de 64-kare resize macro-F1=0.4667 ile 64-kare crop-pad referansını (0.4645) geçti. MELD’de ise 64-kare crop-pad 0.2525 ile resize ve 96-kare seçeneklerinden daha iyi kaldı. Bu nedenle veri kümelerine aynı zaman işlemi zorlanmamış; CREMA-D resize, MELD crop-pad kullanmıştır.</w:t>
+        <w:t>CREMA-D için 96×64 crop-pad macro-F1=0.4707 ile birinci olmuştur. Ana 4096-boyutlu temsile göre tek-seed fark +0.0040 olmuştur. MELD için 64×64 crop-pad macro-F1=0.2525 ile birinci olmuştur. Ana 4096-boyutlu temsil liderliğini korumuştur. Genişletilmiş aday tek seed ile ve yalnız validation katında değerlendirildiğinden, küçük fark nihai checkpoint’i test sonucuna göre geriye dönük değiştirmek için kullanılmamış; çoklu-seed doğrulama adayı olarak kaydedilmiştir.</w:t>
       </w:r>
     </w:p>
     <w:p>
@@ -29887,6 +31579,450 @@
       </w:r>
     </w:p>
     <w:p>
+      <w:pPr>
+        <w:pStyle w:val="Heading2"/>
+      </w:pPr>
+      <w:r>
+        <w:t>Held-out Test Olasılık Kalibrasyonu</w:t>
+      </w:r>
+    </w:p>
+    <w:p>
+      <w:r>
+        <w:rPr>
+          <w:b/>
+        </w:rPr>
+        <w:t>Nihai MLP test olasılıklarının kalibrasyon sonuçları</w:t>
+      </w:r>
+    </w:p>
+    <w:tbl>
+      <w:tblPr>
+        <w:tblStyle w:val="TableGrid"/>
+        <w:tblW w:type="auto" w:w="0"/>
+        <w:tblLook w:firstColumn="1" w:firstRow="1" w:lastColumn="0" w:lastRow="0" w:noHBand="0" w:noVBand="1" w:val="04A0"/>
+      </w:tblPr>
+      <w:tblGrid>
+        <w:gridCol w:w="1152"/>
+        <w:gridCol w:w="1152"/>
+        <w:gridCol w:w="1152"/>
+        <w:gridCol w:w="1152"/>
+        <w:gridCol w:w="1152"/>
+        <w:gridCol w:w="1152"/>
+        <w:gridCol w:w="1152"/>
+        <w:gridCol w:w="1152"/>
+        <w:gridCol w:w="1152"/>
+      </w:tblGrid>
+      <w:tr>
+        <w:tc>
+          <w:tcPr>
+            <w:tcW w:type="dxa" w:w="1152"/>
+          </w:tcPr>
+          <w:p>
+            <w:r>
+              <w:rPr>
+                <w:rFonts w:ascii="Arial" w:hAnsi="Arial"/>
+                <w:b/>
+                <w:sz w:val="16"/>
+              </w:rPr>
+              <w:t>Veri seti</w:t>
+            </w:r>
+          </w:p>
+        </w:tc>
+        <w:tc>
+          <w:tcPr>
+            <w:tcW w:type="dxa" w:w="1152"/>
+          </w:tcPr>
+          <w:p>
+            <w:r>
+              <w:rPr>
+                <w:rFonts w:ascii="Arial" w:hAnsi="Arial"/>
+                <w:b/>
+                <w:sz w:val="16"/>
+              </w:rPr>
+              <w:t>Bin</w:t>
+            </w:r>
+          </w:p>
+        </w:tc>
+        <w:tc>
+          <w:tcPr>
+            <w:tcW w:type="dxa" w:w="1152"/>
+          </w:tcPr>
+          <w:p>
+            <w:r>
+              <w:rPr>
+                <w:rFonts w:ascii="Arial" w:hAnsi="Arial"/>
+                <w:b/>
+                <w:sz w:val="16"/>
+              </w:rPr>
+              <w:t>NLL</w:t>
+            </w:r>
+          </w:p>
+        </w:tc>
+        <w:tc>
+          <w:tcPr>
+            <w:tcW w:type="dxa" w:w="1152"/>
+          </w:tcPr>
+          <w:p>
+            <w:r>
+              <w:rPr>
+                <w:rFonts w:ascii="Arial" w:hAnsi="Arial"/>
+                <w:b/>
+                <w:sz w:val="16"/>
+              </w:rPr>
+              <w:t>Brier</w:t>
+            </w:r>
+          </w:p>
+        </w:tc>
+        <w:tc>
+          <w:tcPr>
+            <w:tcW w:type="dxa" w:w="1152"/>
+          </w:tcPr>
+          <w:p>
+            <w:r>
+              <w:rPr>
+                <w:rFonts w:ascii="Arial" w:hAnsi="Arial"/>
+                <w:b/>
+                <w:sz w:val="16"/>
+              </w:rPr>
+              <w:t>ECE</w:t>
+            </w:r>
+          </w:p>
+        </w:tc>
+        <w:tc>
+          <w:tcPr>
+            <w:tcW w:type="dxa" w:w="1152"/>
+          </w:tcPr>
+          <w:p>
+            <w:r>
+              <w:rPr>
+                <w:rFonts w:ascii="Arial" w:hAnsi="Arial"/>
+                <w:b/>
+                <w:sz w:val="16"/>
+              </w:rPr>
+              <w:t>Maks. CE</w:t>
+            </w:r>
+          </w:p>
+        </w:tc>
+        <w:tc>
+          <w:tcPr>
+            <w:tcW w:type="dxa" w:w="1152"/>
+          </w:tcPr>
+          <w:p>
+            <w:r>
+              <w:rPr>
+                <w:rFonts w:ascii="Arial" w:hAnsi="Arial"/>
+                <w:b/>
+                <w:sz w:val="16"/>
+              </w:rPr>
+              <w:t>Ort. güven</w:t>
+            </w:r>
+          </w:p>
+        </w:tc>
+        <w:tc>
+          <w:tcPr>
+            <w:tcW w:type="dxa" w:w="1152"/>
+          </w:tcPr>
+          <w:p>
+            <w:r>
+              <w:rPr>
+                <w:rFonts w:ascii="Arial" w:hAnsi="Arial"/>
+                <w:b/>
+                <w:sz w:val="16"/>
+              </w:rPr>
+              <w:t>Doğ.</w:t>
+            </w:r>
+          </w:p>
+        </w:tc>
+        <w:tc>
+          <w:tcPr>
+            <w:tcW w:type="dxa" w:w="1152"/>
+          </w:tcPr>
+          <w:p>
+            <w:r>
+              <w:rPr>
+                <w:rFonts w:ascii="Arial" w:hAnsi="Arial"/>
+                <w:b/>
+                <w:sz w:val="16"/>
+              </w:rPr>
+              <w:t>Güven−doğ.</w:t>
+            </w:r>
+          </w:p>
+        </w:tc>
+      </w:tr>
+      <w:tr>
+        <w:tc>
+          <w:tcPr>
+            <w:tcW w:type="dxa" w:w="1152"/>
+          </w:tcPr>
+          <w:p>
+            <w:r>
+              <w:rPr>
+                <w:rFonts w:ascii="Arial" w:hAnsi="Arial"/>
+                <w:sz w:val="16"/>
+              </w:rPr>
+              <w:t>CREMA-D</w:t>
+            </w:r>
+          </w:p>
+        </w:tc>
+        <w:tc>
+          <w:tcPr>
+            <w:tcW w:type="dxa" w:w="1152"/>
+          </w:tcPr>
+          <w:p>
+            <w:r>
+              <w:rPr>
+                <w:rFonts w:ascii="Arial" w:hAnsi="Arial"/>
+                <w:sz w:val="16"/>
+              </w:rPr>
+              <w:t>10</w:t>
+            </w:r>
+          </w:p>
+        </w:tc>
+        <w:tc>
+          <w:tcPr>
+            <w:tcW w:type="dxa" w:w="1152"/>
+          </w:tcPr>
+          <w:p>
+            <w:r>
+              <w:rPr>
+                <w:rFonts w:ascii="Arial" w:hAnsi="Arial"/>
+                <w:sz w:val="16"/>
+              </w:rPr>
+              <w:t>1.7791</w:t>
+            </w:r>
+          </w:p>
+        </w:tc>
+        <w:tc>
+          <w:tcPr>
+            <w:tcW w:type="dxa" w:w="1152"/>
+          </w:tcPr>
+          <w:p>
+            <w:r>
+              <w:rPr>
+                <w:rFonts w:ascii="Arial" w:hAnsi="Arial"/>
+                <w:sz w:val="16"/>
+              </w:rPr>
+              <w:t>0.7787</w:t>
+            </w:r>
+          </w:p>
+        </w:tc>
+        <w:tc>
+          <w:tcPr>
+            <w:tcW w:type="dxa" w:w="1152"/>
+          </w:tcPr>
+          <w:p>
+            <w:r>
+              <w:rPr>
+                <w:rFonts w:ascii="Arial" w:hAnsi="Arial"/>
+                <w:sz w:val="16"/>
+              </w:rPr>
+              <w:t>0.2455</w:t>
+            </w:r>
+          </w:p>
+        </w:tc>
+        <w:tc>
+          <w:tcPr>
+            <w:tcW w:type="dxa" w:w="1152"/>
+          </w:tcPr>
+          <w:p>
+            <w:r>
+              <w:rPr>
+                <w:rFonts w:ascii="Arial" w:hAnsi="Arial"/>
+                <w:sz w:val="16"/>
+              </w:rPr>
+              <w:t>0.3751</w:t>
+            </w:r>
+          </w:p>
+        </w:tc>
+        <w:tc>
+          <w:tcPr>
+            <w:tcW w:type="dxa" w:w="1152"/>
+          </w:tcPr>
+          <w:p>
+            <w:r>
+              <w:rPr>
+                <w:rFonts w:ascii="Arial" w:hAnsi="Arial"/>
+                <w:sz w:val="16"/>
+              </w:rPr>
+              <w:t>0.6879</w:t>
+            </w:r>
+          </w:p>
+        </w:tc>
+        <w:tc>
+          <w:tcPr>
+            <w:tcW w:type="dxa" w:w="1152"/>
+          </w:tcPr>
+          <w:p>
+            <w:r>
+              <w:rPr>
+                <w:rFonts w:ascii="Arial" w:hAnsi="Arial"/>
+                <w:sz w:val="16"/>
+              </w:rPr>
+              <w:t>0.4424</w:t>
+            </w:r>
+          </w:p>
+        </w:tc>
+        <w:tc>
+          <w:tcPr>
+            <w:tcW w:type="dxa" w:w="1152"/>
+          </w:tcPr>
+          <w:p>
+            <w:r>
+              <w:rPr>
+                <w:rFonts w:ascii="Arial" w:hAnsi="Arial"/>
+                <w:sz w:val="16"/>
+              </w:rPr>
+              <w:t>0.2455</w:t>
+            </w:r>
+          </w:p>
+        </w:tc>
+      </w:tr>
+      <w:tr>
+        <w:tc>
+          <w:tcPr>
+            <w:tcW w:type="dxa" w:w="1152"/>
+          </w:tcPr>
+          <w:p>
+            <w:r>
+              <w:rPr>
+                <w:rFonts w:ascii="Arial" w:hAnsi="Arial"/>
+                <w:sz w:val="16"/>
+              </w:rPr>
+              <w:t>MELD</w:t>
+            </w:r>
+          </w:p>
+        </w:tc>
+        <w:tc>
+          <w:tcPr>
+            <w:tcW w:type="dxa" w:w="1152"/>
+          </w:tcPr>
+          <w:p>
+            <w:r>
+              <w:rPr>
+                <w:rFonts w:ascii="Arial" w:hAnsi="Arial"/>
+                <w:sz w:val="16"/>
+              </w:rPr>
+              <w:t>10</w:t>
+            </w:r>
+          </w:p>
+        </w:tc>
+        <w:tc>
+          <w:tcPr>
+            <w:tcW w:type="dxa" w:w="1152"/>
+          </w:tcPr>
+          <w:p>
+            <w:r>
+              <w:rPr>
+                <w:rFonts w:ascii="Arial" w:hAnsi="Arial"/>
+                <w:sz w:val="16"/>
+              </w:rPr>
+              <w:t>1.8767</w:t>
+            </w:r>
+          </w:p>
+        </w:tc>
+        <w:tc>
+          <w:tcPr>
+            <w:tcW w:type="dxa" w:w="1152"/>
+          </w:tcPr>
+          <w:p>
+            <w:r>
+              <w:rPr>
+                <w:rFonts w:ascii="Arial" w:hAnsi="Arial"/>
+                <w:sz w:val="16"/>
+              </w:rPr>
+              <w:t>0.8597</w:t>
+            </w:r>
+          </w:p>
+        </w:tc>
+        <w:tc>
+          <w:tcPr>
+            <w:tcW w:type="dxa" w:w="1152"/>
+          </w:tcPr>
+          <w:p>
+            <w:r>
+              <w:rPr>
+                <w:rFonts w:ascii="Arial" w:hAnsi="Arial"/>
+                <w:sz w:val="16"/>
+              </w:rPr>
+              <w:t>0.1049</w:t>
+            </w:r>
+          </w:p>
+        </w:tc>
+        <w:tc>
+          <w:tcPr>
+            <w:tcW w:type="dxa" w:w="1152"/>
+          </w:tcPr>
+          <w:p>
+            <w:r>
+              <w:rPr>
+                <w:rFonts w:ascii="Arial" w:hAnsi="Arial"/>
+                <w:sz w:val="16"/>
+              </w:rPr>
+              <w:t>0.5368</w:t>
+            </w:r>
+          </w:p>
+        </w:tc>
+        <w:tc>
+          <w:tcPr>
+            <w:tcW w:type="dxa" w:w="1152"/>
+          </w:tcPr>
+          <w:p>
+            <w:r>
+              <w:rPr>
+                <w:rFonts w:ascii="Arial" w:hAnsi="Arial"/>
+                <w:sz w:val="16"/>
+              </w:rPr>
+              <w:t>0.2956</w:t>
+            </w:r>
+          </w:p>
+        </w:tc>
+        <w:tc>
+          <w:tcPr>
+            <w:tcW w:type="dxa" w:w="1152"/>
+          </w:tcPr>
+          <w:p>
+            <w:r>
+              <w:rPr>
+                <w:rFonts w:ascii="Arial" w:hAnsi="Arial"/>
+                <w:sz w:val="16"/>
+              </w:rPr>
+              <w:t>0.1907</w:t>
+            </w:r>
+          </w:p>
+        </w:tc>
+        <w:tc>
+          <w:tcPr>
+            <w:tcW w:type="dxa" w:w="1152"/>
+          </w:tcPr>
+          <w:p>
+            <w:r>
+              <w:rPr>
+                <w:rFonts w:ascii="Arial" w:hAnsi="Arial"/>
+                <w:sz w:val="16"/>
+              </w:rPr>
+              <w:t>0.1049</w:t>
+            </w:r>
+          </w:p>
+        </w:tc>
+      </w:tr>
+    </w:tbl>
+    <w:p/>
+    <w:p>
+      <w:pPr>
+        <w:spacing w:after="120"/>
+      </w:pPr>
+      <w:r>
+        <w:t>CREMA-D modelinin ortalama güveni 0.6879, doğruluğu 0.4424 ve farkı +0.2455 olduğundan model aşırı güvenlidir; ECE=0.2455 olarak ölçülmüştür. MELD modelinin ortalama güveni 0.2956, doğruluğu 0.1907 ve farkı +0.1049 olduğundan model aşırı güvenlidir; ECE=0.1049 olarak ölçülmüştür.</w:t>
+      </w:r>
+    </w:p>
+    <w:p>
+      <w:pPr>
+        <w:spacing w:after="120"/>
+      </w:pPr>
+      <w:r>
+        <w:t>Kalibrasyon, model ve hiperparametre seçimi tamamlandıktan sonra kaydedilen held-out test olasılıklarında hesaplanmıştır. ECE, en yüksek sınıf olasılığına göre 10 eşit genişlikli bin kullanır. Temperature scaling gibi test sonucuna göre sonradan olasılık düzeltmesi uygulanmamıştır.</w:t>
+      </w:r>
+    </w:p>
+    <w:p>
       <w:r>
         <w:rPr>
           <w:b/>
@@ -32469,7 +34605,7 @@
         <w:spacing w:after="120"/>
       </w:pPr>
       <w:r>
-        <w:t>Bu aşamada 2 veri kümesi için toplam 64 hiperparametre/seed koşusu ve sekiz özellik ablation koşusu tamamlanmıştır. Her veri kümesi için bağımsız, sıfırdan PyTorch MLP modeli; train-only normalizasyon; sınıf ağırlıklı kayıp; erken durdurma; kaydedilmiş checkpoint; test tahminleri ve karmaşıklık matrisi üretilmiştir.</w:t>
+        <w:t>Bu aşamada 2 veri kümesi için toplam 64 hiperparametre/seed koşusu ve 16 özellik ablation koşusu tamamlanmıştır. Her veri kümesi için bağımsız, sıfırdan PyTorch MLP modeli; train-only normalizasyon; sınıf ağırlıklı kayıp; erken durdurma; kaydedilmiş checkpoint; test tahminleri, karmaşıklık matrisi, bootstrap belirsizliği ve kalibrasyon özeti üretilmiştir.</w:t>
       </w:r>
     </w:p>
     <w:p>
@@ -32509,6 +34645,14 @@
         <w:pStyle w:val="ListBullet"/>
       </w:pPr>
       <w:r>
+        <w:t>CREMA-D’de 96×64 crop-pad adayının küçük validation kazancının çoklu seed koşularıyla doğrulanması.</w:t>
+      </w:r>
+    </w:p>
+    <w:p>
+      <w:pPr>
+        <w:pStyle w:val="ListBullet"/>
+      </w:pPr>
+      <w:r>
         <w:t>MELD için sonraki proje aşamalarında konuşma bağlamı ve metin bilgisinin, ödev kısıtlarına uygun ayrı bir deney olarak değerlendirilmesi.</w:t>
       </w:r>
     </w:p>
@@ -32517,7 +34661,15 @@
         <w:pStyle w:val="ListBullet"/>
       </w:pPr>
       <w:r>
-        <w:t>Model kalibrasyonu, hata örneklerinin konuşmacı ve süre bazında incelenmesi ve sınıf bazlı veri artırımı.</w:t>
+        <w:t>Aşırı güveni azaltmak için yalnız validation logitlerinde öğrenilen temperature scaling ve güvenilirlik diyagramı denenmesi.</w:t>
+      </w:r>
+    </w:p>
+    <w:p>
+      <w:pPr>
+        <w:pStyle w:val="ListBullet"/>
+      </w:pPr>
+      <w:r>
+        <w:t>Hata örneklerinin konuşmacı ve süre bazında incelenmesi ve sınıf bazlı veri artırımı.</w:t>
       </w:r>
     </w:p>
     <w:p>
@@ -32934,6 +35086,50 @@
                 <w:sz w:val="16"/>
               </w:rPr>
               <w:t>test_predictions.csv ve PNG</w:t>
+            </w:r>
+          </w:p>
+        </w:tc>
+      </w:tr>
+      <w:tr>
+        <w:tc>
+          <w:tcPr>
+            <w:tcW w:type="dxa" w:w="3456"/>
+          </w:tcPr>
+          <w:p>
+            <w:r>
+              <w:rPr>
+                <w:rFonts w:ascii="Arial" w:hAnsi="Arial"/>
+                <w:sz w:val="16"/>
+              </w:rPr>
+              <w:t>Test belirsizliği ve kalibrasyonu raporlandı</w:t>
+            </w:r>
+          </w:p>
+        </w:tc>
+        <w:tc>
+          <w:tcPr>
+            <w:tcW w:type="dxa" w:w="3456"/>
+          </w:tcPr>
+          <w:p>
+            <w:r>
+              <w:rPr>
+                <w:rFonts w:ascii="Arial" w:hAnsi="Arial"/>
+                <w:sz w:val="16"/>
+              </w:rPr>
+              <w:t>Evet</w:t>
+            </w:r>
+          </w:p>
+        </w:tc>
+        <w:tc>
+          <w:tcPr>
+            <w:tcW w:type="dxa" w:w="3456"/>
+          </w:tcPr>
+          <w:p>
+            <w:r>
+              <w:rPr>
+                <w:rFonts w:ascii="Arial" w:hAnsi="Arial"/>
+                <w:sz w:val="16"/>
+              </w:rPr>
+              <w:t>test_uncertainty.json ve test_calibration.json</w:t>
             </w:r>
           </w:p>
         </w:tc>

</xml_diff>

<commit_message>
Add validation-fitted temperature calibration
</commit_message>
<xml_diff>
--- a/odev3/PROJE_ILERLEME_RAPORU_3.docx
+++ b/odev3/PROJE_ILERLEME_RAPORU_3.docx
@@ -548,7 +548,7 @@
                 <w:rFonts w:ascii="Arial" w:hAnsi="Arial"/>
                 <w:sz w:val="16"/>
               </w:rPr>
-              <w:t>Test olasılıklarından NLL, Brier, ECE ve güven aralığı özetlerini üretir.</w:t>
+              <w:t>NLL, Brier ve ECE ölçer; validation olasılıklarında sıcaklık katsayısını öğrenip olasılıkları ölçekler.</w:t>
             </w:r>
           </w:p>
         </w:tc>
@@ -638,7 +638,7 @@
                 <w:rFonts w:ascii="Arial" w:hAnsi="Arial"/>
                 <w:sz w:val="16"/>
               </w:rPr>
-              <w:t>Speaker-independent bölmeleri, resume durumunu, model kaydını, tahminleri, belirsizliği ve kalibrasyonu yönetir.</w:t>
+              <w:t>Speaker-independent bölmeleri, resume durumunu, model kaydını, tahminleri, belirsizliği ve validation-temelli kalibrasyonu yönetir.</w:t>
             </w:r>
           </w:p>
         </w:tc>
@@ -1017,7 +1017,7 @@
                 <w:rFonts w:ascii="Arial" w:hAnsi="Arial"/>
                 <w:sz w:val="16"/>
               </w:rPr>
-              <w:t>Hazır (46.5 KB)</w:t>
+              <w:t>Hazır (90.1 KB)</w:t>
             </w:r>
           </w:p>
         </w:tc>
@@ -1119,7 +1119,7 @@
                 <w:rFonts w:ascii="Arial" w:hAnsi="Arial"/>
                 <w:sz w:val="16"/>
               </w:rPr>
-              <w:t>NLL, Brier, ECE ve güven aralığı kalibrasyon özeti</w:t>
+              <w:t>Ham test olasılıklarının NLL, Brier ve ECE özeti</w:t>
             </w:r>
           </w:p>
         </w:tc>
@@ -1163,7 +1163,7 @@
                 <w:rFonts w:ascii="Arial" w:hAnsi="Arial"/>
                 <w:sz w:val="16"/>
               </w:rPr>
-              <w:t>odev3/outputs/cremad/test_confusion_matrix.png</w:t>
+              <w:t>odev3/outputs/cremad/temperature_scaling.json</w:t>
             </w:r>
           </w:p>
         </w:tc>
@@ -1177,7 +1177,7 @@
                 <w:rFonts w:ascii="Arial" w:hAnsi="Arial"/>
                 <w:sz w:val="16"/>
               </w:rPr>
-              <w:t>Normalize test karmaşıklık matrisi</w:t>
+              <w:t>Validation’da öğrenilen sıcaklık ile ham/ölçekli karşılaştırma</w:t>
             </w:r>
           </w:p>
         </w:tc>
@@ -1191,7 +1191,7 @@
                 <w:rFonts w:ascii="Arial" w:hAnsi="Arial"/>
                 <w:sz w:val="16"/>
               </w:rPr>
-              <w:t>Hazır (81.1 KB)</w:t>
+              <w:t>Hazır (14.2 KB)</w:t>
             </w:r>
           </w:p>
         </w:tc>
@@ -1221,7 +1221,7 @@
                 <w:rFonts w:ascii="Arial" w:hAnsi="Arial"/>
                 <w:sz w:val="16"/>
               </w:rPr>
-              <w:t>odev3/outputs/cremad/result.json</w:t>
+              <w:t>odev3/outputs/cremad/test_confusion_matrix.png</w:t>
             </w:r>
           </w:p>
         </w:tc>
@@ -1235,7 +1235,7 @@
                 <w:rFonts w:ascii="Arial" w:hAnsi="Arial"/>
                 <w:sz w:val="16"/>
               </w:rPr>
-              <w:t>Bölme, yöntem, model ve metrik özeti</w:t>
+              <w:t>Normalize test karmaşıklık matrisi</w:t>
             </w:r>
           </w:p>
         </w:tc>
@@ -1249,7 +1249,7 @@
                 <w:rFonts w:ascii="Arial" w:hAnsi="Arial"/>
                 <w:sz w:val="16"/>
               </w:rPr>
-              <w:t>Hazır (11.4 KB)</w:t>
+              <w:t>Hazır (81.1 KB)</w:t>
             </w:r>
           </w:p>
         </w:tc>
@@ -1265,7 +1265,7 @@
                 <w:rFonts w:ascii="Arial" w:hAnsi="Arial"/>
                 <w:sz w:val="16"/>
               </w:rPr>
-              <w:t>MELD</w:t>
+              <w:t>CREMA-D</w:t>
             </w:r>
           </w:p>
         </w:tc>
@@ -1279,7 +1279,7 @@
                 <w:rFonts w:ascii="Arial" w:hAnsi="Arial"/>
                 <w:sz w:val="16"/>
               </w:rPr>
-              <w:t>odev3/outputs/meld/best_model.pt</w:t>
+              <w:t>odev3/outputs/cremad/test_reliability_diagram.png</w:t>
             </w:r>
           </w:p>
         </w:tc>
@@ -1293,7 +1293,7 @@
                 <w:rFonts w:ascii="Arial" w:hAnsi="Arial"/>
                 <w:sz w:val="16"/>
               </w:rPr>
-              <w:t>En iyi MLP, normalizasyon ve sınıf ağırlıkları</w:t>
+              <w:t>Ham ve ölçekli test güvenilirlik diyagramı</w:t>
             </w:r>
           </w:p>
         </w:tc>
@@ -1307,7 +1307,7 @@
                 <w:rFonts w:ascii="Arial" w:hAnsi="Arial"/>
                 <w:sz w:val="16"/>
               </w:rPr>
-              <w:t>Hazır (8.6 MB)</w:t>
+              <w:t>Hazır (0.1 MB)</w:t>
             </w:r>
           </w:p>
         </w:tc>
@@ -1323,7 +1323,7 @@
                 <w:rFonts w:ascii="Arial" w:hAnsi="Arial"/>
                 <w:sz w:val="16"/>
               </w:rPr>
-              <w:t>MELD</w:t>
+              <w:t>CREMA-D</w:t>
             </w:r>
           </w:p>
         </w:tc>
@@ -1337,7 +1337,7 @@
                 <w:rFonts w:ascii="Arial" w:hAnsi="Arial"/>
                 <w:sz w:val="16"/>
               </w:rPr>
-              <w:t>odev3/outputs/meld/validation_results.csv</w:t>
+              <w:t>odev3/outputs/cremad/result.json</w:t>
             </w:r>
           </w:p>
         </w:tc>
@@ -1351,7 +1351,7 @@
                 <w:rFonts w:ascii="Arial" w:hAnsi="Arial"/>
                 <w:sz w:val="16"/>
               </w:rPr>
-              <w:t>32 geçerleme deneyinin tam tablosu</w:t>
+              <w:t>Bölme, yöntem, model ve metrik özeti</w:t>
             </w:r>
           </w:p>
         </w:tc>
@@ -1365,7 +1365,7 @@
                 <w:rFonts w:ascii="Arial" w:hAnsi="Arial"/>
                 <w:sz w:val="16"/>
               </w:rPr>
-              <w:t>Hazır (7.0 KB)</w:t>
+              <w:t>Hazır (26.7 KB)</w:t>
             </w:r>
           </w:p>
         </w:tc>
@@ -1395,7 +1395,7 @@
                 <w:rFonts w:ascii="Arial" w:hAnsi="Arial"/>
                 <w:sz w:val="16"/>
               </w:rPr>
-              <w:t>odev3/outputs/meld/best_training_history.csv</w:t>
+              <w:t>odev3/outputs/meld/best_model.pt</w:t>
             </w:r>
           </w:p>
         </w:tc>
@@ -1409,7 +1409,7 @@
                 <w:rFonts w:ascii="Arial" w:hAnsi="Arial"/>
                 <w:sz w:val="16"/>
               </w:rPr>
-              <w:t>Seçilen koşunun epoch geçmişi</w:t>
+              <w:t>En iyi MLP, normalizasyon ve sınıf ağırlıkları</w:t>
             </w:r>
           </w:p>
         </w:tc>
@@ -1423,7 +1423,7 @@
                 <w:rFonts w:ascii="Arial" w:hAnsi="Arial"/>
                 <w:sz w:val="16"/>
               </w:rPr>
-              <w:t>Hazır (2.3 KB)</w:t>
+              <w:t>Hazır (8.6 MB)</w:t>
             </w:r>
           </w:p>
         </w:tc>
@@ -1453,7 +1453,7 @@
                 <w:rFonts w:ascii="Arial" w:hAnsi="Arial"/>
                 <w:sz w:val="16"/>
               </w:rPr>
-              <w:t>odev3/outputs/meld/test_predictions.csv</w:t>
+              <w:t>odev3/outputs/meld/validation_results.csv</w:t>
             </w:r>
           </w:p>
         </w:tc>
@@ -1467,7 +1467,7 @@
                 <w:rFonts w:ascii="Arial" w:hAnsi="Arial"/>
                 <w:sz w:val="16"/>
               </w:rPr>
-              <w:t>Test örneği tahmin ve olasılıkları</w:t>
+              <w:t>32 geçerleme deneyinin tam tablosu</w:t>
             </w:r>
           </w:p>
         </w:tc>
@@ -1481,7 +1481,7 @@
                 <w:rFonts w:ascii="Arial" w:hAnsi="Arial"/>
                 <w:sz w:val="16"/>
               </w:rPr>
-              <w:t>Hazır (61.1 KB)</w:t>
+              <w:t>Hazır (7.0 KB)</w:t>
             </w:r>
           </w:p>
         </w:tc>
@@ -1511,7 +1511,7 @@
                 <w:rFonts w:ascii="Arial" w:hAnsi="Arial"/>
                 <w:sz w:val="16"/>
               </w:rPr>
-              <w:t>odev3/outputs/meld/test_uncertainty.json</w:t>
+              <w:t>odev3/outputs/meld/best_training_history.csv</w:t>
             </w:r>
           </w:p>
         </w:tc>
@@ -1525,7 +1525,7 @@
                 <w:rFonts w:ascii="Arial" w:hAnsi="Arial"/>
                 <w:sz w:val="16"/>
               </w:rPr>
-              <w:t>Test metriklerinin %95 bootstrap güven aralıkları</w:t>
+              <w:t>Seçilen koşunun epoch geçmişi</w:t>
             </w:r>
           </w:p>
         </w:tc>
@@ -1539,7 +1539,7 @@
                 <w:rFonts w:ascii="Arial" w:hAnsi="Arial"/>
                 <w:sz w:val="16"/>
               </w:rPr>
-              <w:t>Hazır (0.8 KB)</w:t>
+              <w:t>Hazır (2.3 KB)</w:t>
             </w:r>
           </w:p>
         </w:tc>
@@ -1569,7 +1569,7 @@
                 <w:rFonts w:ascii="Arial" w:hAnsi="Arial"/>
                 <w:sz w:val="16"/>
               </w:rPr>
-              <w:t>odev3/outputs/meld/test_calibration.json</w:t>
+              <w:t>odev3/outputs/meld/test_predictions.csv</w:t>
             </w:r>
           </w:p>
         </w:tc>
@@ -1583,7 +1583,7 @@
                 <w:rFonts w:ascii="Arial" w:hAnsi="Arial"/>
                 <w:sz w:val="16"/>
               </w:rPr>
-              <w:t>NLL, Brier, ECE ve güven aralığı kalibrasyon özeti</w:t>
+              <w:t>Test örneği tahmin ve olasılıkları</w:t>
             </w:r>
           </w:p>
         </w:tc>
@@ -1597,7 +1597,7 @@
                 <w:rFonts w:ascii="Arial" w:hAnsi="Arial"/>
                 <w:sz w:val="16"/>
               </w:rPr>
-              <w:t>Hazır (2.8 KB)</w:t>
+              <w:t>Hazır (0.1 MB)</w:t>
             </w:r>
           </w:p>
         </w:tc>
@@ -1627,7 +1627,7 @@
                 <w:rFonts w:ascii="Arial" w:hAnsi="Arial"/>
                 <w:sz w:val="16"/>
               </w:rPr>
-              <w:t>odev3/outputs/meld/test_confusion_matrix.png</w:t>
+              <w:t>odev3/outputs/meld/test_uncertainty.json</w:t>
             </w:r>
           </w:p>
         </w:tc>
@@ -1641,7 +1641,7 @@
                 <w:rFonts w:ascii="Arial" w:hAnsi="Arial"/>
                 <w:sz w:val="16"/>
               </w:rPr>
-              <w:t>Normalize test karmaşıklık matrisi</w:t>
+              <w:t>Test metriklerinin %95 bootstrap güven aralıkları</w:t>
             </w:r>
           </w:p>
         </w:tc>
@@ -1655,7 +1655,7 @@
                 <w:rFonts w:ascii="Arial" w:hAnsi="Arial"/>
                 <w:sz w:val="16"/>
               </w:rPr>
-              <w:t>Hazır (79.0 KB)</w:t>
+              <w:t>Hazır (0.8 KB)</w:t>
             </w:r>
           </w:p>
         </w:tc>
@@ -1685,6 +1685,238 @@
                 <w:rFonts w:ascii="Arial" w:hAnsi="Arial"/>
                 <w:sz w:val="16"/>
               </w:rPr>
+              <w:t>odev3/outputs/meld/test_calibration.json</w:t>
+            </w:r>
+          </w:p>
+        </w:tc>
+        <w:tc>
+          <w:tcPr>
+            <w:tcW w:type="dxa" w:w="2592"/>
+          </w:tcPr>
+          <w:p>
+            <w:r>
+              <w:rPr>
+                <w:rFonts w:ascii="Arial" w:hAnsi="Arial"/>
+                <w:sz w:val="16"/>
+              </w:rPr>
+              <w:t>Ham test olasılıklarının NLL, Brier ve ECE özeti</w:t>
+            </w:r>
+          </w:p>
+        </w:tc>
+        <w:tc>
+          <w:tcPr>
+            <w:tcW w:type="dxa" w:w="2592"/>
+          </w:tcPr>
+          <w:p>
+            <w:r>
+              <w:rPr>
+                <w:rFonts w:ascii="Arial" w:hAnsi="Arial"/>
+                <w:sz w:val="16"/>
+              </w:rPr>
+              <w:t>Hazır (2.8 KB)</w:t>
+            </w:r>
+          </w:p>
+        </w:tc>
+      </w:tr>
+      <w:tr>
+        <w:tc>
+          <w:tcPr>
+            <w:tcW w:type="dxa" w:w="2592"/>
+          </w:tcPr>
+          <w:p>
+            <w:r>
+              <w:rPr>
+                <w:rFonts w:ascii="Arial" w:hAnsi="Arial"/>
+                <w:sz w:val="16"/>
+              </w:rPr>
+              <w:t>MELD</w:t>
+            </w:r>
+          </w:p>
+        </w:tc>
+        <w:tc>
+          <w:tcPr>
+            <w:tcW w:type="dxa" w:w="2592"/>
+          </w:tcPr>
+          <w:p>
+            <w:r>
+              <w:rPr>
+                <w:rFonts w:ascii="Arial" w:hAnsi="Arial"/>
+                <w:sz w:val="16"/>
+              </w:rPr>
+              <w:t>odev3/outputs/meld/temperature_scaling.json</w:t>
+            </w:r>
+          </w:p>
+        </w:tc>
+        <w:tc>
+          <w:tcPr>
+            <w:tcW w:type="dxa" w:w="2592"/>
+          </w:tcPr>
+          <w:p>
+            <w:r>
+              <w:rPr>
+                <w:rFonts w:ascii="Arial" w:hAnsi="Arial"/>
+                <w:sz w:val="16"/>
+              </w:rPr>
+              <w:t>Validation’da öğrenilen sıcaklık ile ham/ölçekli karşılaştırma</w:t>
+            </w:r>
+          </w:p>
+        </w:tc>
+        <w:tc>
+          <w:tcPr>
+            <w:tcW w:type="dxa" w:w="2592"/>
+          </w:tcPr>
+          <w:p>
+            <w:r>
+              <w:rPr>
+                <w:rFonts w:ascii="Arial" w:hAnsi="Arial"/>
+                <w:sz w:val="16"/>
+              </w:rPr>
+              <w:t>Hazır (13.3 KB)</w:t>
+            </w:r>
+          </w:p>
+        </w:tc>
+      </w:tr>
+      <w:tr>
+        <w:tc>
+          <w:tcPr>
+            <w:tcW w:type="dxa" w:w="2592"/>
+          </w:tcPr>
+          <w:p>
+            <w:r>
+              <w:rPr>
+                <w:rFonts w:ascii="Arial" w:hAnsi="Arial"/>
+                <w:sz w:val="16"/>
+              </w:rPr>
+              <w:t>MELD</w:t>
+            </w:r>
+          </w:p>
+        </w:tc>
+        <w:tc>
+          <w:tcPr>
+            <w:tcW w:type="dxa" w:w="2592"/>
+          </w:tcPr>
+          <w:p>
+            <w:r>
+              <w:rPr>
+                <w:rFonts w:ascii="Arial" w:hAnsi="Arial"/>
+                <w:sz w:val="16"/>
+              </w:rPr>
+              <w:t>odev3/outputs/meld/test_confusion_matrix.png</w:t>
+            </w:r>
+          </w:p>
+        </w:tc>
+        <w:tc>
+          <w:tcPr>
+            <w:tcW w:type="dxa" w:w="2592"/>
+          </w:tcPr>
+          <w:p>
+            <w:r>
+              <w:rPr>
+                <w:rFonts w:ascii="Arial" w:hAnsi="Arial"/>
+                <w:sz w:val="16"/>
+              </w:rPr>
+              <w:t>Normalize test karmaşıklık matrisi</w:t>
+            </w:r>
+          </w:p>
+        </w:tc>
+        <w:tc>
+          <w:tcPr>
+            <w:tcW w:type="dxa" w:w="2592"/>
+          </w:tcPr>
+          <w:p>
+            <w:r>
+              <w:rPr>
+                <w:rFonts w:ascii="Arial" w:hAnsi="Arial"/>
+                <w:sz w:val="16"/>
+              </w:rPr>
+              <w:t>Hazır (79.0 KB)</w:t>
+            </w:r>
+          </w:p>
+        </w:tc>
+      </w:tr>
+      <w:tr>
+        <w:tc>
+          <w:tcPr>
+            <w:tcW w:type="dxa" w:w="2592"/>
+          </w:tcPr>
+          <w:p>
+            <w:r>
+              <w:rPr>
+                <w:rFonts w:ascii="Arial" w:hAnsi="Arial"/>
+                <w:sz w:val="16"/>
+              </w:rPr>
+              <w:t>MELD</w:t>
+            </w:r>
+          </w:p>
+        </w:tc>
+        <w:tc>
+          <w:tcPr>
+            <w:tcW w:type="dxa" w:w="2592"/>
+          </w:tcPr>
+          <w:p>
+            <w:r>
+              <w:rPr>
+                <w:rFonts w:ascii="Arial" w:hAnsi="Arial"/>
+                <w:sz w:val="16"/>
+              </w:rPr>
+              <w:t>odev3/outputs/meld/test_reliability_diagram.png</w:t>
+            </w:r>
+          </w:p>
+        </w:tc>
+        <w:tc>
+          <w:tcPr>
+            <w:tcW w:type="dxa" w:w="2592"/>
+          </w:tcPr>
+          <w:p>
+            <w:r>
+              <w:rPr>
+                <w:rFonts w:ascii="Arial" w:hAnsi="Arial"/>
+                <w:sz w:val="16"/>
+              </w:rPr>
+              <w:t>Ham ve ölçekli test güvenilirlik diyagramı</w:t>
+            </w:r>
+          </w:p>
+        </w:tc>
+        <w:tc>
+          <w:tcPr>
+            <w:tcW w:type="dxa" w:w="2592"/>
+          </w:tcPr>
+          <w:p>
+            <w:r>
+              <w:rPr>
+                <w:rFonts w:ascii="Arial" w:hAnsi="Arial"/>
+                <w:sz w:val="16"/>
+              </w:rPr>
+              <w:t>Hazır (96.3 KB)</w:t>
+            </w:r>
+          </w:p>
+        </w:tc>
+      </w:tr>
+      <w:tr>
+        <w:tc>
+          <w:tcPr>
+            <w:tcW w:type="dxa" w:w="2592"/>
+          </w:tcPr>
+          <w:p>
+            <w:r>
+              <w:rPr>
+                <w:rFonts w:ascii="Arial" w:hAnsi="Arial"/>
+                <w:sz w:val="16"/>
+              </w:rPr>
+              <w:t>MELD</w:t>
+            </w:r>
+          </w:p>
+        </w:tc>
+        <w:tc>
+          <w:tcPr>
+            <w:tcW w:type="dxa" w:w="2592"/>
+          </w:tcPr>
+          <w:p>
+            <w:r>
+              <w:rPr>
+                <w:rFonts w:ascii="Arial" w:hAnsi="Arial"/>
+                <w:sz w:val="16"/>
+              </w:rPr>
               <w:t>odev3/outputs/meld/result.json</w:t>
             </w:r>
           </w:p>
@@ -1713,7 +1945,7 @@
                 <w:rFonts w:ascii="Arial" w:hAnsi="Arial"/>
                 <w:sz w:val="16"/>
               </w:rPr>
-              <w:t>Hazır (11.2 KB)</w:t>
+              <w:t>Hazır (25.6 KB)</w:t>
             </w:r>
           </w:p>
         </w:tc>
@@ -31591,7 +31823,7 @@
         <w:rPr>
           <w:b/>
         </w:rPr>
-        <w:t>Nihai MLP test olasılıklarının kalibrasyon sonuçları</w:t>
+        <w:t>Validation’da öğrenilen sıcaklıkla olasılık kalibrasyonu</w:t>
       </w:r>
     </w:p>
     <w:tbl>
@@ -31638,7 +31870,7 @@
                 <w:b/>
                 <w:sz w:val="16"/>
               </w:rPr>
-              <w:t>Bin</w:t>
+              <w:t>T</w:t>
             </w:r>
           </w:p>
         </w:tc>
@@ -31653,7 +31885,7 @@
                 <w:b/>
                 <w:sz w:val="16"/>
               </w:rPr>
-              <w:t>NLL</w:t>
+              <w:t>Val NLL ham→ölç.</w:t>
             </w:r>
           </w:p>
         </w:tc>
@@ -31668,7 +31900,7 @@
                 <w:b/>
                 <w:sz w:val="16"/>
               </w:rPr>
-              <w:t>Brier</w:t>
+              <w:t>Test NLL ham→ölç.</w:t>
             </w:r>
           </w:p>
         </w:tc>
@@ -31683,7 +31915,7 @@
                 <w:b/>
                 <w:sz w:val="16"/>
               </w:rPr>
-              <w:t>ECE</w:t>
+              <w:t>Brier ham→ölç.</w:t>
             </w:r>
           </w:p>
         </w:tc>
@@ -31698,7 +31930,7 @@
                 <w:b/>
                 <w:sz w:val="16"/>
               </w:rPr>
-              <w:t>Maks. CE</w:t>
+              <w:t>ECE ham→ölç.</w:t>
             </w:r>
           </w:p>
         </w:tc>
@@ -31713,7 +31945,7 @@
                 <w:b/>
                 <w:sz w:val="16"/>
               </w:rPr>
-              <w:t>Ort. güven</w:t>
+              <w:t>Ort. güven ham→ölç.</w:t>
             </w:r>
           </w:p>
         </w:tc>
@@ -31743,7 +31975,7 @@
                 <w:b/>
                 <w:sz w:val="16"/>
               </w:rPr>
-              <w:t>Güven−doğ.</w:t>
+              <w:t>Karar korundu</w:t>
             </w:r>
           </w:p>
         </w:tc>
@@ -31773,7 +32005,7 @@
                 <w:rFonts w:ascii="Arial" w:hAnsi="Arial"/>
                 <w:sz w:val="16"/>
               </w:rPr>
-              <w:t>10</w:t>
+              <w:t>2.0096</w:t>
             </w:r>
           </w:p>
         </w:tc>
@@ -31787,7 +32019,7 @@
                 <w:rFonts w:ascii="Arial" w:hAnsi="Arial"/>
                 <w:sz w:val="16"/>
               </w:rPr>
-              <w:t>1.7791</w:t>
+              <w:t>1.6111 → 1.4042</w:t>
             </w:r>
           </w:p>
         </w:tc>
@@ -31801,7 +32033,7 @@
                 <w:rFonts w:ascii="Arial" w:hAnsi="Arial"/>
                 <w:sz w:val="16"/>
               </w:rPr>
-              <w:t>0.7787</w:t>
+              <w:t>1.7791 → 1.4359</w:t>
             </w:r>
           </w:p>
         </w:tc>
@@ -31815,7 +32047,7 @@
                 <w:rFonts w:ascii="Arial" w:hAnsi="Arial"/>
                 <w:sz w:val="16"/>
               </w:rPr>
-              <w:t>0.2455</w:t>
+              <w:t>0.7787 → 0.6957</w:t>
             </w:r>
           </w:p>
         </w:tc>
@@ -31829,7 +32061,7 @@
                 <w:rFonts w:ascii="Arial" w:hAnsi="Arial"/>
                 <w:sz w:val="16"/>
               </w:rPr>
-              <w:t>0.3751</w:t>
+              <w:t>0.2455 → 0.0575</w:t>
             </w:r>
           </w:p>
         </w:tc>
@@ -31843,7 +32075,7 @@
                 <w:rFonts w:ascii="Arial" w:hAnsi="Arial"/>
                 <w:sz w:val="16"/>
               </w:rPr>
-              <w:t>0.6879</w:t>
+              <w:t>0.6879 → 0.4998</w:t>
             </w:r>
           </w:p>
         </w:tc>
@@ -31871,7 +32103,7 @@
                 <w:rFonts w:ascii="Arial" w:hAnsi="Arial"/>
                 <w:sz w:val="16"/>
               </w:rPr>
-              <w:t>0.2455</w:t>
+              <w:t>Evet</w:t>
             </w:r>
           </w:p>
         </w:tc>
@@ -31901,7 +32133,7 @@
                 <w:rFonts w:ascii="Arial" w:hAnsi="Arial"/>
                 <w:sz w:val="16"/>
               </w:rPr>
-              <w:t>10</w:t>
+              <w:t>3.2744</w:t>
             </w:r>
           </w:p>
         </w:tc>
@@ -31915,7 +32147,7 @@
                 <w:rFonts w:ascii="Arial" w:hAnsi="Arial"/>
                 <w:sz w:val="16"/>
               </w:rPr>
-              <w:t>1.8767</w:t>
+              <w:t>1.8397 → 1.7778</w:t>
             </w:r>
           </w:p>
         </w:tc>
@@ -31929,7 +32161,7 @@
                 <w:rFonts w:ascii="Arial" w:hAnsi="Arial"/>
                 <w:sz w:val="16"/>
               </w:rPr>
-              <w:t>0.8597</w:t>
+              <w:t>1.8767 → 1.7880</w:t>
             </w:r>
           </w:p>
         </w:tc>
@@ -31943,7 +32175,7 @@
                 <w:rFonts w:ascii="Arial" w:hAnsi="Arial"/>
                 <w:sz w:val="16"/>
               </w:rPr>
-              <w:t>0.1049</w:t>
+              <w:t>0.8597 → 0.8323</w:t>
             </w:r>
           </w:p>
         </w:tc>
@@ -31957,7 +32189,7 @@
                 <w:rFonts w:ascii="Arial" w:hAnsi="Arial"/>
                 <w:sz w:val="16"/>
               </w:rPr>
-              <w:t>0.5368</w:t>
+              <w:t>0.1049 → 0.0132</w:t>
             </w:r>
           </w:p>
         </w:tc>
@@ -31971,7 +32203,7 @@
                 <w:rFonts w:ascii="Arial" w:hAnsi="Arial"/>
                 <w:sz w:val="16"/>
               </w:rPr>
-              <w:t>0.2956</w:t>
+              <w:t>0.2956 → 0.2039</w:t>
             </w:r>
           </w:p>
         </w:tc>
@@ -31999,7 +32231,7 @@
                 <w:rFonts w:ascii="Arial" w:hAnsi="Arial"/>
                 <w:sz w:val="16"/>
               </w:rPr>
-              <w:t>0.1049</w:t>
+              <w:t>Evet</w:t>
             </w:r>
           </w:p>
         </w:tc>
@@ -32011,7 +32243,7 @@
         <w:spacing w:after="120"/>
       </w:pPr>
       <w:r>
-        <w:t>CREMA-D modelinin ortalama güveni 0.6879, doğruluğu 0.4424 ve farkı +0.2455 olduğundan model aşırı güvenlidir; ECE=0.2455 olarak ölçülmüştür. MELD modelinin ortalama güveni 0.2956, doğruluğu 0.1907 ve farkı +0.1049 olduğundan model aşırı güvenlidir; ECE=0.1049 olarak ölçülmüştür.</w:t>
+        <w:t>CREMA-D için validation NLL ile öğrenilen T=2.0096, test NLL değerini 1.7791’ten 1.4359’e ve ECE değerini 0.2455’ten 0.0575’e düşürmüştür. Ortalama güven 0.6879’ten 0.4998’e inerken doğruluk 0.4424 ve sınıf tahminleri korunmuştur. Validation ECE 0.1932 → 0.0624 olmuştur; optimizasyon hedefinin ECE değil NLL olduğu özellikle not edilmiştir. MELD için validation NLL ile öğrenilen T=3.2744, test NLL değerini 1.8767’ten 1.7880’e ve ECE değerini 0.1049’ten 0.0132’e düşürmüştür. Ortalama güven 0.2956’ten 0.2039’e inerken doğruluk 0.1907 ve sınıf tahminleri korunmuştur. Validation ECE 0.0355 → 0.0581 olmuştur; optimizasyon hedefinin ECE değil NLL olduğu özellikle not edilmiştir.</w:t>
       </w:r>
     </w:p>
     <w:p>
@@ -32019,7 +32251,109 @@
         <w:spacing w:after="120"/>
       </w:pPr>
       <w:r>
-        <w:t>Kalibrasyon, model ve hiperparametre seçimi tamamlandıktan sonra kaydedilen held-out test olasılıklarında hesaplanmıştır. ECE, en yüksek sınıf olasılığına göre 10 eşit genişlikli bin kullanır. Temperature scaling gibi test sonucuna göre sonradan olasılık düzeltmesi uygulanmamıştır.</w:t>
+        <w:t>Sıcaklık katsayısı, model ve hiperparametre seçimi bittikten sonra yalnız validation olasılıklarında 0.25–10 aralığında iki aşamalı logaritmik aramayla NLL en aza indirilerek öğrenilmiştir. Kilitli test etiketleri sıcaklık seçiminde kullanılmamış; öğrenilen tek katsayı test olasılıklarına bir kez uygulanmıştır. T&gt;1 dağılımı yumuşatır; sınıf sıralamasını ve dolayısıyla accuracy/macro-F1 değerlerini değiştirmez. ECE, en yüksek sınıf olasılığına göre 10 eşit genişlikli bin ile hem ham hem ölçekli olasılıklarda raporlanmıştır.</w:t>
+      </w:r>
+    </w:p>
+    <w:p>
+      <w:pPr>
+        <w:jc w:val="center"/>
+      </w:pPr>
+      <w:r>
+        <w:drawing>
+          <wp:inline xmlns:a="http://schemas.openxmlformats.org/drawingml/2006/main" xmlns:pic="http://schemas.openxmlformats.org/drawingml/2006/picture">
+            <wp:extent cx="5577840" cy="2332551"/>
+            <wp:docPr id="3" name="Picture 3"/>
+            <wp:cNvGraphicFramePr>
+              <a:graphicFrameLocks noChangeAspect="1"/>
+            </wp:cNvGraphicFramePr>
+            <a:graphic>
+              <a:graphicData uri="http://schemas.openxmlformats.org/drawingml/2006/picture">
+                <pic:pic>
+                  <pic:nvPicPr>
+                    <pic:cNvPr id="0" name="test_reliability_diagram.png"/>
+                    <pic:cNvPicPr/>
+                  </pic:nvPicPr>
+                  <pic:blipFill>
+                    <a:blip r:embed="rId11"/>
+                    <a:stretch>
+                      <a:fillRect/>
+                    </a:stretch>
+                  </pic:blipFill>
+                  <pic:spPr>
+                    <a:xfrm>
+                      <a:off x="0" y="0"/>
+                      <a:ext cx="5577840" cy="2332551"/>
+                    </a:xfrm>
+                    <a:prstGeom prst="rect"/>
+                  </pic:spPr>
+                </pic:pic>
+              </a:graphicData>
+            </a:graphic>
+          </wp:inline>
+        </w:drawing>
+      </w:r>
+    </w:p>
+    <w:p>
+      <w:pPr>
+        <w:jc w:val="center"/>
+      </w:pPr>
+      <w:r>
+        <w:rPr>
+          <w:i/>
+          <w:sz w:val="18"/>
+        </w:rPr>
+        <w:t>CREMA-D held-out test güvenilirlik diyagramı: ECE 0.2455 → 0.0575.</w:t>
+      </w:r>
+    </w:p>
+    <w:p>
+      <w:pPr>
+        <w:jc w:val="center"/>
+      </w:pPr>
+      <w:r>
+        <w:drawing>
+          <wp:inline xmlns:a="http://schemas.openxmlformats.org/drawingml/2006/main" xmlns:pic="http://schemas.openxmlformats.org/drawingml/2006/picture">
+            <wp:extent cx="5577840" cy="2332551"/>
+            <wp:docPr id="4" name="Picture 4"/>
+            <wp:cNvGraphicFramePr>
+              <a:graphicFrameLocks noChangeAspect="1"/>
+            </wp:cNvGraphicFramePr>
+            <a:graphic>
+              <a:graphicData uri="http://schemas.openxmlformats.org/drawingml/2006/picture">
+                <pic:pic>
+                  <pic:nvPicPr>
+                    <pic:cNvPr id="0" name="test_reliability_diagram.png"/>
+                    <pic:cNvPicPr/>
+                  </pic:nvPicPr>
+                  <pic:blipFill>
+                    <a:blip r:embed="rId12"/>
+                    <a:stretch>
+                      <a:fillRect/>
+                    </a:stretch>
+                  </pic:blipFill>
+                  <pic:spPr>
+                    <a:xfrm>
+                      <a:off x="0" y="0"/>
+                      <a:ext cx="5577840" cy="2332551"/>
+                    </a:xfrm>
+                    <a:prstGeom prst="rect"/>
+                  </pic:spPr>
+                </pic:pic>
+              </a:graphicData>
+            </a:graphic>
+          </wp:inline>
+        </w:drawing>
+      </w:r>
+    </w:p>
+    <w:p>
+      <w:pPr>
+        <w:jc w:val="center"/>
+      </w:pPr>
+      <w:r>
+        <w:rPr>
+          <w:i/>
+          <w:sz w:val="18"/>
+        </w:rPr>
+        <w:t>MELD held-out test güvenilirlik diyagramı: ECE 0.1049 → 0.0132.</w:t>
       </w:r>
     </w:p>
     <w:p>
@@ -33178,7 +33512,7 @@
         <w:drawing>
           <wp:inline xmlns:a="http://schemas.openxmlformats.org/drawingml/2006/main" xmlns:pic="http://schemas.openxmlformats.org/drawingml/2006/picture">
             <wp:extent cx="5577840" cy="4621639"/>
-            <wp:docPr id="3" name="Picture 3"/>
+            <wp:docPr id="5" name="Picture 5"/>
             <wp:cNvGraphicFramePr>
               <a:graphicFrameLocks noChangeAspect="1"/>
             </wp:cNvGraphicFramePr>
@@ -33190,7 +33524,7 @@
                     <pic:cNvPicPr/>
                   </pic:nvPicPr>
                   <pic:blipFill>
-                    <a:blip r:embed="rId11"/>
+                    <a:blip r:embed="rId13"/>
                     <a:stretch>
                       <a:fillRect/>
                     </a:stretch>
@@ -33229,7 +33563,7 @@
         <w:drawing>
           <wp:inline xmlns:a="http://schemas.openxmlformats.org/drawingml/2006/main" xmlns:pic="http://schemas.openxmlformats.org/drawingml/2006/picture">
             <wp:extent cx="5577840" cy="4621639"/>
-            <wp:docPr id="4" name="Picture 4"/>
+            <wp:docPr id="6" name="Picture 6"/>
             <wp:cNvGraphicFramePr>
               <a:graphicFrameLocks noChangeAspect="1"/>
             </wp:cNvGraphicFramePr>
@@ -33241,7 +33575,7 @@
                     <pic:cNvPicPr/>
                   </pic:nvPicPr>
                   <pic:blipFill>
-                    <a:blip r:embed="rId12"/>
+                    <a:blip r:embed="rId14"/>
                     <a:stretch>
                       <a:fillRect/>
                     </a:stretch>
@@ -34605,7 +34939,7 @@
         <w:spacing w:after="120"/>
       </w:pPr>
       <w:r>
-        <w:t>Bu aşamada 2 veri kümesi için toplam 64 hiperparametre/seed koşusu ve 16 özellik ablation koşusu tamamlanmıştır. Her veri kümesi için bağımsız, sıfırdan PyTorch MLP modeli; train-only normalizasyon; sınıf ağırlıklı kayıp; erken durdurma; kaydedilmiş checkpoint; test tahminleri, karmaşıklık matrisi, bootstrap belirsizliği ve kalibrasyon özeti üretilmiştir.</w:t>
+        <w:t>Bu aşamada 2 veri kümesi için toplam 64 hiperparametre/seed koşusu ve 16 özellik ablation koşusu tamamlanmıştır. Her veri kümesi için bağımsız, sıfırdan PyTorch MLP modeli; train-only normalizasyon; sınıf ağırlıklı kayıp; erken durdurma; kaydedilmiş checkpoint; test tahminleri, karmaşıklık matrisi, bootstrap belirsizliği, validation-temelli temperature scaling ve güvenilirlik diyagramları üretilmiştir. Ölçekleme her iki veri kümesinde test NLL, Brier ve ECE değerlerini düşürmüş; sınıf tahminlerini ve sınıflandırma metriklerini değiştirmemiştir.</w:t>
       </w:r>
     </w:p>
     <w:p>
@@ -34661,7 +34995,7 @@
         <w:pStyle w:val="ListBullet"/>
       </w:pPr>
       <w:r>
-        <w:t>Aşırı güveni azaltmak için yalnız validation logitlerinde öğrenilen temperature scaling ve güvenilirlik diyagramı denenmesi.</w:t>
+        <w:t>Validation NLL hedefli tek sıcaklık katsayısının classwise ECE, adaptive ECE ve yalnız validation üzerinde seçilecek alternatif kalibrasyon yöntemleriyle karşılaştırılması.</w:t>
       </w:r>
     </w:p>
     <w:p>
@@ -35101,7 +35435,7 @@
                 <w:rFonts w:ascii="Arial" w:hAnsi="Arial"/>
                 <w:sz w:val="16"/>
               </w:rPr>
-              <w:t>Test belirsizliği ve kalibrasyonu raporlandı</w:t>
+              <w:t>Test belirsizliği ve validation-temelli kalibrasyon raporlandı</w:t>
             </w:r>
           </w:p>
         </w:tc>
@@ -35129,7 +35463,7 @@
                 <w:rFonts w:ascii="Arial" w:hAnsi="Arial"/>
                 <w:sz w:val="16"/>
               </w:rPr>
-              <w:t>test_uncertainty.json ve test_calibration.json</w:t>
+              <w:t>test_uncertainty.json, temperature_scaling.json ve reliability PNG</w:t>
             </w:r>
           </w:p>
         </w:tc>

</xml_diff>

<commit_message>
Add multi-seed Mel feature stability study
</commit_message>
<xml_diff>
--- a/odev3/PROJE_ILERLEME_RAPORU_3.docx
+++ b/odev3/PROJE_ILERLEME_RAPORU_3.docx
@@ -624,6 +624,36 @@
                 <w:rFonts w:ascii="Arial" w:hAnsi="Arial"/>
                 <w:sz w:val="16"/>
               </w:rPr>
+              <w:t>odev3/feature_stability.py</w:t>
+            </w:r>
+          </w:p>
+        </w:tc>
+        <w:tc>
+          <w:tcPr>
+            <w:tcW w:type="dxa" w:w="5184"/>
+          </w:tcPr>
+          <w:p>
+            <w:r>
+              <w:rPr>
+                <w:rFonts w:ascii="Arial" w:hAnsi="Arial"/>
+                <w:sz w:val="16"/>
+              </w:rPr>
+              <w:t>En güçlü iki Mel temsilini seed 42/143/244 ile yalnız geçerleme setinde yeniden eğitip ortalama ve sapmayı ölçer.</w:t>
+            </w:r>
+          </w:p>
+        </w:tc>
+      </w:tr>
+      <w:tr>
+        <w:tc>
+          <w:tcPr>
+            <w:tcW w:type="dxa" w:w="5184"/>
+          </w:tcPr>
+          <w:p>
+            <w:r>
+              <w:rPr>
+                <w:rFonts w:ascii="Arial" w:hAnsi="Arial"/>
+                <w:sz w:val="16"/>
+              </w:rPr>
               <w:t>odev3/pipeline.py</w:t>
             </w:r>
           </w:p>
@@ -705,6 +735,14 @@
         <w:spacing w:after="120"/>
       </w:pPr>
       <w:r>
+        <w:t>Çoklu-seed özellik doğrulaması: python -m odev3.feature_stability --corpora cremad meld --max-epochs 60 --seeds 42 143 244 --device cpu --feature-workers 4</w:t>
+      </w:r>
+    </w:p>
+    <w:p>
+      <w:pPr>
+        <w:spacing w:after="120"/>
+      </w:pPr>
+      <w:r>
         <w:t>Rapor: python odev3/build_report.py --output-root odev3/outputs</w:t>
       </w:r>
     </w:p>
@@ -1381,7 +1419,7 @@
                 <w:rFonts w:ascii="Arial" w:hAnsi="Arial"/>
                 <w:sz w:val="16"/>
               </w:rPr>
-              <w:t>MELD</w:t>
+              <w:t>CREMA-D</w:t>
             </w:r>
           </w:p>
         </w:tc>
@@ -1395,7 +1433,7 @@
                 <w:rFonts w:ascii="Arial" w:hAnsi="Arial"/>
                 <w:sz w:val="16"/>
               </w:rPr>
-              <w:t>odev3/outputs/meld/best_model.pt</w:t>
+              <w:t>odev3/feature_stability/cremad/feature_stability_runs.csv</w:t>
             </w:r>
           </w:p>
         </w:tc>
@@ -1409,7 +1447,7 @@
                 <w:rFonts w:ascii="Arial" w:hAnsi="Arial"/>
                 <w:sz w:val="16"/>
               </w:rPr>
-              <w:t>En iyi MLP, normalizasyon ve sınıf ağırlıkları</w:t>
+              <w:t>İki temsil × üç seed ham validation koşuları</w:t>
             </w:r>
           </w:p>
         </w:tc>
@@ -1423,7 +1461,7 @@
                 <w:rFonts w:ascii="Arial" w:hAnsi="Arial"/>
                 <w:sz w:val="16"/>
               </w:rPr>
-              <w:t>Hazır (8.6 MB)</w:t>
+              <w:t>Hazır (2.8 KB)</w:t>
             </w:r>
           </w:p>
         </w:tc>
@@ -1439,7 +1477,7 @@
                 <w:rFonts w:ascii="Arial" w:hAnsi="Arial"/>
                 <w:sz w:val="16"/>
               </w:rPr>
-              <w:t>MELD</w:t>
+              <w:t>CREMA-D</w:t>
             </w:r>
           </w:p>
         </w:tc>
@@ -1453,7 +1491,7 @@
                 <w:rFonts w:ascii="Arial" w:hAnsi="Arial"/>
                 <w:sz w:val="16"/>
               </w:rPr>
-              <w:t>odev3/outputs/meld/validation_results.csv</w:t>
+              <w:t>odev3/feature_stability/cremad/feature_stability.csv</w:t>
             </w:r>
           </w:p>
         </w:tc>
@@ -1467,7 +1505,7 @@
                 <w:rFonts w:ascii="Arial" w:hAnsi="Arial"/>
                 <w:sz w:val="16"/>
               </w:rPr>
-              <w:t>32 geçerleme deneyinin tam tablosu</w:t>
+              <w:t>Üç-seed ortalama, standart sapma ve sıralama</w:t>
             </w:r>
           </w:p>
         </w:tc>
@@ -1481,7 +1519,7 @@
                 <w:rFonts w:ascii="Arial" w:hAnsi="Arial"/>
                 <w:sz w:val="16"/>
               </w:rPr>
-              <w:t>Hazır (7.0 KB)</w:t>
+              <w:t>Hazır (0.8 KB)</w:t>
             </w:r>
           </w:p>
         </w:tc>
@@ -1497,7 +1535,7 @@
                 <w:rFonts w:ascii="Arial" w:hAnsi="Arial"/>
                 <w:sz w:val="16"/>
               </w:rPr>
-              <w:t>MELD</w:t>
+              <w:t>CREMA-D</w:t>
             </w:r>
           </w:p>
         </w:tc>
@@ -1511,7 +1549,7 @@
                 <w:rFonts w:ascii="Arial" w:hAnsi="Arial"/>
                 <w:sz w:val="16"/>
               </w:rPr>
-              <w:t>odev3/outputs/meld/best_training_history.csv</w:t>
+              <w:t>odev3/feature_stability/cremad/feature_stability_comparison.json</w:t>
             </w:r>
           </w:p>
         </w:tc>
@@ -1525,7 +1563,7 @@
                 <w:rFonts w:ascii="Arial" w:hAnsi="Arial"/>
                 <w:sz w:val="16"/>
               </w:rPr>
-              <w:t>Seçilen koşunun epoch geçmişi</w:t>
+              <w:t>Eşleştirilmiş seed farkları ve aday kazanım sayıları</w:t>
             </w:r>
           </w:p>
         </w:tc>
@@ -1539,7 +1577,7 @@
                 <w:rFonts w:ascii="Arial" w:hAnsi="Arial"/>
                 <w:sz w:val="16"/>
               </w:rPr>
-              <w:t>Hazır (2.3 KB)</w:t>
+              <w:t>Hazır (0.9 KB)</w:t>
             </w:r>
           </w:p>
         </w:tc>
@@ -1555,7 +1593,7 @@
                 <w:rFonts w:ascii="Arial" w:hAnsi="Arial"/>
                 <w:sz w:val="16"/>
               </w:rPr>
-              <w:t>MELD</w:t>
+              <w:t>CREMA-D</w:t>
             </w:r>
           </w:p>
         </w:tc>
@@ -1569,7 +1607,7 @@
                 <w:rFonts w:ascii="Arial" w:hAnsi="Arial"/>
                 <w:sz w:val="16"/>
               </w:rPr>
-              <w:t>odev3/outputs/meld/test_predictions.csv</w:t>
+              <w:t>odev3/feature_stability/cremad/feature_stability.png</w:t>
             </w:r>
           </w:p>
         </w:tc>
@@ -1583,7 +1621,7 @@
                 <w:rFonts w:ascii="Arial" w:hAnsi="Arial"/>
                 <w:sz w:val="16"/>
               </w:rPr>
-              <w:t>Test örneği tahmin ve olasılıkları</w:t>
+              <w:t>Seed noktaları ile ortalama ± standart sapma görseli</w:t>
             </w:r>
           </w:p>
         </w:tc>
@@ -1597,7 +1635,7 @@
                 <w:rFonts w:ascii="Arial" w:hAnsi="Arial"/>
                 <w:sz w:val="16"/>
               </w:rPr>
-              <w:t>Hazır (0.1 MB)</w:t>
+              <w:t>Hazır (46.3 KB)</w:t>
             </w:r>
           </w:p>
         </w:tc>
@@ -1627,7 +1665,7 @@
                 <w:rFonts w:ascii="Arial" w:hAnsi="Arial"/>
                 <w:sz w:val="16"/>
               </w:rPr>
-              <w:t>odev3/outputs/meld/test_uncertainty.json</w:t>
+              <w:t>odev3/outputs/meld/best_model.pt</w:t>
             </w:r>
           </w:p>
         </w:tc>
@@ -1641,7 +1679,7 @@
                 <w:rFonts w:ascii="Arial" w:hAnsi="Arial"/>
                 <w:sz w:val="16"/>
               </w:rPr>
-              <w:t>Test metriklerinin %95 bootstrap güven aralıkları</w:t>
+              <w:t>En iyi MLP, normalizasyon ve sınıf ağırlıkları</w:t>
             </w:r>
           </w:p>
         </w:tc>
@@ -1655,7 +1693,7 @@
                 <w:rFonts w:ascii="Arial" w:hAnsi="Arial"/>
                 <w:sz w:val="16"/>
               </w:rPr>
-              <w:t>Hazır (0.8 KB)</w:t>
+              <w:t>Hazır (8.6 MB)</w:t>
             </w:r>
           </w:p>
         </w:tc>
@@ -1685,7 +1723,7 @@
                 <w:rFonts w:ascii="Arial" w:hAnsi="Arial"/>
                 <w:sz w:val="16"/>
               </w:rPr>
-              <w:t>odev3/outputs/meld/test_calibration.json</w:t>
+              <w:t>odev3/outputs/meld/validation_results.csv</w:t>
             </w:r>
           </w:p>
         </w:tc>
@@ -1699,7 +1737,7 @@
                 <w:rFonts w:ascii="Arial" w:hAnsi="Arial"/>
                 <w:sz w:val="16"/>
               </w:rPr>
-              <w:t>Ham test olasılıklarının NLL, Brier ve ECE özeti</w:t>
+              <w:t>32 geçerleme deneyinin tam tablosu</w:t>
             </w:r>
           </w:p>
         </w:tc>
@@ -1713,7 +1751,7 @@
                 <w:rFonts w:ascii="Arial" w:hAnsi="Arial"/>
                 <w:sz w:val="16"/>
               </w:rPr>
-              <w:t>Hazır (2.8 KB)</w:t>
+              <w:t>Hazır (7.0 KB)</w:t>
             </w:r>
           </w:p>
         </w:tc>
@@ -1743,7 +1781,7 @@
                 <w:rFonts w:ascii="Arial" w:hAnsi="Arial"/>
                 <w:sz w:val="16"/>
               </w:rPr>
-              <w:t>odev3/outputs/meld/temperature_scaling.json</w:t>
+              <w:t>odev3/outputs/meld/best_training_history.csv</w:t>
             </w:r>
           </w:p>
         </w:tc>
@@ -1757,7 +1795,7 @@
                 <w:rFonts w:ascii="Arial" w:hAnsi="Arial"/>
                 <w:sz w:val="16"/>
               </w:rPr>
-              <w:t>Validation’da öğrenilen sıcaklık ile ham/ölçekli karşılaştırma</w:t>
+              <w:t>Seçilen koşunun epoch geçmişi</w:t>
             </w:r>
           </w:p>
         </w:tc>
@@ -1771,7 +1809,7 @@
                 <w:rFonts w:ascii="Arial" w:hAnsi="Arial"/>
                 <w:sz w:val="16"/>
               </w:rPr>
-              <w:t>Hazır (13.3 KB)</w:t>
+              <w:t>Hazır (2.3 KB)</w:t>
             </w:r>
           </w:p>
         </w:tc>
@@ -1801,7 +1839,7 @@
                 <w:rFonts w:ascii="Arial" w:hAnsi="Arial"/>
                 <w:sz w:val="16"/>
               </w:rPr>
-              <w:t>odev3/outputs/meld/test_confusion_matrix.png</w:t>
+              <w:t>odev3/outputs/meld/test_predictions.csv</w:t>
             </w:r>
           </w:p>
         </w:tc>
@@ -1815,7 +1853,7 @@
                 <w:rFonts w:ascii="Arial" w:hAnsi="Arial"/>
                 <w:sz w:val="16"/>
               </w:rPr>
-              <w:t>Normalize test karmaşıklık matrisi</w:t>
+              <w:t>Test örneği tahmin ve olasılıkları</w:t>
             </w:r>
           </w:p>
         </w:tc>
@@ -1829,7 +1867,7 @@
                 <w:rFonts w:ascii="Arial" w:hAnsi="Arial"/>
                 <w:sz w:val="16"/>
               </w:rPr>
-              <w:t>Hazır (79.0 KB)</w:t>
+              <w:t>Hazır (0.1 MB)</w:t>
             </w:r>
           </w:p>
         </w:tc>
@@ -1859,7 +1897,7 @@
                 <w:rFonts w:ascii="Arial" w:hAnsi="Arial"/>
                 <w:sz w:val="16"/>
               </w:rPr>
-              <w:t>odev3/outputs/meld/test_reliability_diagram.png</w:t>
+              <w:t>odev3/outputs/meld/test_uncertainty.json</w:t>
             </w:r>
           </w:p>
         </w:tc>
@@ -1873,7 +1911,7 @@
                 <w:rFonts w:ascii="Arial" w:hAnsi="Arial"/>
                 <w:sz w:val="16"/>
               </w:rPr>
-              <w:t>Ham ve ölçekli test güvenilirlik diyagramı</w:t>
+              <w:t>Test metriklerinin %95 bootstrap güven aralıkları</w:t>
             </w:r>
           </w:p>
         </w:tc>
@@ -1887,7 +1925,7 @@
                 <w:rFonts w:ascii="Arial" w:hAnsi="Arial"/>
                 <w:sz w:val="16"/>
               </w:rPr>
-              <w:t>Hazır (96.3 KB)</w:t>
+              <w:t>Hazır (0.8 KB)</w:t>
             </w:r>
           </w:p>
         </w:tc>
@@ -1917,6 +1955,238 @@
                 <w:rFonts w:ascii="Arial" w:hAnsi="Arial"/>
                 <w:sz w:val="16"/>
               </w:rPr>
+              <w:t>odev3/outputs/meld/test_calibration.json</w:t>
+            </w:r>
+          </w:p>
+        </w:tc>
+        <w:tc>
+          <w:tcPr>
+            <w:tcW w:type="dxa" w:w="2592"/>
+          </w:tcPr>
+          <w:p>
+            <w:r>
+              <w:rPr>
+                <w:rFonts w:ascii="Arial" w:hAnsi="Arial"/>
+                <w:sz w:val="16"/>
+              </w:rPr>
+              <w:t>Ham test olasılıklarının NLL, Brier ve ECE özeti</w:t>
+            </w:r>
+          </w:p>
+        </w:tc>
+        <w:tc>
+          <w:tcPr>
+            <w:tcW w:type="dxa" w:w="2592"/>
+          </w:tcPr>
+          <w:p>
+            <w:r>
+              <w:rPr>
+                <w:rFonts w:ascii="Arial" w:hAnsi="Arial"/>
+                <w:sz w:val="16"/>
+              </w:rPr>
+              <w:t>Hazır (2.8 KB)</w:t>
+            </w:r>
+          </w:p>
+        </w:tc>
+      </w:tr>
+      <w:tr>
+        <w:tc>
+          <w:tcPr>
+            <w:tcW w:type="dxa" w:w="2592"/>
+          </w:tcPr>
+          <w:p>
+            <w:r>
+              <w:rPr>
+                <w:rFonts w:ascii="Arial" w:hAnsi="Arial"/>
+                <w:sz w:val="16"/>
+              </w:rPr>
+              <w:t>MELD</w:t>
+            </w:r>
+          </w:p>
+        </w:tc>
+        <w:tc>
+          <w:tcPr>
+            <w:tcW w:type="dxa" w:w="2592"/>
+          </w:tcPr>
+          <w:p>
+            <w:r>
+              <w:rPr>
+                <w:rFonts w:ascii="Arial" w:hAnsi="Arial"/>
+                <w:sz w:val="16"/>
+              </w:rPr>
+              <w:t>odev3/outputs/meld/temperature_scaling.json</w:t>
+            </w:r>
+          </w:p>
+        </w:tc>
+        <w:tc>
+          <w:tcPr>
+            <w:tcW w:type="dxa" w:w="2592"/>
+          </w:tcPr>
+          <w:p>
+            <w:r>
+              <w:rPr>
+                <w:rFonts w:ascii="Arial" w:hAnsi="Arial"/>
+                <w:sz w:val="16"/>
+              </w:rPr>
+              <w:t>Validation’da öğrenilen sıcaklık ile ham/ölçekli karşılaştırma</w:t>
+            </w:r>
+          </w:p>
+        </w:tc>
+        <w:tc>
+          <w:tcPr>
+            <w:tcW w:type="dxa" w:w="2592"/>
+          </w:tcPr>
+          <w:p>
+            <w:r>
+              <w:rPr>
+                <w:rFonts w:ascii="Arial" w:hAnsi="Arial"/>
+                <w:sz w:val="16"/>
+              </w:rPr>
+              <w:t>Hazır (13.3 KB)</w:t>
+            </w:r>
+          </w:p>
+        </w:tc>
+      </w:tr>
+      <w:tr>
+        <w:tc>
+          <w:tcPr>
+            <w:tcW w:type="dxa" w:w="2592"/>
+          </w:tcPr>
+          <w:p>
+            <w:r>
+              <w:rPr>
+                <w:rFonts w:ascii="Arial" w:hAnsi="Arial"/>
+                <w:sz w:val="16"/>
+              </w:rPr>
+              <w:t>MELD</w:t>
+            </w:r>
+          </w:p>
+        </w:tc>
+        <w:tc>
+          <w:tcPr>
+            <w:tcW w:type="dxa" w:w="2592"/>
+          </w:tcPr>
+          <w:p>
+            <w:r>
+              <w:rPr>
+                <w:rFonts w:ascii="Arial" w:hAnsi="Arial"/>
+                <w:sz w:val="16"/>
+              </w:rPr>
+              <w:t>odev3/outputs/meld/test_confusion_matrix.png</w:t>
+            </w:r>
+          </w:p>
+        </w:tc>
+        <w:tc>
+          <w:tcPr>
+            <w:tcW w:type="dxa" w:w="2592"/>
+          </w:tcPr>
+          <w:p>
+            <w:r>
+              <w:rPr>
+                <w:rFonts w:ascii="Arial" w:hAnsi="Arial"/>
+                <w:sz w:val="16"/>
+              </w:rPr>
+              <w:t>Normalize test karmaşıklık matrisi</w:t>
+            </w:r>
+          </w:p>
+        </w:tc>
+        <w:tc>
+          <w:tcPr>
+            <w:tcW w:type="dxa" w:w="2592"/>
+          </w:tcPr>
+          <w:p>
+            <w:r>
+              <w:rPr>
+                <w:rFonts w:ascii="Arial" w:hAnsi="Arial"/>
+                <w:sz w:val="16"/>
+              </w:rPr>
+              <w:t>Hazır (79.0 KB)</w:t>
+            </w:r>
+          </w:p>
+        </w:tc>
+      </w:tr>
+      <w:tr>
+        <w:tc>
+          <w:tcPr>
+            <w:tcW w:type="dxa" w:w="2592"/>
+          </w:tcPr>
+          <w:p>
+            <w:r>
+              <w:rPr>
+                <w:rFonts w:ascii="Arial" w:hAnsi="Arial"/>
+                <w:sz w:val="16"/>
+              </w:rPr>
+              <w:t>MELD</w:t>
+            </w:r>
+          </w:p>
+        </w:tc>
+        <w:tc>
+          <w:tcPr>
+            <w:tcW w:type="dxa" w:w="2592"/>
+          </w:tcPr>
+          <w:p>
+            <w:r>
+              <w:rPr>
+                <w:rFonts w:ascii="Arial" w:hAnsi="Arial"/>
+                <w:sz w:val="16"/>
+              </w:rPr>
+              <w:t>odev3/outputs/meld/test_reliability_diagram.png</w:t>
+            </w:r>
+          </w:p>
+        </w:tc>
+        <w:tc>
+          <w:tcPr>
+            <w:tcW w:type="dxa" w:w="2592"/>
+          </w:tcPr>
+          <w:p>
+            <w:r>
+              <w:rPr>
+                <w:rFonts w:ascii="Arial" w:hAnsi="Arial"/>
+                <w:sz w:val="16"/>
+              </w:rPr>
+              <w:t>Ham ve ölçekli test güvenilirlik diyagramı</w:t>
+            </w:r>
+          </w:p>
+        </w:tc>
+        <w:tc>
+          <w:tcPr>
+            <w:tcW w:type="dxa" w:w="2592"/>
+          </w:tcPr>
+          <w:p>
+            <w:r>
+              <w:rPr>
+                <w:rFonts w:ascii="Arial" w:hAnsi="Arial"/>
+                <w:sz w:val="16"/>
+              </w:rPr>
+              <w:t>Hazır (96.3 KB)</w:t>
+            </w:r>
+          </w:p>
+        </w:tc>
+      </w:tr>
+      <w:tr>
+        <w:tc>
+          <w:tcPr>
+            <w:tcW w:type="dxa" w:w="2592"/>
+          </w:tcPr>
+          <w:p>
+            <w:r>
+              <w:rPr>
+                <w:rFonts w:ascii="Arial" w:hAnsi="Arial"/>
+                <w:sz w:val="16"/>
+              </w:rPr>
+              <w:t>MELD</w:t>
+            </w:r>
+          </w:p>
+        </w:tc>
+        <w:tc>
+          <w:tcPr>
+            <w:tcW w:type="dxa" w:w="2592"/>
+          </w:tcPr>
+          <w:p>
+            <w:r>
+              <w:rPr>
+                <w:rFonts w:ascii="Arial" w:hAnsi="Arial"/>
+                <w:sz w:val="16"/>
+              </w:rPr>
               <w:t>odev3/outputs/meld/result.json</w:t>
             </w:r>
           </w:p>
@@ -1946,6 +2216,238 @@
                 <w:sz w:val="16"/>
               </w:rPr>
               <w:t>Hazır (25.6 KB)</w:t>
+            </w:r>
+          </w:p>
+        </w:tc>
+      </w:tr>
+      <w:tr>
+        <w:tc>
+          <w:tcPr>
+            <w:tcW w:type="dxa" w:w="2592"/>
+          </w:tcPr>
+          <w:p>
+            <w:r>
+              <w:rPr>
+                <w:rFonts w:ascii="Arial" w:hAnsi="Arial"/>
+                <w:sz w:val="16"/>
+              </w:rPr>
+              <w:t>MELD</w:t>
+            </w:r>
+          </w:p>
+        </w:tc>
+        <w:tc>
+          <w:tcPr>
+            <w:tcW w:type="dxa" w:w="2592"/>
+          </w:tcPr>
+          <w:p>
+            <w:r>
+              <w:rPr>
+                <w:rFonts w:ascii="Arial" w:hAnsi="Arial"/>
+                <w:sz w:val="16"/>
+              </w:rPr>
+              <w:t>odev3/feature_stability/meld/feature_stability_runs.csv</w:t>
+            </w:r>
+          </w:p>
+        </w:tc>
+        <w:tc>
+          <w:tcPr>
+            <w:tcW w:type="dxa" w:w="2592"/>
+          </w:tcPr>
+          <w:p>
+            <w:r>
+              <w:rPr>
+                <w:rFonts w:ascii="Arial" w:hAnsi="Arial"/>
+                <w:sz w:val="16"/>
+              </w:rPr>
+              <w:t>İki temsil × üç seed ham validation koşuları</w:t>
+            </w:r>
+          </w:p>
+        </w:tc>
+        <w:tc>
+          <w:tcPr>
+            <w:tcW w:type="dxa" w:w="2592"/>
+          </w:tcPr>
+          <w:p>
+            <w:r>
+              <w:rPr>
+                <w:rFonts w:ascii="Arial" w:hAnsi="Arial"/>
+                <w:sz w:val="16"/>
+              </w:rPr>
+              <w:t>Hazır (2.8 KB)</w:t>
+            </w:r>
+          </w:p>
+        </w:tc>
+      </w:tr>
+      <w:tr>
+        <w:tc>
+          <w:tcPr>
+            <w:tcW w:type="dxa" w:w="2592"/>
+          </w:tcPr>
+          <w:p>
+            <w:r>
+              <w:rPr>
+                <w:rFonts w:ascii="Arial" w:hAnsi="Arial"/>
+                <w:sz w:val="16"/>
+              </w:rPr>
+              <w:t>MELD</w:t>
+            </w:r>
+          </w:p>
+        </w:tc>
+        <w:tc>
+          <w:tcPr>
+            <w:tcW w:type="dxa" w:w="2592"/>
+          </w:tcPr>
+          <w:p>
+            <w:r>
+              <w:rPr>
+                <w:rFonts w:ascii="Arial" w:hAnsi="Arial"/>
+                <w:sz w:val="16"/>
+              </w:rPr>
+              <w:t>odev3/feature_stability/meld/feature_stability.csv</w:t>
+            </w:r>
+          </w:p>
+        </w:tc>
+        <w:tc>
+          <w:tcPr>
+            <w:tcW w:type="dxa" w:w="2592"/>
+          </w:tcPr>
+          <w:p>
+            <w:r>
+              <w:rPr>
+                <w:rFonts w:ascii="Arial" w:hAnsi="Arial"/>
+                <w:sz w:val="16"/>
+              </w:rPr>
+              <w:t>Üç-seed ortalama, standart sapma ve sıralama</w:t>
+            </w:r>
+          </w:p>
+        </w:tc>
+        <w:tc>
+          <w:tcPr>
+            <w:tcW w:type="dxa" w:w="2592"/>
+          </w:tcPr>
+          <w:p>
+            <w:r>
+              <w:rPr>
+                <w:rFonts w:ascii="Arial" w:hAnsi="Arial"/>
+                <w:sz w:val="16"/>
+              </w:rPr>
+              <w:t>Hazır (0.8 KB)</w:t>
+            </w:r>
+          </w:p>
+        </w:tc>
+      </w:tr>
+      <w:tr>
+        <w:tc>
+          <w:tcPr>
+            <w:tcW w:type="dxa" w:w="2592"/>
+          </w:tcPr>
+          <w:p>
+            <w:r>
+              <w:rPr>
+                <w:rFonts w:ascii="Arial" w:hAnsi="Arial"/>
+                <w:sz w:val="16"/>
+              </w:rPr>
+              <w:t>MELD</w:t>
+            </w:r>
+          </w:p>
+        </w:tc>
+        <w:tc>
+          <w:tcPr>
+            <w:tcW w:type="dxa" w:w="2592"/>
+          </w:tcPr>
+          <w:p>
+            <w:r>
+              <w:rPr>
+                <w:rFonts w:ascii="Arial" w:hAnsi="Arial"/>
+                <w:sz w:val="16"/>
+              </w:rPr>
+              <w:t>odev3/feature_stability/meld/feature_stability_comparison.json</w:t>
+            </w:r>
+          </w:p>
+        </w:tc>
+        <w:tc>
+          <w:tcPr>
+            <w:tcW w:type="dxa" w:w="2592"/>
+          </w:tcPr>
+          <w:p>
+            <w:r>
+              <w:rPr>
+                <w:rFonts w:ascii="Arial" w:hAnsi="Arial"/>
+                <w:sz w:val="16"/>
+              </w:rPr>
+              <w:t>Eşleştirilmiş seed farkları ve aday kazanım sayıları</w:t>
+            </w:r>
+          </w:p>
+        </w:tc>
+        <w:tc>
+          <w:tcPr>
+            <w:tcW w:type="dxa" w:w="2592"/>
+          </w:tcPr>
+          <w:p>
+            <w:r>
+              <w:rPr>
+                <w:rFonts w:ascii="Arial" w:hAnsi="Arial"/>
+                <w:sz w:val="16"/>
+              </w:rPr>
+              <w:t>Hazır (0.9 KB)</w:t>
+            </w:r>
+          </w:p>
+        </w:tc>
+      </w:tr>
+      <w:tr>
+        <w:tc>
+          <w:tcPr>
+            <w:tcW w:type="dxa" w:w="2592"/>
+          </w:tcPr>
+          <w:p>
+            <w:r>
+              <w:rPr>
+                <w:rFonts w:ascii="Arial" w:hAnsi="Arial"/>
+                <w:sz w:val="16"/>
+              </w:rPr>
+              <w:t>MELD</w:t>
+            </w:r>
+          </w:p>
+        </w:tc>
+        <w:tc>
+          <w:tcPr>
+            <w:tcW w:type="dxa" w:w="2592"/>
+          </w:tcPr>
+          <w:p>
+            <w:r>
+              <w:rPr>
+                <w:rFonts w:ascii="Arial" w:hAnsi="Arial"/>
+                <w:sz w:val="16"/>
+              </w:rPr>
+              <w:t>odev3/feature_stability/meld/feature_stability.png</w:t>
+            </w:r>
+          </w:p>
+        </w:tc>
+        <w:tc>
+          <w:tcPr>
+            <w:tcW w:type="dxa" w:w="2592"/>
+          </w:tcPr>
+          <w:p>
+            <w:r>
+              <w:rPr>
+                <w:rFonts w:ascii="Arial" w:hAnsi="Arial"/>
+                <w:sz w:val="16"/>
+              </w:rPr>
+              <w:t>Seed noktaları ile ortalama ± standart sapma görseli</w:t>
+            </w:r>
+          </w:p>
+        </w:tc>
+        <w:tc>
+          <w:tcPr>
+            <w:tcW w:type="dxa" w:w="2592"/>
+          </w:tcPr>
+          <w:p>
+            <w:r>
+              <w:rPr>
+                <w:rFonts w:ascii="Arial" w:hAnsi="Arial"/>
+                <w:sz w:val="16"/>
+              </w:rPr>
+              <w:t>Hazır (47.8 KB)</w:t>
             </w:r>
           </w:p>
         </w:tc>
@@ -6157,7 +6659,1025 @@
         <w:spacing w:after="120"/>
       </w:pPr>
       <w:r>
-        <w:t>CREMA-D için 96×64 crop-pad macro-F1=0.4707 ile birinci olmuştur. Ana 4096-boyutlu temsile göre tek-seed fark +0.0040 olmuştur. MELD için 64×64 crop-pad macro-F1=0.2525 ile birinci olmuştur. Ana 4096-boyutlu temsil liderliğini korumuştur. Genişletilmiş aday tek seed ile ve yalnız validation katında değerlendirildiğinden, küçük fark nihai checkpoint’i test sonucuna göre geriye dönük değiştirmek için kullanılmamış; çoklu-seed doğrulama adayı olarak kaydedilmiştir.</w:t>
+        <w:t>CREMA-D için 96×64 crop-pad macro-F1=0.4707 ile birinci olmuştur. Ana 4096-boyutlu temsile göre tek-seed fark +0.0040 olmuştur. MELD için 64×64 crop-pad macro-F1=0.2525 ile birinci olmuştur. Ana 4096-boyutlu temsil liderliğini korumuştur. Tek-seed fark küçük olduğundan nihai checkpoint test sonucuna göre değiştirilmemiş; adaylar aşağıdaki üç-seed validation deneyinde ayrıca doğrulanmıştır.</w:t>
+      </w:r>
+    </w:p>
+    <w:p>
+      <w:pPr>
+        <w:pStyle w:val="Heading2"/>
+      </w:pPr>
+      <w:r>
+        <w:t>Özellik Temsilinin Çoklu-Seed Doğrulaması</w:t>
+      </w:r>
+    </w:p>
+    <w:p>
+      <w:pPr>
+        <w:spacing w:after="120"/>
+      </w:pPr>
+      <w:r>
+        <w:t>Tek-seed ablation sıralamasındaki küçük farkların kararlılığını ölçmek için her corpus’ta ana temsil ve en güçlü alternatif aynı referans MLP ile seed 42, 143 ve 244 üzerinde yeniden eğitilmiştir. Seçim ölçütü üç seed’in validation macro-F1 ortalamasıdır; standart sapma, minimum ve maksimum değerler de saklanmıştır.</w:t>
+      </w:r>
+    </w:p>
+    <w:p>
+      <w:r>
+        <w:rPr>
+          <w:b/>
+        </w:rPr>
+        <w:t>Tablo 4. Mel temsillerinin üç-seed validation kararlılığı</w:t>
+      </w:r>
+    </w:p>
+    <w:tbl>
+      <w:tblPr>
+        <w:tblStyle w:val="TableGrid"/>
+        <w:tblW w:type="auto" w:w="0"/>
+        <w:tblLook w:firstColumn="1" w:firstRow="1" w:lastColumn="0" w:lastRow="0" w:noHBand="0" w:noVBand="1" w:val="04A0"/>
+      </w:tblPr>
+      <w:tblGrid>
+        <w:gridCol w:w="864"/>
+        <w:gridCol w:w="864"/>
+        <w:gridCol w:w="864"/>
+        <w:gridCol w:w="864"/>
+        <w:gridCol w:w="864"/>
+        <w:gridCol w:w="864"/>
+        <w:gridCol w:w="864"/>
+        <w:gridCol w:w="864"/>
+        <w:gridCol w:w="864"/>
+        <w:gridCol w:w="864"/>
+        <w:gridCol w:w="864"/>
+        <w:gridCol w:w="864"/>
+      </w:tblGrid>
+      <w:tr>
+        <w:tc>
+          <w:tcPr>
+            <w:tcW w:type="dxa" w:w="864"/>
+          </w:tcPr>
+          <w:p>
+            <w:r>
+              <w:rPr>
+                <w:rFonts w:ascii="Arial" w:hAnsi="Arial"/>
+                <w:b/>
+                <w:sz w:val="12"/>
+              </w:rPr>
+              <w:t>Veri seti</w:t>
+            </w:r>
+          </w:p>
+        </w:tc>
+        <w:tc>
+          <w:tcPr>
+            <w:tcW w:type="dxa" w:w="864"/>
+          </w:tcPr>
+          <w:p>
+            <w:r>
+              <w:rPr>
+                <w:rFonts w:ascii="Arial" w:hAnsi="Arial"/>
+                <w:b/>
+                <w:sz w:val="12"/>
+              </w:rPr>
+              <w:t>Aday</w:t>
+            </w:r>
+          </w:p>
+        </w:tc>
+        <w:tc>
+          <w:tcPr>
+            <w:tcW w:type="dxa" w:w="864"/>
+          </w:tcPr>
+          <w:p>
+            <w:r>
+              <w:rPr>
+                <w:rFonts w:ascii="Arial" w:hAnsi="Arial"/>
+                <w:b/>
+                <w:sz w:val="12"/>
+              </w:rPr>
+              <w:t>Zaman işlemi</w:t>
+            </w:r>
+          </w:p>
+        </w:tc>
+        <w:tc>
+          <w:tcPr>
+            <w:tcW w:type="dxa" w:w="864"/>
+          </w:tcPr>
+          <w:p>
+            <w:r>
+              <w:rPr>
+                <w:rFonts w:ascii="Arial" w:hAnsi="Arial"/>
+                <w:b/>
+                <w:sz w:val="12"/>
+              </w:rPr>
+              <w:t>Mel</w:t>
+            </w:r>
+          </w:p>
+        </w:tc>
+        <w:tc>
+          <w:tcPr>
+            <w:tcW w:type="dxa" w:w="864"/>
+          </w:tcPr>
+          <w:p>
+            <w:r>
+              <w:rPr>
+                <w:rFonts w:ascii="Arial" w:hAnsi="Arial"/>
+                <w:b/>
+                <w:sz w:val="12"/>
+              </w:rPr>
+              <w:t>Kare</w:t>
+            </w:r>
+          </w:p>
+        </w:tc>
+        <w:tc>
+          <w:tcPr>
+            <w:tcW w:type="dxa" w:w="864"/>
+          </w:tcPr>
+          <w:p>
+            <w:r>
+              <w:rPr>
+                <w:rFonts w:ascii="Arial" w:hAnsi="Arial"/>
+                <w:b/>
+                <w:sz w:val="12"/>
+              </w:rPr>
+              <w:t>Boyut</w:t>
+            </w:r>
+          </w:p>
+        </w:tc>
+        <w:tc>
+          <w:tcPr>
+            <w:tcW w:type="dxa" w:w="864"/>
+          </w:tcPr>
+          <w:p>
+            <w:r>
+              <w:rPr>
+                <w:rFonts w:ascii="Arial" w:hAnsi="Arial"/>
+                <w:b/>
+                <w:sz w:val="12"/>
+              </w:rPr>
+              <w:t>Koşu</w:t>
+            </w:r>
+          </w:p>
+        </w:tc>
+        <w:tc>
+          <w:tcPr>
+            <w:tcW w:type="dxa" w:w="864"/>
+          </w:tcPr>
+          <w:p>
+            <w:r>
+              <w:rPr>
+                <w:rFonts w:ascii="Arial" w:hAnsi="Arial"/>
+                <w:b/>
+                <w:sz w:val="12"/>
+              </w:rPr>
+              <w:t>Seed’ler</w:t>
+            </w:r>
+          </w:p>
+        </w:tc>
+        <w:tc>
+          <w:tcPr>
+            <w:tcW w:type="dxa" w:w="864"/>
+          </w:tcPr>
+          <w:p>
+            <w:r>
+              <w:rPr>
+                <w:rFonts w:ascii="Arial" w:hAnsi="Arial"/>
+                <w:b/>
+                <w:sz w:val="12"/>
+              </w:rPr>
+              <w:t>Macro-F1 ort. ± std</w:t>
+            </w:r>
+          </w:p>
+        </w:tc>
+        <w:tc>
+          <w:tcPr>
+            <w:tcW w:type="dxa" w:w="864"/>
+          </w:tcPr>
+          <w:p>
+            <w:r>
+              <w:rPr>
+                <w:rFonts w:ascii="Arial" w:hAnsi="Arial"/>
+                <w:b/>
+                <w:sz w:val="12"/>
+              </w:rPr>
+              <w:t>Minimum</w:t>
+            </w:r>
+          </w:p>
+        </w:tc>
+        <w:tc>
+          <w:tcPr>
+            <w:tcW w:type="dxa" w:w="864"/>
+          </w:tcPr>
+          <w:p>
+            <w:r>
+              <w:rPr>
+                <w:rFonts w:ascii="Arial" w:hAnsi="Arial"/>
+                <w:b/>
+                <w:sz w:val="12"/>
+              </w:rPr>
+              <w:t>Maksimum</w:t>
+            </w:r>
+          </w:p>
+        </w:tc>
+        <w:tc>
+          <w:tcPr>
+            <w:tcW w:type="dxa" w:w="864"/>
+          </w:tcPr>
+          <w:p>
+            <w:r>
+              <w:rPr>
+                <w:rFonts w:ascii="Arial" w:hAnsi="Arial"/>
+                <w:b/>
+                <w:sz w:val="12"/>
+              </w:rPr>
+              <w:t>Seçildi</w:t>
+            </w:r>
+          </w:p>
+        </w:tc>
+      </w:tr>
+      <w:tr>
+        <w:tc>
+          <w:tcPr>
+            <w:tcW w:type="dxa" w:w="864"/>
+          </w:tcPr>
+          <w:p>
+            <w:r>
+              <w:rPr>
+                <w:rFonts w:ascii="Arial" w:hAnsi="Arial"/>
+                <w:sz w:val="12"/>
+              </w:rPr>
+              <w:t>CREMA-D</w:t>
+            </w:r>
+          </w:p>
+        </w:tc>
+        <w:tc>
+          <w:tcPr>
+            <w:tcW w:type="dxa" w:w="864"/>
+          </w:tcPr>
+          <w:p>
+            <w:r>
+              <w:rPr>
+                <w:rFonts w:ascii="Arial" w:hAnsi="Arial"/>
+                <w:sz w:val="12"/>
+              </w:rPr>
+              <w:t>Ana temsil</w:t>
+            </w:r>
+          </w:p>
+        </w:tc>
+        <w:tc>
+          <w:tcPr>
+            <w:tcW w:type="dxa" w:w="864"/>
+          </w:tcPr>
+          <w:p>
+            <w:r>
+              <w:rPr>
+                <w:rFonts w:ascii="Arial" w:hAnsi="Arial"/>
+                <w:sz w:val="12"/>
+              </w:rPr>
+              <w:t>resize</w:t>
+            </w:r>
+          </w:p>
+        </w:tc>
+        <w:tc>
+          <w:tcPr>
+            <w:tcW w:type="dxa" w:w="864"/>
+          </w:tcPr>
+          <w:p>
+            <w:r>
+              <w:rPr>
+                <w:rFonts w:ascii="Arial" w:hAnsi="Arial"/>
+                <w:sz w:val="12"/>
+              </w:rPr>
+              <w:t>64</w:t>
+            </w:r>
+          </w:p>
+        </w:tc>
+        <w:tc>
+          <w:tcPr>
+            <w:tcW w:type="dxa" w:w="864"/>
+          </w:tcPr>
+          <w:p>
+            <w:r>
+              <w:rPr>
+                <w:rFonts w:ascii="Arial" w:hAnsi="Arial"/>
+                <w:sz w:val="12"/>
+              </w:rPr>
+              <w:t>64</w:t>
+            </w:r>
+          </w:p>
+        </w:tc>
+        <w:tc>
+          <w:tcPr>
+            <w:tcW w:type="dxa" w:w="864"/>
+          </w:tcPr>
+          <w:p>
+            <w:r>
+              <w:rPr>
+                <w:rFonts w:ascii="Arial" w:hAnsi="Arial"/>
+                <w:sz w:val="12"/>
+              </w:rPr>
+              <w:t>4096</w:t>
+            </w:r>
+          </w:p>
+        </w:tc>
+        <w:tc>
+          <w:tcPr>
+            <w:tcW w:type="dxa" w:w="864"/>
+          </w:tcPr>
+          <w:p>
+            <w:r>
+              <w:rPr>
+                <w:rFonts w:ascii="Arial" w:hAnsi="Arial"/>
+                <w:sz w:val="12"/>
+              </w:rPr>
+              <w:t>3</w:t>
+            </w:r>
+          </w:p>
+        </w:tc>
+        <w:tc>
+          <w:tcPr>
+            <w:tcW w:type="dxa" w:w="864"/>
+          </w:tcPr>
+          <w:p>
+            <w:r>
+              <w:rPr>
+                <w:rFonts w:ascii="Arial" w:hAnsi="Arial"/>
+                <w:sz w:val="12"/>
+              </w:rPr>
+              <w:t>42,143,244</w:t>
+            </w:r>
+          </w:p>
+        </w:tc>
+        <w:tc>
+          <w:tcPr>
+            <w:tcW w:type="dxa" w:w="864"/>
+          </w:tcPr>
+          <w:p>
+            <w:r>
+              <w:rPr>
+                <w:rFonts w:ascii="Arial" w:hAnsi="Arial"/>
+                <w:sz w:val="12"/>
+              </w:rPr>
+              <w:t>0.4644 ± 0.0063</w:t>
+            </w:r>
+          </w:p>
+        </w:tc>
+        <w:tc>
+          <w:tcPr>
+            <w:tcW w:type="dxa" w:w="864"/>
+          </w:tcPr>
+          <w:p>
+            <w:r>
+              <w:rPr>
+                <w:rFonts w:ascii="Arial" w:hAnsi="Arial"/>
+                <w:sz w:val="12"/>
+              </w:rPr>
+              <w:t>0.4558</w:t>
+            </w:r>
+          </w:p>
+        </w:tc>
+        <w:tc>
+          <w:tcPr>
+            <w:tcW w:type="dxa" w:w="864"/>
+          </w:tcPr>
+          <w:p>
+            <w:r>
+              <w:rPr>
+                <w:rFonts w:ascii="Arial" w:hAnsi="Arial"/>
+                <w:sz w:val="12"/>
+              </w:rPr>
+              <w:t>0.4707</w:t>
+            </w:r>
+          </w:p>
+        </w:tc>
+        <w:tc>
+          <w:tcPr>
+            <w:tcW w:type="dxa" w:w="864"/>
+          </w:tcPr>
+          <w:p>
+            <w:r>
+              <w:rPr>
+                <w:rFonts w:ascii="Arial" w:hAnsi="Arial"/>
+                <w:sz w:val="12"/>
+              </w:rPr>
+              <w:t>Evet</w:t>
+            </w:r>
+          </w:p>
+        </w:tc>
+      </w:tr>
+      <w:tr>
+        <w:tc>
+          <w:tcPr>
+            <w:tcW w:type="dxa" w:w="864"/>
+          </w:tcPr>
+          <w:p>
+            <w:r>
+              <w:rPr>
+                <w:rFonts w:ascii="Arial" w:hAnsi="Arial"/>
+                <w:sz w:val="12"/>
+              </w:rPr>
+              <w:t>CREMA-D</w:t>
+            </w:r>
+          </w:p>
+        </w:tc>
+        <w:tc>
+          <w:tcPr>
+            <w:tcW w:type="dxa" w:w="864"/>
+          </w:tcPr>
+          <w:p>
+            <w:r>
+              <w:rPr>
+                <w:rFonts w:ascii="Arial" w:hAnsi="Arial"/>
+                <w:sz w:val="12"/>
+              </w:rPr>
+              <w:t>Alternatif</w:t>
+            </w:r>
+          </w:p>
+        </w:tc>
+        <w:tc>
+          <w:tcPr>
+            <w:tcW w:type="dxa" w:w="864"/>
+          </w:tcPr>
+          <w:p>
+            <w:r>
+              <w:rPr>
+                <w:rFonts w:ascii="Arial" w:hAnsi="Arial"/>
+                <w:sz w:val="12"/>
+              </w:rPr>
+              <w:t>crop-pad</w:t>
+            </w:r>
+          </w:p>
+        </w:tc>
+        <w:tc>
+          <w:tcPr>
+            <w:tcW w:type="dxa" w:w="864"/>
+          </w:tcPr>
+          <w:p>
+            <w:r>
+              <w:rPr>
+                <w:rFonts w:ascii="Arial" w:hAnsi="Arial"/>
+                <w:sz w:val="12"/>
+              </w:rPr>
+              <w:t>96</w:t>
+            </w:r>
+          </w:p>
+        </w:tc>
+        <w:tc>
+          <w:tcPr>
+            <w:tcW w:type="dxa" w:w="864"/>
+          </w:tcPr>
+          <w:p>
+            <w:r>
+              <w:rPr>
+                <w:rFonts w:ascii="Arial" w:hAnsi="Arial"/>
+                <w:sz w:val="12"/>
+              </w:rPr>
+              <w:t>64</w:t>
+            </w:r>
+          </w:p>
+        </w:tc>
+        <w:tc>
+          <w:tcPr>
+            <w:tcW w:type="dxa" w:w="864"/>
+          </w:tcPr>
+          <w:p>
+            <w:r>
+              <w:rPr>
+                <w:rFonts w:ascii="Arial" w:hAnsi="Arial"/>
+                <w:sz w:val="12"/>
+              </w:rPr>
+              <w:t>6144</w:t>
+            </w:r>
+          </w:p>
+        </w:tc>
+        <w:tc>
+          <w:tcPr>
+            <w:tcW w:type="dxa" w:w="864"/>
+          </w:tcPr>
+          <w:p>
+            <w:r>
+              <w:rPr>
+                <w:rFonts w:ascii="Arial" w:hAnsi="Arial"/>
+                <w:sz w:val="12"/>
+              </w:rPr>
+              <w:t>3</w:t>
+            </w:r>
+          </w:p>
+        </w:tc>
+        <w:tc>
+          <w:tcPr>
+            <w:tcW w:type="dxa" w:w="864"/>
+          </w:tcPr>
+          <w:p>
+            <w:r>
+              <w:rPr>
+                <w:rFonts w:ascii="Arial" w:hAnsi="Arial"/>
+                <w:sz w:val="12"/>
+              </w:rPr>
+              <w:t>42,143,244</w:t>
+            </w:r>
+          </w:p>
+        </w:tc>
+        <w:tc>
+          <w:tcPr>
+            <w:tcW w:type="dxa" w:w="864"/>
+          </w:tcPr>
+          <w:p>
+            <w:r>
+              <w:rPr>
+                <w:rFonts w:ascii="Arial" w:hAnsi="Arial"/>
+                <w:sz w:val="12"/>
+              </w:rPr>
+              <w:t>0.4549 ± 0.0119</w:t>
+            </w:r>
+          </w:p>
+        </w:tc>
+        <w:tc>
+          <w:tcPr>
+            <w:tcW w:type="dxa" w:w="864"/>
+          </w:tcPr>
+          <w:p>
+            <w:r>
+              <w:rPr>
+                <w:rFonts w:ascii="Arial" w:hAnsi="Arial"/>
+                <w:sz w:val="12"/>
+              </w:rPr>
+              <w:t>0.4422</w:t>
+            </w:r>
+          </w:p>
+        </w:tc>
+        <w:tc>
+          <w:tcPr>
+            <w:tcW w:type="dxa" w:w="864"/>
+          </w:tcPr>
+          <w:p>
+            <w:r>
+              <w:rPr>
+                <w:rFonts w:ascii="Arial" w:hAnsi="Arial"/>
+                <w:sz w:val="12"/>
+              </w:rPr>
+              <w:t>0.4707</w:t>
+            </w:r>
+          </w:p>
+        </w:tc>
+        <w:tc>
+          <w:tcPr>
+            <w:tcW w:type="dxa" w:w="864"/>
+          </w:tcPr>
+          <w:p>
+            <w:r>
+              <w:rPr>
+                <w:rFonts w:ascii="Arial" w:hAnsi="Arial"/>
+                <w:sz w:val="12"/>
+              </w:rPr>
+              <w:t>Hayır</w:t>
+            </w:r>
+          </w:p>
+        </w:tc>
+      </w:tr>
+      <w:tr>
+        <w:tc>
+          <w:tcPr>
+            <w:tcW w:type="dxa" w:w="864"/>
+          </w:tcPr>
+          <w:p>
+            <w:r>
+              <w:rPr>
+                <w:rFonts w:ascii="Arial" w:hAnsi="Arial"/>
+                <w:sz w:val="12"/>
+              </w:rPr>
+              <w:t>MELD</w:t>
+            </w:r>
+          </w:p>
+        </w:tc>
+        <w:tc>
+          <w:tcPr>
+            <w:tcW w:type="dxa" w:w="864"/>
+          </w:tcPr>
+          <w:p>
+            <w:r>
+              <w:rPr>
+                <w:rFonts w:ascii="Arial" w:hAnsi="Arial"/>
+                <w:sz w:val="12"/>
+              </w:rPr>
+              <w:t>Ana temsil</w:t>
+            </w:r>
+          </w:p>
+        </w:tc>
+        <w:tc>
+          <w:tcPr>
+            <w:tcW w:type="dxa" w:w="864"/>
+          </w:tcPr>
+          <w:p>
+            <w:r>
+              <w:rPr>
+                <w:rFonts w:ascii="Arial" w:hAnsi="Arial"/>
+                <w:sz w:val="12"/>
+              </w:rPr>
+              <w:t>crop-pad</w:t>
+            </w:r>
+          </w:p>
+        </w:tc>
+        <w:tc>
+          <w:tcPr>
+            <w:tcW w:type="dxa" w:w="864"/>
+          </w:tcPr>
+          <w:p>
+            <w:r>
+              <w:rPr>
+                <w:rFonts w:ascii="Arial" w:hAnsi="Arial"/>
+                <w:sz w:val="12"/>
+              </w:rPr>
+              <w:t>64</w:t>
+            </w:r>
+          </w:p>
+        </w:tc>
+        <w:tc>
+          <w:tcPr>
+            <w:tcW w:type="dxa" w:w="864"/>
+          </w:tcPr>
+          <w:p>
+            <w:r>
+              <w:rPr>
+                <w:rFonts w:ascii="Arial" w:hAnsi="Arial"/>
+                <w:sz w:val="12"/>
+              </w:rPr>
+              <w:t>64</w:t>
+            </w:r>
+          </w:p>
+        </w:tc>
+        <w:tc>
+          <w:tcPr>
+            <w:tcW w:type="dxa" w:w="864"/>
+          </w:tcPr>
+          <w:p>
+            <w:r>
+              <w:rPr>
+                <w:rFonts w:ascii="Arial" w:hAnsi="Arial"/>
+                <w:sz w:val="12"/>
+              </w:rPr>
+              <w:t>4096</w:t>
+            </w:r>
+          </w:p>
+        </w:tc>
+        <w:tc>
+          <w:tcPr>
+            <w:tcW w:type="dxa" w:w="864"/>
+          </w:tcPr>
+          <w:p>
+            <w:r>
+              <w:rPr>
+                <w:rFonts w:ascii="Arial" w:hAnsi="Arial"/>
+                <w:sz w:val="12"/>
+              </w:rPr>
+              <w:t>3</w:t>
+            </w:r>
+          </w:p>
+        </w:tc>
+        <w:tc>
+          <w:tcPr>
+            <w:tcW w:type="dxa" w:w="864"/>
+          </w:tcPr>
+          <w:p>
+            <w:r>
+              <w:rPr>
+                <w:rFonts w:ascii="Arial" w:hAnsi="Arial"/>
+                <w:sz w:val="12"/>
+              </w:rPr>
+              <w:t>42,143,244</w:t>
+            </w:r>
+          </w:p>
+        </w:tc>
+        <w:tc>
+          <w:tcPr>
+            <w:tcW w:type="dxa" w:w="864"/>
+          </w:tcPr>
+          <w:p>
+            <w:r>
+              <w:rPr>
+                <w:rFonts w:ascii="Arial" w:hAnsi="Arial"/>
+                <w:sz w:val="12"/>
+              </w:rPr>
+              <w:t>0.2370 ± 0.0117</w:t>
+            </w:r>
+          </w:p>
+        </w:tc>
+        <w:tc>
+          <w:tcPr>
+            <w:tcW w:type="dxa" w:w="864"/>
+          </w:tcPr>
+          <w:p>
+            <w:r>
+              <w:rPr>
+                <w:rFonts w:ascii="Arial" w:hAnsi="Arial"/>
+                <w:sz w:val="12"/>
+              </w:rPr>
+              <w:t>0.2245</w:t>
+            </w:r>
+          </w:p>
+        </w:tc>
+        <w:tc>
+          <w:tcPr>
+            <w:tcW w:type="dxa" w:w="864"/>
+          </w:tcPr>
+          <w:p>
+            <w:r>
+              <w:rPr>
+                <w:rFonts w:ascii="Arial" w:hAnsi="Arial"/>
+                <w:sz w:val="12"/>
+              </w:rPr>
+              <w:t>0.2525</w:t>
+            </w:r>
+          </w:p>
+        </w:tc>
+        <w:tc>
+          <w:tcPr>
+            <w:tcW w:type="dxa" w:w="864"/>
+          </w:tcPr>
+          <w:p>
+            <w:r>
+              <w:rPr>
+                <w:rFonts w:ascii="Arial" w:hAnsi="Arial"/>
+                <w:sz w:val="12"/>
+              </w:rPr>
+              <w:t>Evet</w:t>
+            </w:r>
+          </w:p>
+        </w:tc>
+      </w:tr>
+      <w:tr>
+        <w:tc>
+          <w:tcPr>
+            <w:tcW w:type="dxa" w:w="864"/>
+          </w:tcPr>
+          <w:p>
+            <w:r>
+              <w:rPr>
+                <w:rFonts w:ascii="Arial" w:hAnsi="Arial"/>
+                <w:sz w:val="12"/>
+              </w:rPr>
+              <w:t>MELD</w:t>
+            </w:r>
+          </w:p>
+        </w:tc>
+        <w:tc>
+          <w:tcPr>
+            <w:tcW w:type="dxa" w:w="864"/>
+          </w:tcPr>
+          <w:p>
+            <w:r>
+              <w:rPr>
+                <w:rFonts w:ascii="Arial" w:hAnsi="Arial"/>
+                <w:sz w:val="12"/>
+              </w:rPr>
+              <w:t>Alternatif</w:t>
+            </w:r>
+          </w:p>
+        </w:tc>
+        <w:tc>
+          <w:tcPr>
+            <w:tcW w:type="dxa" w:w="864"/>
+          </w:tcPr>
+          <w:p>
+            <w:r>
+              <w:rPr>
+                <w:rFonts w:ascii="Arial" w:hAnsi="Arial"/>
+                <w:sz w:val="12"/>
+              </w:rPr>
+              <w:t>resize</w:t>
+            </w:r>
+          </w:p>
+        </w:tc>
+        <w:tc>
+          <w:tcPr>
+            <w:tcW w:type="dxa" w:w="864"/>
+          </w:tcPr>
+          <w:p>
+            <w:r>
+              <w:rPr>
+                <w:rFonts w:ascii="Arial" w:hAnsi="Arial"/>
+                <w:sz w:val="12"/>
+              </w:rPr>
+              <w:t>80</w:t>
+            </w:r>
+          </w:p>
+        </w:tc>
+        <w:tc>
+          <w:tcPr>
+            <w:tcW w:type="dxa" w:w="864"/>
+          </w:tcPr>
+          <w:p>
+            <w:r>
+              <w:rPr>
+                <w:rFonts w:ascii="Arial" w:hAnsi="Arial"/>
+                <w:sz w:val="12"/>
+              </w:rPr>
+              <w:t>64</w:t>
+            </w:r>
+          </w:p>
+        </w:tc>
+        <w:tc>
+          <w:tcPr>
+            <w:tcW w:type="dxa" w:w="864"/>
+          </w:tcPr>
+          <w:p>
+            <w:r>
+              <w:rPr>
+                <w:rFonts w:ascii="Arial" w:hAnsi="Arial"/>
+                <w:sz w:val="12"/>
+              </w:rPr>
+              <w:t>5120</w:t>
+            </w:r>
+          </w:p>
+        </w:tc>
+        <w:tc>
+          <w:tcPr>
+            <w:tcW w:type="dxa" w:w="864"/>
+          </w:tcPr>
+          <w:p>
+            <w:r>
+              <w:rPr>
+                <w:rFonts w:ascii="Arial" w:hAnsi="Arial"/>
+                <w:sz w:val="12"/>
+              </w:rPr>
+              <w:t>3</w:t>
+            </w:r>
+          </w:p>
+        </w:tc>
+        <w:tc>
+          <w:tcPr>
+            <w:tcW w:type="dxa" w:w="864"/>
+          </w:tcPr>
+          <w:p>
+            <w:r>
+              <w:rPr>
+                <w:rFonts w:ascii="Arial" w:hAnsi="Arial"/>
+                <w:sz w:val="12"/>
+              </w:rPr>
+              <w:t>42,143,244</w:t>
+            </w:r>
+          </w:p>
+        </w:tc>
+        <w:tc>
+          <w:tcPr>
+            <w:tcW w:type="dxa" w:w="864"/>
+          </w:tcPr>
+          <w:p>
+            <w:r>
+              <w:rPr>
+                <w:rFonts w:ascii="Arial" w:hAnsi="Arial"/>
+                <w:sz w:val="12"/>
+              </w:rPr>
+              <w:t>0.2214 ± 0.0123</w:t>
+            </w:r>
+          </w:p>
+        </w:tc>
+        <w:tc>
+          <w:tcPr>
+            <w:tcW w:type="dxa" w:w="864"/>
+          </w:tcPr>
+          <w:p>
+            <w:r>
+              <w:rPr>
+                <w:rFonts w:ascii="Arial" w:hAnsi="Arial"/>
+                <w:sz w:val="12"/>
+              </w:rPr>
+              <w:t>0.2102</w:t>
+            </w:r>
+          </w:p>
+        </w:tc>
+        <w:tc>
+          <w:tcPr>
+            <w:tcW w:type="dxa" w:w="864"/>
+          </w:tcPr>
+          <w:p>
+            <w:r>
+              <w:rPr>
+                <w:rFonts w:ascii="Arial" w:hAnsi="Arial"/>
+                <w:sz w:val="12"/>
+              </w:rPr>
+              <w:t>0.2386</w:t>
+            </w:r>
+          </w:p>
+        </w:tc>
+        <w:tc>
+          <w:tcPr>
+            <w:tcW w:type="dxa" w:w="864"/>
+          </w:tcPr>
+          <w:p>
+            <w:r>
+              <w:rPr>
+                <w:rFonts w:ascii="Arial" w:hAnsi="Arial"/>
+                <w:sz w:val="12"/>
+              </w:rPr>
+              <w:t>Hayır</w:t>
+            </w:r>
+          </w:p>
+        </w:tc>
+      </w:tr>
+    </w:tbl>
+    <w:p/>
+    <w:p>
+      <w:pPr>
+        <w:spacing w:after="120"/>
+      </w:pPr>
+      <w:r>
+        <w:t>CREMA-D ana 64×64 temsilinin üç-seed validation macro-F1 değeri 0.4644 ± 0.0063, alternatifin değeri 0.4549 ± 0.0119; ortalama fark +0.0095 olmuştur. Ana temsil eşleştirilmiş 3 seed’in 2 tanesinde daha yüksek macro-F1 üretmiştir. MELD ana 64×64 temsilinin üç-seed validation macro-F1 değeri 0.2370 ± 0.0117, alternatifin değeri 0.2214 ± 0.0123; ortalama fark +0.0156 olmuştur. Ana temsil eşleştirilmiş 3 seed’in 3 tanesinde daha yüksek macro-F1 üretmiştir. Seed 42 ile yeniden eğitilen 4 aday, ilk ablation koşularındaki macro-F1 değerlerini tam olarak yeniden üretmiş; maksimum mutlak fark 0.0000000000 olmuştur. Bu doğrulamada yalnız train ve validation özellikleri yüklenmiş, held-out test kayıtları model veya temsil seçiminde kullanılmamıştır.</w:t>
+      </w:r>
+    </w:p>
+    <w:p>
+      <w:pPr>
+        <w:jc w:val="center"/>
+      </w:pPr>
+      <w:r>
+        <w:drawing>
+          <wp:inline xmlns:a="http://schemas.openxmlformats.org/drawingml/2006/main" xmlns:pic="http://schemas.openxmlformats.org/drawingml/2006/picture">
+            <wp:extent cx="5577840" cy="3563620"/>
+            <wp:docPr id="1" name="Picture 1"/>
+            <wp:cNvGraphicFramePr>
+              <a:graphicFrameLocks noChangeAspect="1"/>
+            </wp:cNvGraphicFramePr>
+            <a:graphic>
+              <a:graphicData uri="http://schemas.openxmlformats.org/drawingml/2006/picture">
+                <pic:pic>
+                  <pic:nvPicPr>
+                    <pic:cNvPr id="0" name="feature_stability.png"/>
+                    <pic:cNvPicPr/>
+                  </pic:nvPicPr>
+                  <pic:blipFill>
+                    <a:blip r:embed="rId9"/>
+                    <a:stretch>
+                      <a:fillRect/>
+                    </a:stretch>
+                  </pic:blipFill>
+                  <pic:spPr>
+                    <a:xfrm>
+                      <a:off x="0" y="0"/>
+                      <a:ext cx="5577840" cy="3563620"/>
+                    </a:xfrm>
+                    <a:prstGeom prst="rect"/>
+                  </pic:spPr>
+                </pic:pic>
+              </a:graphicData>
+            </a:graphic>
+          </wp:inline>
+        </w:drawing>
+      </w:r>
+    </w:p>
+    <w:p>
+      <w:pPr>
+        <w:jc w:val="center"/>
+      </w:pPr>
+      <w:r>
+        <w:rPr>
+          <w:i/>
+          <w:sz w:val="18"/>
+        </w:rPr>
+        <w:t>CREMA-D için üç seed sonucu, ortalama ve standart sapma.</w:t>
+      </w:r>
+    </w:p>
+    <w:p>
+      <w:pPr>
+        <w:jc w:val="center"/>
+      </w:pPr>
+      <w:r>
+        <w:drawing>
+          <wp:inline xmlns:a="http://schemas.openxmlformats.org/drawingml/2006/main" xmlns:pic="http://schemas.openxmlformats.org/drawingml/2006/picture">
+            <wp:extent cx="5577840" cy="3563620"/>
+            <wp:docPr id="2" name="Picture 2"/>
+            <wp:cNvGraphicFramePr>
+              <a:graphicFrameLocks noChangeAspect="1"/>
+            </wp:cNvGraphicFramePr>
+            <a:graphic>
+              <a:graphicData uri="http://schemas.openxmlformats.org/drawingml/2006/picture">
+                <pic:pic>
+                  <pic:nvPicPr>
+                    <pic:cNvPr id="0" name="feature_stability.png"/>
+                    <pic:cNvPicPr/>
+                  </pic:nvPicPr>
+                  <pic:blipFill>
+                    <a:blip r:embed="rId10"/>
+                    <a:stretch>
+                      <a:fillRect/>
+                    </a:stretch>
+                  </pic:blipFill>
+                  <pic:spPr>
+                    <a:xfrm>
+                      <a:off x="0" y="0"/>
+                      <a:ext cx="5577840" cy="3563620"/>
+                    </a:xfrm>
+                    <a:prstGeom prst="rect"/>
+                  </pic:spPr>
+                </pic:pic>
+              </a:graphicData>
+            </a:graphic>
+          </wp:inline>
+        </w:drawing>
+      </w:r>
+    </w:p>
+    <w:p>
+      <w:pPr>
+        <w:jc w:val="center"/>
+      </w:pPr>
+      <w:r>
+        <w:rPr>
+          <w:i/>
+          <w:sz w:val="18"/>
+        </w:rPr>
+        <w:t>MELD için üç seed sonucu, ortalama ve standart sapma.</w:t>
       </w:r>
     </w:p>
     <w:p>
@@ -6173,7 +7693,7 @@
         <w:spacing w:after="120"/>
       </w:pPr>
       <w:r>
-        <w:t>MLP tamamen PyTorch ile sıfırdan kurulmuştur. Her gizli blok Linear → isteğe bağlı BatchNorm1d → aktivasyon → Dropout sırasındadır. Çıkış katmanı altı logit üretir. Eğitimde weighted CrossEntropyLoss, AdamW, gradient norm clipping (1.0) ve validation macro-F1 tabanlı erken durdurma kullanılmıştır. Üst sınır 60 epoch’tur.</w:t>
+        <w:t>MLP tamamen PyTorch ile sıfırdan kurulmuştur. Her gizli blok Linear → isteğe bağlı BatchNorm1d → aktivasyon → Dropout sırasındadır. Çıkış katmanı altı logit üretir. Eğitimde weighted CrossEntropyLoss, AdamW, gradient norm clipping (5.0) ve validation macro-F1 tabanlı erken durdurma kullanılmıştır. Üst sınır 60 epoch’tur.</w:t>
       </w:r>
     </w:p>
     <w:p>
@@ -6181,7 +7701,7 @@
         <w:rPr>
           <w:b/>
         </w:rPr>
-        <w:t>Tablo 4. Nihai veri-kümesine özel MLP mimarileri</w:t>
+        <w:t>Tablo 5. Nihai veri-kümesine özel MLP mimarileri</w:t>
       </w:r>
     </w:p>
     <w:tbl>
@@ -6573,7 +8093,7 @@
         <w:rPr>
           <w:b/>
         </w:rPr>
-        <w:t>Tablo 5. Gerçekten taranan hiperparametre değerleri</w:t>
+        <w:t>Tablo 6. Gerçekten taranan hiperparametre değerleri</w:t>
       </w:r>
     </w:p>
     <w:tbl>
@@ -7089,7 +8609,7 @@
         <w:rPr>
           <w:b/>
         </w:rPr>
-        <w:t>Tablo 6. CREMA-D hiperparametre deneyleri</w:t>
+        <w:t>Tablo 7. CREMA-D hiperparametre deneyleri</w:t>
       </w:r>
     </w:p>
     <w:tbl>
@@ -13669,7 +15189,7 @@
         <w:rPr>
           <w:b/>
         </w:rPr>
-        <w:t>Tablo 7. CREMA-D geçerleme performansları</w:t>
+        <w:t>Tablo 8. CREMA-D geçerleme performansları</w:t>
       </w:r>
     </w:p>
     <w:tbl>
@@ -18401,7 +19921,7 @@
         <w:rPr>
           <w:b/>
         </w:rPr>
-        <w:t>Tablo 8. MELD hiperparametre deneyleri</w:t>
+        <w:t>Tablo 9. MELD hiperparametre deneyleri</w:t>
       </w:r>
     </w:p>
     <w:tbl>
@@ -24981,7 +26501,7 @@
         <w:rPr>
           <w:b/>
         </w:rPr>
-        <w:t>Tablo 9. MELD geçerleme performansları</w:t>
+        <w:t>Tablo 10. MELD geçerleme performansları</w:t>
       </w:r>
     </w:p>
     <w:tbl>
@@ -29713,7 +31233,7 @@
         <w:rPr>
           <w:b/>
         </w:rPr>
-        <w:t>Tablo 10. Seçilen yapıların seed duyarlılığı</w:t>
+        <w:t>Tablo 11. Seçilen yapıların seed duyarlılığı</w:t>
       </w:r>
     </w:p>
     <w:tbl>
@@ -30520,7 +32040,7 @@
         <w:drawing>
           <wp:inline xmlns:a="http://schemas.openxmlformats.org/drawingml/2006/main" xmlns:pic="http://schemas.openxmlformats.org/drawingml/2006/picture">
             <wp:extent cx="5577840" cy="2231136"/>
-            <wp:docPr id="1" name="Picture 1"/>
+            <wp:docPr id="3" name="Picture 3"/>
             <wp:cNvGraphicFramePr>
               <a:graphicFrameLocks noChangeAspect="1"/>
             </wp:cNvGraphicFramePr>
@@ -30532,7 +32052,7 @@
                     <pic:cNvPicPr/>
                   </pic:nvPicPr>
                   <pic:blipFill>
-                    <a:blip r:embed="rId9"/>
+                    <a:blip r:embed="rId11"/>
                     <a:stretch>
                       <a:fillRect/>
                     </a:stretch>
@@ -30571,7 +32091,7 @@
         <w:drawing>
           <wp:inline xmlns:a="http://schemas.openxmlformats.org/drawingml/2006/main" xmlns:pic="http://schemas.openxmlformats.org/drawingml/2006/picture">
             <wp:extent cx="5577840" cy="2231136"/>
-            <wp:docPr id="2" name="Picture 2"/>
+            <wp:docPr id="4" name="Picture 4"/>
             <wp:cNvGraphicFramePr>
               <a:graphicFrameLocks noChangeAspect="1"/>
             </wp:cNvGraphicFramePr>
@@ -30583,7 +32103,7 @@
                     <pic:cNvPicPr/>
                   </pic:nvPicPr>
                   <pic:blipFill>
-                    <a:blip r:embed="rId10"/>
+                    <a:blip r:embed="rId12"/>
                     <a:stretch>
                       <a:fillRect/>
                     </a:stretch>
@@ -32262,7 +33782,7 @@
         <w:drawing>
           <wp:inline xmlns:a="http://schemas.openxmlformats.org/drawingml/2006/main" xmlns:pic="http://schemas.openxmlformats.org/drawingml/2006/picture">
             <wp:extent cx="5577840" cy="2332551"/>
-            <wp:docPr id="3" name="Picture 3"/>
+            <wp:docPr id="5" name="Picture 5"/>
             <wp:cNvGraphicFramePr>
               <a:graphicFrameLocks noChangeAspect="1"/>
             </wp:cNvGraphicFramePr>
@@ -32274,7 +33794,7 @@
                     <pic:cNvPicPr/>
                   </pic:nvPicPr>
                   <pic:blipFill>
-                    <a:blip r:embed="rId11"/>
+                    <a:blip r:embed="rId13"/>
                     <a:stretch>
                       <a:fillRect/>
                     </a:stretch>
@@ -32313,7 +33833,7 @@
         <w:drawing>
           <wp:inline xmlns:a="http://schemas.openxmlformats.org/drawingml/2006/main" xmlns:pic="http://schemas.openxmlformats.org/drawingml/2006/picture">
             <wp:extent cx="5577840" cy="2332551"/>
-            <wp:docPr id="4" name="Picture 4"/>
+            <wp:docPr id="6" name="Picture 6"/>
             <wp:cNvGraphicFramePr>
               <a:graphicFrameLocks noChangeAspect="1"/>
             </wp:cNvGraphicFramePr>
@@ -32325,7 +33845,7 @@
                     <pic:cNvPicPr/>
                   </pic:nvPicPr>
                   <pic:blipFill>
-                    <a:blip r:embed="rId12"/>
+                    <a:blip r:embed="rId14"/>
                     <a:stretch>
                       <a:fillRect/>
                     </a:stretch>
@@ -33512,7 +35032,7 @@
         <w:drawing>
           <wp:inline xmlns:a="http://schemas.openxmlformats.org/drawingml/2006/main" xmlns:pic="http://schemas.openxmlformats.org/drawingml/2006/picture">
             <wp:extent cx="5577840" cy="4621639"/>
-            <wp:docPr id="5" name="Picture 5"/>
+            <wp:docPr id="7" name="Picture 7"/>
             <wp:cNvGraphicFramePr>
               <a:graphicFrameLocks noChangeAspect="1"/>
             </wp:cNvGraphicFramePr>
@@ -33524,7 +35044,7 @@
                     <pic:cNvPicPr/>
                   </pic:nvPicPr>
                   <pic:blipFill>
-                    <a:blip r:embed="rId13"/>
+                    <a:blip r:embed="rId15"/>
                     <a:stretch>
                       <a:fillRect/>
                     </a:stretch>
@@ -33563,7 +35083,7 @@
         <w:drawing>
           <wp:inline xmlns:a="http://schemas.openxmlformats.org/drawingml/2006/main" xmlns:pic="http://schemas.openxmlformats.org/drawingml/2006/picture">
             <wp:extent cx="5577840" cy="4621639"/>
-            <wp:docPr id="6" name="Picture 6"/>
+            <wp:docPr id="8" name="Picture 8"/>
             <wp:cNvGraphicFramePr>
               <a:graphicFrameLocks noChangeAspect="1"/>
             </wp:cNvGraphicFramePr>
@@ -33575,7 +35095,7 @@
                     <pic:cNvPicPr/>
                   </pic:nvPicPr>
                   <pic:blipFill>
-                    <a:blip r:embed="rId14"/>
+                    <a:blip r:embed="rId16"/>
                     <a:stretch>
                       <a:fillRect/>
                     </a:stretch>
@@ -34939,7 +36459,7 @@
         <w:spacing w:after="120"/>
       </w:pPr>
       <w:r>
-        <w:t>Bu aşamada 2 veri kümesi için toplam 64 hiperparametre/seed koşusu ve 16 özellik ablation koşusu tamamlanmıştır. Her veri kümesi için bağımsız, sıfırdan PyTorch MLP modeli; train-only normalizasyon; sınıf ağırlıklı kayıp; erken durdurma; kaydedilmiş checkpoint; test tahminleri, karmaşıklık matrisi, bootstrap belirsizliği, validation-temelli temperature scaling ve güvenilirlik diyagramları üretilmiştir. Ölçekleme her iki veri kümesinde test NLL, Brier ve ECE değerlerini düşürmüş; sınıf tahminlerini ve sınıflandırma metriklerini değiştirmemiştir.</w:t>
+        <w:t>Bu aşamada 2 veri kümesi için toplam 64 hiperparametre/seed koşusu, 16 özellik ablation koşusu ve 12 çoklu-seed özellik doğrulama koşusu tamamlanmıştır. Her veri kümesi için bağımsız, sıfırdan PyTorch MLP modeli; train-only normalizasyon; sınıf ağırlıklı kayıp; erken durdurma; kaydedilmiş checkpoint; test tahminleri, karmaşıklık matrisi, bootstrap belirsizliği, validation-temelli temperature scaling ve güvenilirlik diyagramları üretilmiştir. Ölçekleme her iki veri kümesinde test NLL, Brier ve ECE değerlerini düşürmüş; sınıf tahminlerini ve sınıflandırma metriklerini değiştirmemiştir.</w:t>
       </w:r>
     </w:p>
     <w:p>
@@ -34972,14 +36492,6 @@
       </w:pPr>
       <w:r>
         <w:t>Seed duyarlılığını azaltmak için daha fazla tekrar ve doğrulama temelli olasılık ortalamalı MLP ensemble araştırılması.</w:t>
-      </w:r>
-    </w:p>
-    <w:p>
-      <w:pPr>
-        <w:pStyle w:val="ListBullet"/>
-      </w:pPr>
-      <w:r>
-        <w:t>CREMA-D’de 96×64 crop-pad adayının küçük validation kazancının çoklu seed koşularıyla doğrulanması.</w:t>
       </w:r>
     </w:p>
     <w:p>
@@ -35332,6 +36844,50 @@
                 <w:sz w:val="16"/>
               </w:rPr>
               <w:t>validation_results.csv tabloları</w:t>
+            </w:r>
+          </w:p>
+        </w:tc>
+      </w:tr>
+      <w:tr>
+        <w:tc>
+          <w:tcPr>
+            <w:tcW w:type="dxa" w:w="3456"/>
+          </w:tcPr>
+          <w:p>
+            <w:r>
+              <w:rPr>
+                <w:rFonts w:ascii="Arial" w:hAnsi="Arial"/>
+                <w:sz w:val="16"/>
+              </w:rPr>
+              <w:t>Özellik seçimi çoklu seed ile doğrulandı</w:t>
+            </w:r>
+          </w:p>
+        </w:tc>
+        <w:tc>
+          <w:tcPr>
+            <w:tcW w:type="dxa" w:w="3456"/>
+          </w:tcPr>
+          <w:p>
+            <w:r>
+              <w:rPr>
+                <w:rFonts w:ascii="Arial" w:hAnsi="Arial"/>
+                <w:sz w:val="16"/>
+              </w:rPr>
+              <w:t>Evet</w:t>
+            </w:r>
+          </w:p>
+        </w:tc>
+        <w:tc>
+          <w:tcPr>
+            <w:tcW w:type="dxa" w:w="3456"/>
+          </w:tcPr>
+          <w:p>
+            <w:r>
+              <w:rPr>
+                <w:rFonts w:ascii="Arial" w:hAnsi="Arial"/>
+                <w:sz w:val="16"/>
+              </w:rPr>
+              <w:t>feature_stability.csv ve üç-seed PNG</w:t>
             </w:r>
           </w:p>
         </w:tc>

</xml_diff>

<commit_message>
Add descriptive hyperparameter effect analysis
</commit_message>
<xml_diff>
--- a/odev3/PROJE_ILERLEME_RAPORU_3.docx
+++ b/odev3/PROJE_ILERLEME_RAPORU_3.docx
@@ -654,6 +654,36 @@
                 <w:rFonts w:ascii="Arial" w:hAnsi="Arial"/>
                 <w:sz w:val="16"/>
               </w:rPr>
+              <w:t>odev3/hyperparameter_effects.py</w:t>
+            </w:r>
+          </w:p>
+        </w:tc>
+        <w:tc>
+          <w:tcPr>
+            <w:tcW w:type="dxa" w:w="5184"/>
+          </w:tcPr>
+          <w:p>
+            <w:r>
+              <w:rPr>
+                <w:rFonts w:ascii="Arial" w:hAnsi="Arial"/>
+                <w:sz w:val="16"/>
+              </w:rPr>
+              <w:t>Tarama ve iyileştirme koşularını parametre değerlerine göre gruplayıp koşu sayısı, ortalama, sapma ve performans farklarını özetler.</w:t>
+            </w:r>
+          </w:p>
+        </w:tc>
+      </w:tr>
+      <w:tr>
+        <w:tc>
+          <w:tcPr>
+            <w:tcW w:type="dxa" w:w="5184"/>
+          </w:tcPr>
+          <w:p>
+            <w:r>
+              <w:rPr>
+                <w:rFonts w:ascii="Arial" w:hAnsi="Arial"/>
+                <w:sz w:val="16"/>
+              </w:rPr>
               <w:t>odev3/pipeline.py</w:t>
             </w:r>
           </w:p>
@@ -743,6 +773,14 @@
         <w:spacing w:after="120"/>
       </w:pPr>
       <w:r>
+        <w:t>Hiperparametre etki özeti: python -m odev3.hyperparameter_effects --corpora cremad meld --output-root odev3/outputs --analysis-root odev3/hyperparameter_effects</w:t>
+      </w:r>
+    </w:p>
+    <w:p>
+      <w:pPr>
+        <w:spacing w:after="120"/>
+      </w:pPr>
+      <w:r>
         <w:t>Rapor: python odev3/build_report.py --output-root odev3/outputs</w:t>
       </w:r>
     </w:p>
@@ -1433,7 +1471,7 @@
                 <w:rFonts w:ascii="Arial" w:hAnsi="Arial"/>
                 <w:sz w:val="16"/>
               </w:rPr>
-              <w:t>odev3/feature_stability/cremad/feature_stability_runs.csv</w:t>
+              <w:t>odev3/hyperparameter_effects/cremad/parameter_effects.csv</w:t>
             </w:r>
           </w:p>
         </w:tc>
@@ -1447,7 +1485,7 @@
                 <w:rFonts w:ascii="Arial" w:hAnsi="Arial"/>
                 <w:sz w:val="16"/>
               </w:rPr>
-              <w:t>İki temsil × üç seed ham validation koşuları</w:t>
+              <w:t>Her parametre değeri için validation macro-F1 dağılımı</w:t>
             </w:r>
           </w:p>
         </w:tc>
@@ -1461,7 +1499,7 @@
                 <w:rFonts w:ascii="Arial" w:hAnsi="Arial"/>
                 <w:sz w:val="16"/>
               </w:rPr>
-              <w:t>Hazır (2.8 KB)</w:t>
+              <w:t>Hazır (4.5 KB)</w:t>
             </w:r>
           </w:p>
         </w:tc>
@@ -1491,7 +1529,7 @@
                 <w:rFonts w:ascii="Arial" w:hAnsi="Arial"/>
                 <w:sz w:val="16"/>
               </w:rPr>
-              <w:t>odev3/feature_stability/cremad/feature_stability.csv</w:t>
+              <w:t>odev3/hyperparameter_effects/cremad/parameter_effect_overview.csv</w:t>
             </w:r>
           </w:p>
         </w:tc>
@@ -1505,7 +1543,7 @@
                 <w:rFonts w:ascii="Arial" w:hAnsi="Arial"/>
                 <w:sz w:val="16"/>
               </w:rPr>
-              <w:t>Üç-seed ortalama, standart sapma ve sıralama</w:t>
+              <w:t>En güçlü ve zayıf betimsel parametre grupları</w:t>
             </w:r>
           </w:p>
         </w:tc>
@@ -1519,7 +1557,7 @@
                 <w:rFonts w:ascii="Arial" w:hAnsi="Arial"/>
                 <w:sz w:val="16"/>
               </w:rPr>
-              <w:t>Hazır (0.8 KB)</w:t>
+              <w:t>Hazır (1.4 KB)</w:t>
             </w:r>
           </w:p>
         </w:tc>
@@ -1549,7 +1587,7 @@
                 <w:rFonts w:ascii="Arial" w:hAnsi="Arial"/>
                 <w:sz w:val="16"/>
               </w:rPr>
-              <w:t>odev3/feature_stability/cremad/feature_stability_comparison.json</w:t>
+              <w:t>odev3/feature_stability/cremad/feature_stability_runs.csv</w:t>
             </w:r>
           </w:p>
         </w:tc>
@@ -1563,7 +1601,7 @@
                 <w:rFonts w:ascii="Arial" w:hAnsi="Arial"/>
                 <w:sz w:val="16"/>
               </w:rPr>
-              <w:t>Eşleştirilmiş seed farkları ve aday kazanım sayıları</w:t>
+              <w:t>İki temsil × üç seed ham validation koşuları</w:t>
             </w:r>
           </w:p>
         </w:tc>
@@ -1577,7 +1615,7 @@
                 <w:rFonts w:ascii="Arial" w:hAnsi="Arial"/>
                 <w:sz w:val="16"/>
               </w:rPr>
-              <w:t>Hazır (0.9 KB)</w:t>
+              <w:t>Hazır (2.8 KB)</w:t>
             </w:r>
           </w:p>
         </w:tc>
@@ -1607,7 +1645,7 @@
                 <w:rFonts w:ascii="Arial" w:hAnsi="Arial"/>
                 <w:sz w:val="16"/>
               </w:rPr>
-              <w:t>odev3/feature_stability/cremad/feature_stability.png</w:t>
+              <w:t>odev3/feature_stability/cremad/feature_stability.csv</w:t>
             </w:r>
           </w:p>
         </w:tc>
@@ -1621,7 +1659,7 @@
                 <w:rFonts w:ascii="Arial" w:hAnsi="Arial"/>
                 <w:sz w:val="16"/>
               </w:rPr>
-              <w:t>Seed noktaları ile ortalama ± standart sapma görseli</w:t>
+              <w:t>Üç-seed ortalama, standart sapma ve sıralama</w:t>
             </w:r>
           </w:p>
         </w:tc>
@@ -1635,7 +1673,7 @@
                 <w:rFonts w:ascii="Arial" w:hAnsi="Arial"/>
                 <w:sz w:val="16"/>
               </w:rPr>
-              <w:t>Hazır (46.3 KB)</w:t>
+              <w:t>Hazır (0.8 KB)</w:t>
             </w:r>
           </w:p>
         </w:tc>
@@ -1651,7 +1689,7 @@
                 <w:rFonts w:ascii="Arial" w:hAnsi="Arial"/>
                 <w:sz w:val="16"/>
               </w:rPr>
-              <w:t>MELD</w:t>
+              <w:t>CREMA-D</w:t>
             </w:r>
           </w:p>
         </w:tc>
@@ -1665,7 +1703,7 @@
                 <w:rFonts w:ascii="Arial" w:hAnsi="Arial"/>
                 <w:sz w:val="16"/>
               </w:rPr>
-              <w:t>odev3/outputs/meld/best_model.pt</w:t>
+              <w:t>odev3/feature_stability/cremad/feature_stability_comparison.json</w:t>
             </w:r>
           </w:p>
         </w:tc>
@@ -1679,7 +1717,7 @@
                 <w:rFonts w:ascii="Arial" w:hAnsi="Arial"/>
                 <w:sz w:val="16"/>
               </w:rPr>
-              <w:t>En iyi MLP, normalizasyon ve sınıf ağırlıkları</w:t>
+              <w:t>Eşleştirilmiş seed farkları ve aday kazanım sayıları</w:t>
             </w:r>
           </w:p>
         </w:tc>
@@ -1693,7 +1731,7 @@
                 <w:rFonts w:ascii="Arial" w:hAnsi="Arial"/>
                 <w:sz w:val="16"/>
               </w:rPr>
-              <w:t>Hazır (8.6 MB)</w:t>
+              <w:t>Hazır (0.9 KB)</w:t>
             </w:r>
           </w:p>
         </w:tc>
@@ -1709,7 +1747,7 @@
                 <w:rFonts w:ascii="Arial" w:hAnsi="Arial"/>
                 <w:sz w:val="16"/>
               </w:rPr>
-              <w:t>MELD</w:t>
+              <w:t>CREMA-D</w:t>
             </w:r>
           </w:p>
         </w:tc>
@@ -1723,7 +1761,7 @@
                 <w:rFonts w:ascii="Arial" w:hAnsi="Arial"/>
                 <w:sz w:val="16"/>
               </w:rPr>
-              <w:t>odev3/outputs/meld/validation_results.csv</w:t>
+              <w:t>odev3/feature_stability/cremad/feature_stability.png</w:t>
             </w:r>
           </w:p>
         </w:tc>
@@ -1737,7 +1775,7 @@
                 <w:rFonts w:ascii="Arial" w:hAnsi="Arial"/>
                 <w:sz w:val="16"/>
               </w:rPr>
-              <w:t>32 geçerleme deneyinin tam tablosu</w:t>
+              <w:t>Seed noktaları ile ortalama ± standart sapma görseli</w:t>
             </w:r>
           </w:p>
         </w:tc>
@@ -1751,7 +1789,7 @@
                 <w:rFonts w:ascii="Arial" w:hAnsi="Arial"/>
                 <w:sz w:val="16"/>
               </w:rPr>
-              <w:t>Hazır (7.0 KB)</w:t>
+              <w:t>Hazır (46.3 KB)</w:t>
             </w:r>
           </w:p>
         </w:tc>
@@ -1781,7 +1819,7 @@
                 <w:rFonts w:ascii="Arial" w:hAnsi="Arial"/>
                 <w:sz w:val="16"/>
               </w:rPr>
-              <w:t>odev3/outputs/meld/best_training_history.csv</w:t>
+              <w:t>odev3/outputs/meld/best_model.pt</w:t>
             </w:r>
           </w:p>
         </w:tc>
@@ -1795,7 +1833,7 @@
                 <w:rFonts w:ascii="Arial" w:hAnsi="Arial"/>
                 <w:sz w:val="16"/>
               </w:rPr>
-              <w:t>Seçilen koşunun epoch geçmişi</w:t>
+              <w:t>En iyi MLP, normalizasyon ve sınıf ağırlıkları</w:t>
             </w:r>
           </w:p>
         </w:tc>
@@ -1809,7 +1847,7 @@
                 <w:rFonts w:ascii="Arial" w:hAnsi="Arial"/>
                 <w:sz w:val="16"/>
               </w:rPr>
-              <w:t>Hazır (2.3 KB)</w:t>
+              <w:t>Hazır (8.6 MB)</w:t>
             </w:r>
           </w:p>
         </w:tc>
@@ -1839,7 +1877,7 @@
                 <w:rFonts w:ascii="Arial" w:hAnsi="Arial"/>
                 <w:sz w:val="16"/>
               </w:rPr>
-              <w:t>odev3/outputs/meld/test_predictions.csv</w:t>
+              <w:t>odev3/outputs/meld/validation_results.csv</w:t>
             </w:r>
           </w:p>
         </w:tc>
@@ -1853,7 +1891,7 @@
                 <w:rFonts w:ascii="Arial" w:hAnsi="Arial"/>
                 <w:sz w:val="16"/>
               </w:rPr>
-              <w:t>Test örneği tahmin ve olasılıkları</w:t>
+              <w:t>32 geçerleme deneyinin tam tablosu</w:t>
             </w:r>
           </w:p>
         </w:tc>
@@ -1867,7 +1905,7 @@
                 <w:rFonts w:ascii="Arial" w:hAnsi="Arial"/>
                 <w:sz w:val="16"/>
               </w:rPr>
-              <w:t>Hazır (0.1 MB)</w:t>
+              <w:t>Hazır (7.0 KB)</w:t>
             </w:r>
           </w:p>
         </w:tc>
@@ -1897,7 +1935,7 @@
                 <w:rFonts w:ascii="Arial" w:hAnsi="Arial"/>
                 <w:sz w:val="16"/>
               </w:rPr>
-              <w:t>odev3/outputs/meld/test_uncertainty.json</w:t>
+              <w:t>odev3/outputs/meld/best_training_history.csv</w:t>
             </w:r>
           </w:p>
         </w:tc>
@@ -1911,7 +1949,7 @@
                 <w:rFonts w:ascii="Arial" w:hAnsi="Arial"/>
                 <w:sz w:val="16"/>
               </w:rPr>
-              <w:t>Test metriklerinin %95 bootstrap güven aralıkları</w:t>
+              <w:t>Seçilen koşunun epoch geçmişi</w:t>
             </w:r>
           </w:p>
         </w:tc>
@@ -1925,7 +1963,7 @@
                 <w:rFonts w:ascii="Arial" w:hAnsi="Arial"/>
                 <w:sz w:val="16"/>
               </w:rPr>
-              <w:t>Hazır (0.8 KB)</w:t>
+              <w:t>Hazır (2.3 KB)</w:t>
             </w:r>
           </w:p>
         </w:tc>
@@ -1955,7 +1993,7 @@
                 <w:rFonts w:ascii="Arial" w:hAnsi="Arial"/>
                 <w:sz w:val="16"/>
               </w:rPr>
-              <w:t>odev3/outputs/meld/test_calibration.json</w:t>
+              <w:t>odev3/outputs/meld/test_predictions.csv</w:t>
             </w:r>
           </w:p>
         </w:tc>
@@ -1969,7 +2007,7 @@
                 <w:rFonts w:ascii="Arial" w:hAnsi="Arial"/>
                 <w:sz w:val="16"/>
               </w:rPr>
-              <w:t>Ham test olasılıklarının NLL, Brier ve ECE özeti</w:t>
+              <w:t>Test örneği tahmin ve olasılıkları</w:t>
             </w:r>
           </w:p>
         </w:tc>
@@ -1983,7 +2021,7 @@
                 <w:rFonts w:ascii="Arial" w:hAnsi="Arial"/>
                 <w:sz w:val="16"/>
               </w:rPr>
-              <w:t>Hazır (2.8 KB)</w:t>
+              <w:t>Hazır (0.1 MB)</w:t>
             </w:r>
           </w:p>
         </w:tc>
@@ -2013,7 +2051,7 @@
                 <w:rFonts w:ascii="Arial" w:hAnsi="Arial"/>
                 <w:sz w:val="16"/>
               </w:rPr>
-              <w:t>odev3/outputs/meld/temperature_scaling.json</w:t>
+              <w:t>odev3/outputs/meld/test_uncertainty.json</w:t>
             </w:r>
           </w:p>
         </w:tc>
@@ -2027,7 +2065,7 @@
                 <w:rFonts w:ascii="Arial" w:hAnsi="Arial"/>
                 <w:sz w:val="16"/>
               </w:rPr>
-              <w:t>Validation’da öğrenilen sıcaklık ile ham/ölçekli karşılaştırma</w:t>
+              <w:t>Test metriklerinin %95 bootstrap güven aralıkları</w:t>
             </w:r>
           </w:p>
         </w:tc>
@@ -2041,7 +2079,7 @@
                 <w:rFonts w:ascii="Arial" w:hAnsi="Arial"/>
                 <w:sz w:val="16"/>
               </w:rPr>
-              <w:t>Hazır (13.3 KB)</w:t>
+              <w:t>Hazır (0.8 KB)</w:t>
             </w:r>
           </w:p>
         </w:tc>
@@ -2071,7 +2109,7 @@
                 <w:rFonts w:ascii="Arial" w:hAnsi="Arial"/>
                 <w:sz w:val="16"/>
               </w:rPr>
-              <w:t>odev3/outputs/meld/test_confusion_matrix.png</w:t>
+              <w:t>odev3/outputs/meld/test_calibration.json</w:t>
             </w:r>
           </w:p>
         </w:tc>
@@ -2085,7 +2123,7 @@
                 <w:rFonts w:ascii="Arial" w:hAnsi="Arial"/>
                 <w:sz w:val="16"/>
               </w:rPr>
-              <w:t>Normalize test karmaşıklık matrisi</w:t>
+              <w:t>Ham test olasılıklarının NLL, Brier ve ECE özeti</w:t>
             </w:r>
           </w:p>
         </w:tc>
@@ -2099,7 +2137,7 @@
                 <w:rFonts w:ascii="Arial" w:hAnsi="Arial"/>
                 <w:sz w:val="16"/>
               </w:rPr>
-              <w:t>Hazır (79.0 KB)</w:t>
+              <w:t>Hazır (2.8 KB)</w:t>
             </w:r>
           </w:p>
         </w:tc>
@@ -2129,7 +2167,7 @@
                 <w:rFonts w:ascii="Arial" w:hAnsi="Arial"/>
                 <w:sz w:val="16"/>
               </w:rPr>
-              <w:t>odev3/outputs/meld/test_reliability_diagram.png</w:t>
+              <w:t>odev3/outputs/meld/temperature_scaling.json</w:t>
             </w:r>
           </w:p>
         </w:tc>
@@ -2143,7 +2181,7 @@
                 <w:rFonts w:ascii="Arial" w:hAnsi="Arial"/>
                 <w:sz w:val="16"/>
               </w:rPr>
-              <w:t>Ham ve ölçekli test güvenilirlik diyagramı</w:t>
+              <w:t>Validation’da öğrenilen sıcaklık ile ham/ölçekli karşılaştırma</w:t>
             </w:r>
           </w:p>
         </w:tc>
@@ -2157,7 +2195,7 @@
                 <w:rFonts w:ascii="Arial" w:hAnsi="Arial"/>
                 <w:sz w:val="16"/>
               </w:rPr>
-              <w:t>Hazır (96.3 KB)</w:t>
+              <w:t>Hazır (13.3 KB)</w:t>
             </w:r>
           </w:p>
         </w:tc>
@@ -2187,6 +2225,122 @@
                 <w:rFonts w:ascii="Arial" w:hAnsi="Arial"/>
                 <w:sz w:val="16"/>
               </w:rPr>
+              <w:t>odev3/outputs/meld/test_confusion_matrix.png</w:t>
+            </w:r>
+          </w:p>
+        </w:tc>
+        <w:tc>
+          <w:tcPr>
+            <w:tcW w:type="dxa" w:w="2592"/>
+          </w:tcPr>
+          <w:p>
+            <w:r>
+              <w:rPr>
+                <w:rFonts w:ascii="Arial" w:hAnsi="Arial"/>
+                <w:sz w:val="16"/>
+              </w:rPr>
+              <w:t>Normalize test karmaşıklık matrisi</w:t>
+            </w:r>
+          </w:p>
+        </w:tc>
+        <w:tc>
+          <w:tcPr>
+            <w:tcW w:type="dxa" w:w="2592"/>
+          </w:tcPr>
+          <w:p>
+            <w:r>
+              <w:rPr>
+                <w:rFonts w:ascii="Arial" w:hAnsi="Arial"/>
+                <w:sz w:val="16"/>
+              </w:rPr>
+              <w:t>Hazır (79.0 KB)</w:t>
+            </w:r>
+          </w:p>
+        </w:tc>
+      </w:tr>
+      <w:tr>
+        <w:tc>
+          <w:tcPr>
+            <w:tcW w:type="dxa" w:w="2592"/>
+          </w:tcPr>
+          <w:p>
+            <w:r>
+              <w:rPr>
+                <w:rFonts w:ascii="Arial" w:hAnsi="Arial"/>
+                <w:sz w:val="16"/>
+              </w:rPr>
+              <w:t>MELD</w:t>
+            </w:r>
+          </w:p>
+        </w:tc>
+        <w:tc>
+          <w:tcPr>
+            <w:tcW w:type="dxa" w:w="2592"/>
+          </w:tcPr>
+          <w:p>
+            <w:r>
+              <w:rPr>
+                <w:rFonts w:ascii="Arial" w:hAnsi="Arial"/>
+                <w:sz w:val="16"/>
+              </w:rPr>
+              <w:t>odev3/outputs/meld/test_reliability_diagram.png</w:t>
+            </w:r>
+          </w:p>
+        </w:tc>
+        <w:tc>
+          <w:tcPr>
+            <w:tcW w:type="dxa" w:w="2592"/>
+          </w:tcPr>
+          <w:p>
+            <w:r>
+              <w:rPr>
+                <w:rFonts w:ascii="Arial" w:hAnsi="Arial"/>
+                <w:sz w:val="16"/>
+              </w:rPr>
+              <w:t>Ham ve ölçekli test güvenilirlik diyagramı</w:t>
+            </w:r>
+          </w:p>
+        </w:tc>
+        <w:tc>
+          <w:tcPr>
+            <w:tcW w:type="dxa" w:w="2592"/>
+          </w:tcPr>
+          <w:p>
+            <w:r>
+              <w:rPr>
+                <w:rFonts w:ascii="Arial" w:hAnsi="Arial"/>
+                <w:sz w:val="16"/>
+              </w:rPr>
+              <w:t>Hazır (96.3 KB)</w:t>
+            </w:r>
+          </w:p>
+        </w:tc>
+      </w:tr>
+      <w:tr>
+        <w:tc>
+          <w:tcPr>
+            <w:tcW w:type="dxa" w:w="2592"/>
+          </w:tcPr>
+          <w:p>
+            <w:r>
+              <w:rPr>
+                <w:rFonts w:ascii="Arial" w:hAnsi="Arial"/>
+                <w:sz w:val="16"/>
+              </w:rPr>
+              <w:t>MELD</w:t>
+            </w:r>
+          </w:p>
+        </w:tc>
+        <w:tc>
+          <w:tcPr>
+            <w:tcW w:type="dxa" w:w="2592"/>
+          </w:tcPr>
+          <w:p>
+            <w:r>
+              <w:rPr>
+                <w:rFonts w:ascii="Arial" w:hAnsi="Arial"/>
+                <w:sz w:val="16"/>
+              </w:rPr>
               <w:t>odev3/outputs/meld/result.json</w:t>
             </w:r>
           </w:p>
@@ -2216,6 +2370,122 @@
                 <w:sz w:val="16"/>
               </w:rPr>
               <w:t>Hazır (25.6 KB)</w:t>
+            </w:r>
+          </w:p>
+        </w:tc>
+      </w:tr>
+      <w:tr>
+        <w:tc>
+          <w:tcPr>
+            <w:tcW w:type="dxa" w:w="2592"/>
+          </w:tcPr>
+          <w:p>
+            <w:r>
+              <w:rPr>
+                <w:rFonts w:ascii="Arial" w:hAnsi="Arial"/>
+                <w:sz w:val="16"/>
+              </w:rPr>
+              <w:t>MELD</w:t>
+            </w:r>
+          </w:p>
+        </w:tc>
+        <w:tc>
+          <w:tcPr>
+            <w:tcW w:type="dxa" w:w="2592"/>
+          </w:tcPr>
+          <w:p>
+            <w:r>
+              <w:rPr>
+                <w:rFonts w:ascii="Arial" w:hAnsi="Arial"/>
+                <w:sz w:val="16"/>
+              </w:rPr>
+              <w:t>odev3/hyperparameter_effects/meld/parameter_effects.csv</w:t>
+            </w:r>
+          </w:p>
+        </w:tc>
+        <w:tc>
+          <w:tcPr>
+            <w:tcW w:type="dxa" w:w="2592"/>
+          </w:tcPr>
+          <w:p>
+            <w:r>
+              <w:rPr>
+                <w:rFonts w:ascii="Arial" w:hAnsi="Arial"/>
+                <w:sz w:val="16"/>
+              </w:rPr>
+              <w:t>Her parametre değeri için validation macro-F1 dağılımı</w:t>
+            </w:r>
+          </w:p>
+        </w:tc>
+        <w:tc>
+          <w:tcPr>
+            <w:tcW w:type="dxa" w:w="2592"/>
+          </w:tcPr>
+          <w:p>
+            <w:r>
+              <w:rPr>
+                <w:rFonts w:ascii="Arial" w:hAnsi="Arial"/>
+                <w:sz w:val="16"/>
+              </w:rPr>
+              <w:t>Hazır (4.5 KB)</w:t>
+            </w:r>
+          </w:p>
+        </w:tc>
+      </w:tr>
+      <w:tr>
+        <w:tc>
+          <w:tcPr>
+            <w:tcW w:type="dxa" w:w="2592"/>
+          </w:tcPr>
+          <w:p>
+            <w:r>
+              <w:rPr>
+                <w:rFonts w:ascii="Arial" w:hAnsi="Arial"/>
+                <w:sz w:val="16"/>
+              </w:rPr>
+              <w:t>MELD</w:t>
+            </w:r>
+          </w:p>
+        </w:tc>
+        <w:tc>
+          <w:tcPr>
+            <w:tcW w:type="dxa" w:w="2592"/>
+          </w:tcPr>
+          <w:p>
+            <w:r>
+              <w:rPr>
+                <w:rFonts w:ascii="Arial" w:hAnsi="Arial"/>
+                <w:sz w:val="16"/>
+              </w:rPr>
+              <w:t>odev3/hyperparameter_effects/meld/parameter_effect_overview.csv</w:t>
+            </w:r>
+          </w:p>
+        </w:tc>
+        <w:tc>
+          <w:tcPr>
+            <w:tcW w:type="dxa" w:w="2592"/>
+          </w:tcPr>
+          <w:p>
+            <w:r>
+              <w:rPr>
+                <w:rFonts w:ascii="Arial" w:hAnsi="Arial"/>
+                <w:sz w:val="16"/>
+              </w:rPr>
+              <w:t>En güçlü ve zayıf betimsel parametre grupları</w:t>
+            </w:r>
+          </w:p>
+        </w:tc>
+        <w:tc>
+          <w:tcPr>
+            <w:tcW w:type="dxa" w:w="2592"/>
+          </w:tcPr>
+          <w:p>
+            <w:r>
+              <w:rPr>
+                <w:rFonts w:ascii="Arial" w:hAnsi="Arial"/>
+                <w:sz w:val="16"/>
+              </w:rPr>
+              <w:t>Hazır (1.4 KB)</w:t>
             </w:r>
           </w:p>
         </w:tc>
@@ -31225,6 +31495,2746 @@
         <w:pStyle w:val="Heading2"/>
       </w:pPr>
       <w:r>
+        <w:t>Hiperparametrelerin Betimsel Performans İlişkileri</w:t>
+      </w:r>
+    </w:p>
+    <w:p>
+      <w:pPr>
+        <w:spacing w:after="120"/>
+      </w:pPr>
+      <w:r>
+        <w:t>Tarama ve yerel iyileştirme sonuçları her parametre değeri için ayrı gruplandırılmış; grup koşu sayısı, ortalama validation macro-F1 ve en güçlü–en zayıf grup farkı hesaplanmıştır.</w:t>
+      </w:r>
+    </w:p>
+    <w:p>
+      <w:r>
+        <w:rPr>
+          <w:b/>
+        </w:rPr>
+        <w:t>Tablo 11. Hiperparametre gruplarının betimsel validation ilişkileri</w:t>
+      </w:r>
+    </w:p>
+    <w:tbl>
+      <w:tblPr>
+        <w:tblStyle w:val="TableGrid"/>
+        <w:tblW w:type="auto" w:w="0"/>
+        <w:tblLook w:firstColumn="1" w:firstRow="1" w:lastColumn="0" w:lastRow="0" w:noHBand="0" w:noVBand="1" w:val="04A0"/>
+      </w:tblPr>
+      <w:tblGrid>
+        <w:gridCol w:w="943"/>
+        <w:gridCol w:w="943"/>
+        <w:gridCol w:w="943"/>
+        <w:gridCol w:w="943"/>
+        <w:gridCol w:w="943"/>
+        <w:gridCol w:w="943"/>
+        <w:gridCol w:w="943"/>
+        <w:gridCol w:w="943"/>
+        <w:gridCol w:w="943"/>
+        <w:gridCol w:w="943"/>
+        <w:gridCol w:w="943"/>
+      </w:tblGrid>
+      <w:tr>
+        <w:tc>
+          <w:tcPr>
+            <w:tcW w:type="dxa" w:w="943"/>
+          </w:tcPr>
+          <w:p>
+            <w:r>
+              <w:rPr>
+                <w:rFonts w:ascii="Arial" w:hAnsi="Arial"/>
+                <w:b/>
+                <w:sz w:val="12"/>
+              </w:rPr>
+              <w:t>Veri seti</w:t>
+            </w:r>
+          </w:p>
+        </w:tc>
+        <w:tc>
+          <w:tcPr>
+            <w:tcW w:type="dxa" w:w="943"/>
+          </w:tcPr>
+          <w:p>
+            <w:r>
+              <w:rPr>
+                <w:rFonts w:ascii="Arial" w:hAnsi="Arial"/>
+                <w:b/>
+                <w:sz w:val="12"/>
+              </w:rPr>
+              <w:t>Parametre</w:t>
+            </w:r>
+          </w:p>
+        </w:tc>
+        <w:tc>
+          <w:tcPr>
+            <w:tcW w:type="dxa" w:w="943"/>
+          </w:tcPr>
+          <w:p>
+            <w:r>
+              <w:rPr>
+                <w:rFonts w:ascii="Arial" w:hAnsi="Arial"/>
+                <w:b/>
+                <w:sz w:val="12"/>
+              </w:rPr>
+              <w:t>Değer</w:t>
+            </w:r>
+          </w:p>
+        </w:tc>
+        <w:tc>
+          <w:tcPr>
+            <w:tcW w:type="dxa" w:w="943"/>
+          </w:tcPr>
+          <w:p>
+            <w:r>
+              <w:rPr>
+                <w:rFonts w:ascii="Arial" w:hAnsi="Arial"/>
+                <w:b/>
+                <w:sz w:val="12"/>
+              </w:rPr>
+              <w:t>En güçlü grup</w:t>
+            </w:r>
+          </w:p>
+        </w:tc>
+        <w:tc>
+          <w:tcPr>
+            <w:tcW w:type="dxa" w:w="943"/>
+          </w:tcPr>
+          <w:p>
+            <w:r>
+              <w:rPr>
+                <w:rFonts w:ascii="Arial" w:hAnsi="Arial"/>
+                <w:b/>
+                <w:sz w:val="12"/>
+              </w:rPr>
+              <w:t>n</w:t>
+            </w:r>
+          </w:p>
+        </w:tc>
+        <w:tc>
+          <w:tcPr>
+            <w:tcW w:type="dxa" w:w="943"/>
+          </w:tcPr>
+          <w:p>
+            <w:r>
+              <w:rPr>
+                <w:rFonts w:ascii="Arial" w:hAnsi="Arial"/>
+                <w:b/>
+                <w:sz w:val="12"/>
+              </w:rPr>
+              <w:t>Ort. F1</w:t>
+            </w:r>
+          </w:p>
+        </w:tc>
+        <w:tc>
+          <w:tcPr>
+            <w:tcW w:type="dxa" w:w="943"/>
+          </w:tcPr>
+          <w:p>
+            <w:r>
+              <w:rPr>
+                <w:rFonts w:ascii="Arial" w:hAnsi="Arial"/>
+                <w:b/>
+                <w:sz w:val="12"/>
+              </w:rPr>
+              <w:t>En zayıf grup</w:t>
+            </w:r>
+          </w:p>
+        </w:tc>
+        <w:tc>
+          <w:tcPr>
+            <w:tcW w:type="dxa" w:w="943"/>
+          </w:tcPr>
+          <w:p>
+            <w:r>
+              <w:rPr>
+                <w:rFonts w:ascii="Arial" w:hAnsi="Arial"/>
+                <w:b/>
+                <w:sz w:val="12"/>
+              </w:rPr>
+              <w:t>n</w:t>
+            </w:r>
+          </w:p>
+        </w:tc>
+        <w:tc>
+          <w:tcPr>
+            <w:tcW w:type="dxa" w:w="943"/>
+          </w:tcPr>
+          <w:p>
+            <w:r>
+              <w:rPr>
+                <w:rFonts w:ascii="Arial" w:hAnsi="Arial"/>
+                <w:b/>
+                <w:sz w:val="12"/>
+              </w:rPr>
+              <w:t>Ort. F1</w:t>
+            </w:r>
+          </w:p>
+        </w:tc>
+        <w:tc>
+          <w:tcPr>
+            <w:tcW w:type="dxa" w:w="943"/>
+          </w:tcPr>
+          <w:p>
+            <w:r>
+              <w:rPr>
+                <w:rFonts w:ascii="Arial" w:hAnsi="Arial"/>
+                <w:b/>
+                <w:sz w:val="12"/>
+              </w:rPr>
+              <w:t>Fark</w:t>
+            </w:r>
+          </w:p>
+        </w:tc>
+        <w:tc>
+          <w:tcPr>
+            <w:tcW w:type="dxa" w:w="943"/>
+          </w:tcPr>
+          <w:p>
+            <w:r>
+              <w:rPr>
+                <w:rFonts w:ascii="Arial" w:hAnsi="Arial"/>
+                <w:b/>
+                <w:sz w:val="12"/>
+              </w:rPr>
+              <w:t>Grup n aralığı</w:t>
+            </w:r>
+          </w:p>
+        </w:tc>
+      </w:tr>
+      <w:tr>
+        <w:tc>
+          <w:tcPr>
+            <w:tcW w:type="dxa" w:w="943"/>
+          </w:tcPr>
+          <w:p>
+            <w:r>
+              <w:rPr>
+                <w:rFonts w:ascii="Arial" w:hAnsi="Arial"/>
+                <w:sz w:val="12"/>
+              </w:rPr>
+              <w:t>CREMA-D</w:t>
+            </w:r>
+          </w:p>
+        </w:tc>
+        <w:tc>
+          <w:tcPr>
+            <w:tcW w:type="dxa" w:w="943"/>
+          </w:tcPr>
+          <w:p>
+            <w:r>
+              <w:rPr>
+                <w:rFonts w:ascii="Arial" w:hAnsi="Arial"/>
+                <w:sz w:val="12"/>
+              </w:rPr>
+              <w:t>Learning rate</w:t>
+            </w:r>
+          </w:p>
+        </w:tc>
+        <w:tc>
+          <w:tcPr>
+            <w:tcW w:type="dxa" w:w="943"/>
+          </w:tcPr>
+          <w:p>
+            <w:r>
+              <w:rPr>
+                <w:rFonts w:ascii="Arial" w:hAnsi="Arial"/>
+                <w:sz w:val="12"/>
+              </w:rPr>
+              <w:t>5</w:t>
+            </w:r>
+          </w:p>
+        </w:tc>
+        <w:tc>
+          <w:tcPr>
+            <w:tcW w:type="dxa" w:w="943"/>
+          </w:tcPr>
+          <w:p>
+            <w:r>
+              <w:rPr>
+                <w:rFonts w:ascii="Arial" w:hAnsi="Arial"/>
+                <w:sz w:val="12"/>
+              </w:rPr>
+              <w:t>0.001</w:t>
+            </w:r>
+          </w:p>
+        </w:tc>
+        <w:tc>
+          <w:tcPr>
+            <w:tcW w:type="dxa" w:w="943"/>
+          </w:tcPr>
+          <w:p>
+            <w:r>
+              <w:rPr>
+                <w:rFonts w:ascii="Arial" w:hAnsi="Arial"/>
+                <w:sz w:val="12"/>
+              </w:rPr>
+              <w:t>1</w:t>
+            </w:r>
+          </w:p>
+        </w:tc>
+        <w:tc>
+          <w:tcPr>
+            <w:tcW w:type="dxa" w:w="943"/>
+          </w:tcPr>
+          <w:p>
+            <w:r>
+              <w:rPr>
+                <w:rFonts w:ascii="Arial" w:hAnsi="Arial"/>
+                <w:sz w:val="12"/>
+              </w:rPr>
+              <w:t>0.4685</w:t>
+            </w:r>
+          </w:p>
+        </w:tc>
+        <w:tc>
+          <w:tcPr>
+            <w:tcW w:type="dxa" w:w="943"/>
+          </w:tcPr>
+          <w:p>
+            <w:r>
+              <w:rPr>
+                <w:rFonts w:ascii="Arial" w:hAnsi="Arial"/>
+                <w:sz w:val="12"/>
+              </w:rPr>
+              <w:t>0.0001</w:t>
+            </w:r>
+          </w:p>
+        </w:tc>
+        <w:tc>
+          <w:tcPr>
+            <w:tcW w:type="dxa" w:w="943"/>
+          </w:tcPr>
+          <w:p>
+            <w:r>
+              <w:rPr>
+                <w:rFonts w:ascii="Arial" w:hAnsi="Arial"/>
+                <w:sz w:val="12"/>
+              </w:rPr>
+              <w:t>1</w:t>
+            </w:r>
+          </w:p>
+        </w:tc>
+        <w:tc>
+          <w:tcPr>
+            <w:tcW w:type="dxa" w:w="943"/>
+          </w:tcPr>
+          <w:p>
+            <w:r>
+              <w:rPr>
+                <w:rFonts w:ascii="Arial" w:hAnsi="Arial"/>
+                <w:sz w:val="12"/>
+              </w:rPr>
+              <w:t>0.4424</w:t>
+            </w:r>
+          </w:p>
+        </w:tc>
+        <w:tc>
+          <w:tcPr>
+            <w:tcW w:type="dxa" w:w="943"/>
+          </w:tcPr>
+          <w:p>
+            <w:r>
+              <w:rPr>
+                <w:rFonts w:ascii="Arial" w:hAnsi="Arial"/>
+                <w:sz w:val="12"/>
+              </w:rPr>
+              <w:t>0.0261</w:t>
+            </w:r>
+          </w:p>
+        </w:tc>
+        <w:tc>
+          <w:tcPr>
+            <w:tcW w:type="dxa" w:w="943"/>
+          </w:tcPr>
+          <w:p>
+            <w:r>
+              <w:rPr>
+                <w:rFonts w:ascii="Arial" w:hAnsi="Arial"/>
+                <w:sz w:val="12"/>
+              </w:rPr>
+              <w:t>1–26</w:t>
+            </w:r>
+          </w:p>
+        </w:tc>
+      </w:tr>
+      <w:tr>
+        <w:tc>
+          <w:tcPr>
+            <w:tcW w:type="dxa" w:w="943"/>
+          </w:tcPr>
+          <w:p>
+            <w:r>
+              <w:rPr>
+                <w:rFonts w:ascii="Arial" w:hAnsi="Arial"/>
+                <w:sz w:val="12"/>
+              </w:rPr>
+              <w:t>CREMA-D</w:t>
+            </w:r>
+          </w:p>
+        </w:tc>
+        <w:tc>
+          <w:tcPr>
+            <w:tcW w:type="dxa" w:w="943"/>
+          </w:tcPr>
+          <w:p>
+            <w:r>
+              <w:rPr>
+                <w:rFonts w:ascii="Arial" w:hAnsi="Arial"/>
+                <w:sz w:val="12"/>
+              </w:rPr>
+              <w:t>Gizli katman yapısı</w:t>
+            </w:r>
+          </w:p>
+        </w:tc>
+        <w:tc>
+          <w:tcPr>
+            <w:tcW w:type="dxa" w:w="943"/>
+          </w:tcPr>
+          <w:p>
+            <w:r>
+              <w:rPr>
+                <w:rFonts w:ascii="Arial" w:hAnsi="Arial"/>
+                <w:sz w:val="12"/>
+              </w:rPr>
+              <w:t>6</w:t>
+            </w:r>
+          </w:p>
+        </w:tc>
+        <w:tc>
+          <w:tcPr>
+            <w:tcW w:type="dxa" w:w="943"/>
+          </w:tcPr>
+          <w:p>
+            <w:r>
+              <w:rPr>
+                <w:rFonts w:ascii="Arial" w:hAnsi="Arial"/>
+                <w:sz w:val="12"/>
+              </w:rPr>
+              <w:t>768-384-192</w:t>
+            </w:r>
+          </w:p>
+        </w:tc>
+        <w:tc>
+          <w:tcPr>
+            <w:tcW w:type="dxa" w:w="943"/>
+          </w:tcPr>
+          <w:p>
+            <w:r>
+              <w:rPr>
+                <w:rFonts w:ascii="Arial" w:hAnsi="Arial"/>
+                <w:sz w:val="12"/>
+              </w:rPr>
+              <w:t>1</w:t>
+            </w:r>
+          </w:p>
+        </w:tc>
+        <w:tc>
+          <w:tcPr>
+            <w:tcW w:type="dxa" w:w="943"/>
+          </w:tcPr>
+          <w:p>
+            <w:r>
+              <w:rPr>
+                <w:rFonts w:ascii="Arial" w:hAnsi="Arial"/>
+                <w:sz w:val="12"/>
+              </w:rPr>
+              <w:t>0.4754</w:t>
+            </w:r>
+          </w:p>
+        </w:tc>
+        <w:tc>
+          <w:tcPr>
+            <w:tcW w:type="dxa" w:w="943"/>
+          </w:tcPr>
+          <w:p>
+            <w:r>
+              <w:rPr>
+                <w:rFonts w:ascii="Arial" w:hAnsi="Arial"/>
+                <w:sz w:val="12"/>
+              </w:rPr>
+              <w:t>256</w:t>
+            </w:r>
+          </w:p>
+        </w:tc>
+        <w:tc>
+          <w:tcPr>
+            <w:tcW w:type="dxa" w:w="943"/>
+          </w:tcPr>
+          <w:p>
+            <w:r>
+              <w:rPr>
+                <w:rFonts w:ascii="Arial" w:hAnsi="Arial"/>
+                <w:sz w:val="12"/>
+              </w:rPr>
+              <w:t>1</w:t>
+            </w:r>
+          </w:p>
+        </w:tc>
+        <w:tc>
+          <w:tcPr>
+            <w:tcW w:type="dxa" w:w="943"/>
+          </w:tcPr>
+          <w:p>
+            <w:r>
+              <w:rPr>
+                <w:rFonts w:ascii="Arial" w:hAnsi="Arial"/>
+                <w:sz w:val="12"/>
+              </w:rPr>
+              <w:t>0.4237</w:t>
+            </w:r>
+          </w:p>
+        </w:tc>
+        <w:tc>
+          <w:tcPr>
+            <w:tcW w:type="dxa" w:w="943"/>
+          </w:tcPr>
+          <w:p>
+            <w:r>
+              <w:rPr>
+                <w:rFonts w:ascii="Arial" w:hAnsi="Arial"/>
+                <w:sz w:val="12"/>
+              </w:rPr>
+              <w:t>0.0517</w:t>
+            </w:r>
+          </w:p>
+        </w:tc>
+        <w:tc>
+          <w:tcPr>
+            <w:tcW w:type="dxa" w:w="943"/>
+          </w:tcPr>
+          <w:p>
+            <w:r>
+              <w:rPr>
+                <w:rFonts w:ascii="Arial" w:hAnsi="Arial"/>
+                <w:sz w:val="12"/>
+              </w:rPr>
+              <w:t>1–13</w:t>
+            </w:r>
+          </w:p>
+        </w:tc>
+      </w:tr>
+      <w:tr>
+        <w:tc>
+          <w:tcPr>
+            <w:tcW w:type="dxa" w:w="943"/>
+          </w:tcPr>
+          <w:p>
+            <w:r>
+              <w:rPr>
+                <w:rFonts w:ascii="Arial" w:hAnsi="Arial"/>
+                <w:sz w:val="12"/>
+              </w:rPr>
+              <w:t>CREMA-D</w:t>
+            </w:r>
+          </w:p>
+        </w:tc>
+        <w:tc>
+          <w:tcPr>
+            <w:tcW w:type="dxa" w:w="943"/>
+          </w:tcPr>
+          <w:p>
+            <w:r>
+              <w:rPr>
+                <w:rFonts w:ascii="Arial" w:hAnsi="Arial"/>
+                <w:sz w:val="12"/>
+              </w:rPr>
+              <w:t>Batch boyutu</w:t>
+            </w:r>
+          </w:p>
+        </w:tc>
+        <w:tc>
+          <w:tcPr>
+            <w:tcW w:type="dxa" w:w="943"/>
+          </w:tcPr>
+          <w:p>
+            <w:r>
+              <w:rPr>
+                <w:rFonts w:ascii="Arial" w:hAnsi="Arial"/>
+                <w:sz w:val="12"/>
+              </w:rPr>
+              <w:t>3</w:t>
+            </w:r>
+          </w:p>
+        </w:tc>
+        <w:tc>
+          <w:tcPr>
+            <w:tcW w:type="dxa" w:w="943"/>
+          </w:tcPr>
+          <w:p>
+            <w:r>
+              <w:rPr>
+                <w:rFonts w:ascii="Arial" w:hAnsi="Arial"/>
+                <w:sz w:val="12"/>
+              </w:rPr>
+              <w:t>128</w:t>
+            </w:r>
+          </w:p>
+        </w:tc>
+        <w:tc>
+          <w:tcPr>
+            <w:tcW w:type="dxa" w:w="943"/>
+          </w:tcPr>
+          <w:p>
+            <w:r>
+              <w:rPr>
+                <w:rFonts w:ascii="Arial" w:hAnsi="Arial"/>
+                <w:sz w:val="12"/>
+              </w:rPr>
+              <w:t>2</w:t>
+            </w:r>
+          </w:p>
+        </w:tc>
+        <w:tc>
+          <w:tcPr>
+            <w:tcW w:type="dxa" w:w="943"/>
+          </w:tcPr>
+          <w:p>
+            <w:r>
+              <w:rPr>
+                <w:rFonts w:ascii="Arial" w:hAnsi="Arial"/>
+                <w:sz w:val="12"/>
+              </w:rPr>
+              <w:t>0.4700</w:t>
+            </w:r>
+          </w:p>
+        </w:tc>
+        <w:tc>
+          <w:tcPr>
+            <w:tcW w:type="dxa" w:w="943"/>
+          </w:tcPr>
+          <w:p>
+            <w:r>
+              <w:rPr>
+                <w:rFonts w:ascii="Arial" w:hAnsi="Arial"/>
+                <w:sz w:val="12"/>
+              </w:rPr>
+              <w:t>64</w:t>
+            </w:r>
+          </w:p>
+        </w:tc>
+        <w:tc>
+          <w:tcPr>
+            <w:tcW w:type="dxa" w:w="943"/>
+          </w:tcPr>
+          <w:p>
+            <w:r>
+              <w:rPr>
+                <w:rFonts w:ascii="Arial" w:hAnsi="Arial"/>
+                <w:sz w:val="12"/>
+              </w:rPr>
+              <w:t>26</w:t>
+            </w:r>
+          </w:p>
+        </w:tc>
+        <w:tc>
+          <w:tcPr>
+            <w:tcW w:type="dxa" w:w="943"/>
+          </w:tcPr>
+          <w:p>
+            <w:r>
+              <w:rPr>
+                <w:rFonts w:ascii="Arial" w:hAnsi="Arial"/>
+                <w:sz w:val="12"/>
+              </w:rPr>
+              <w:t>0.4573</w:t>
+            </w:r>
+          </w:p>
+        </w:tc>
+        <w:tc>
+          <w:tcPr>
+            <w:tcW w:type="dxa" w:w="943"/>
+          </w:tcPr>
+          <w:p>
+            <w:r>
+              <w:rPr>
+                <w:rFonts w:ascii="Arial" w:hAnsi="Arial"/>
+                <w:sz w:val="12"/>
+              </w:rPr>
+              <w:t>0.0127</w:t>
+            </w:r>
+          </w:p>
+        </w:tc>
+        <w:tc>
+          <w:tcPr>
+            <w:tcW w:type="dxa" w:w="943"/>
+          </w:tcPr>
+          <w:p>
+            <w:r>
+              <w:rPr>
+                <w:rFonts w:ascii="Arial" w:hAnsi="Arial"/>
+                <w:sz w:val="12"/>
+              </w:rPr>
+              <w:t>2–26</w:t>
+            </w:r>
+          </w:p>
+        </w:tc>
+      </w:tr>
+      <w:tr>
+        <w:tc>
+          <w:tcPr>
+            <w:tcW w:type="dxa" w:w="943"/>
+          </w:tcPr>
+          <w:p>
+            <w:r>
+              <w:rPr>
+                <w:rFonts w:ascii="Arial" w:hAnsi="Arial"/>
+                <w:sz w:val="12"/>
+              </w:rPr>
+              <w:t>CREMA-D</w:t>
+            </w:r>
+          </w:p>
+        </w:tc>
+        <w:tc>
+          <w:tcPr>
+            <w:tcW w:type="dxa" w:w="943"/>
+          </w:tcPr>
+          <w:p>
+            <w:r>
+              <w:rPr>
+                <w:rFonts w:ascii="Arial" w:hAnsi="Arial"/>
+                <w:sz w:val="12"/>
+              </w:rPr>
+              <w:t>Patience</w:t>
+            </w:r>
+          </w:p>
+        </w:tc>
+        <w:tc>
+          <w:tcPr>
+            <w:tcW w:type="dxa" w:w="943"/>
+          </w:tcPr>
+          <w:p>
+            <w:r>
+              <w:rPr>
+                <w:rFonts w:ascii="Arial" w:hAnsi="Arial"/>
+                <w:sz w:val="12"/>
+              </w:rPr>
+              <w:t>5</w:t>
+            </w:r>
+          </w:p>
+        </w:tc>
+        <w:tc>
+          <w:tcPr>
+            <w:tcW w:type="dxa" w:w="943"/>
+          </w:tcPr>
+          <w:p>
+            <w:r>
+              <w:rPr>
+                <w:rFonts w:ascii="Arial" w:hAnsi="Arial"/>
+                <w:sz w:val="12"/>
+              </w:rPr>
+              <w:t>10</w:t>
+            </w:r>
+          </w:p>
+        </w:tc>
+        <w:tc>
+          <w:tcPr>
+            <w:tcW w:type="dxa" w:w="943"/>
+          </w:tcPr>
+          <w:p>
+            <w:r>
+              <w:rPr>
+                <w:rFonts w:ascii="Arial" w:hAnsi="Arial"/>
+                <w:sz w:val="12"/>
+              </w:rPr>
+              <w:t>1</w:t>
+            </w:r>
+          </w:p>
+        </w:tc>
+        <w:tc>
+          <w:tcPr>
+            <w:tcW w:type="dxa" w:w="943"/>
+          </w:tcPr>
+          <w:p>
+            <w:r>
+              <w:rPr>
+                <w:rFonts w:ascii="Arial" w:hAnsi="Arial"/>
+                <w:sz w:val="12"/>
+              </w:rPr>
+              <w:t>0.4794</w:t>
+            </w:r>
+          </w:p>
+        </w:tc>
+        <w:tc>
+          <w:tcPr>
+            <w:tcW w:type="dxa" w:w="943"/>
+          </w:tcPr>
+          <w:p>
+            <w:r>
+              <w:rPr>
+                <w:rFonts w:ascii="Arial" w:hAnsi="Arial"/>
+                <w:sz w:val="12"/>
+              </w:rPr>
+              <w:t>5</w:t>
+            </w:r>
+          </w:p>
+        </w:tc>
+        <w:tc>
+          <w:tcPr>
+            <w:tcW w:type="dxa" w:w="943"/>
+          </w:tcPr>
+          <w:p>
+            <w:r>
+              <w:rPr>
+                <w:rFonts w:ascii="Arial" w:hAnsi="Arial"/>
+                <w:sz w:val="12"/>
+              </w:rPr>
+              <w:t>1</w:t>
+            </w:r>
+          </w:p>
+        </w:tc>
+        <w:tc>
+          <w:tcPr>
+            <w:tcW w:type="dxa" w:w="943"/>
+          </w:tcPr>
+          <w:p>
+            <w:r>
+              <w:rPr>
+                <w:rFonts w:ascii="Arial" w:hAnsi="Arial"/>
+                <w:sz w:val="12"/>
+              </w:rPr>
+              <w:t>0.4460</w:t>
+            </w:r>
+          </w:p>
+        </w:tc>
+        <w:tc>
+          <w:tcPr>
+            <w:tcW w:type="dxa" w:w="943"/>
+          </w:tcPr>
+          <w:p>
+            <w:r>
+              <w:rPr>
+                <w:rFonts w:ascii="Arial" w:hAnsi="Arial"/>
+                <w:sz w:val="12"/>
+              </w:rPr>
+              <w:t>0.0335</w:t>
+            </w:r>
+          </w:p>
+        </w:tc>
+        <w:tc>
+          <w:tcPr>
+            <w:tcW w:type="dxa" w:w="943"/>
+          </w:tcPr>
+          <w:p>
+            <w:r>
+              <w:rPr>
+                <w:rFonts w:ascii="Arial" w:hAnsi="Arial"/>
+                <w:sz w:val="12"/>
+              </w:rPr>
+              <w:t>1–26</w:t>
+            </w:r>
+          </w:p>
+        </w:tc>
+      </w:tr>
+      <w:tr>
+        <w:tc>
+          <w:tcPr>
+            <w:tcW w:type="dxa" w:w="943"/>
+          </w:tcPr>
+          <w:p>
+            <w:r>
+              <w:rPr>
+                <w:rFonts w:ascii="Arial" w:hAnsi="Arial"/>
+                <w:sz w:val="12"/>
+              </w:rPr>
+              <w:t>CREMA-D</w:t>
+            </w:r>
+          </w:p>
+        </w:tc>
+        <w:tc>
+          <w:tcPr>
+            <w:tcW w:type="dxa" w:w="943"/>
+          </w:tcPr>
+          <w:p>
+            <w:r>
+              <w:rPr>
+                <w:rFonts w:ascii="Arial" w:hAnsi="Arial"/>
+                <w:sz w:val="12"/>
+              </w:rPr>
+              <w:t>Aktivasyon</w:t>
+            </w:r>
+          </w:p>
+        </w:tc>
+        <w:tc>
+          <w:tcPr>
+            <w:tcW w:type="dxa" w:w="943"/>
+          </w:tcPr>
+          <w:p>
+            <w:r>
+              <w:rPr>
+                <w:rFonts w:ascii="Arial" w:hAnsi="Arial"/>
+                <w:sz w:val="12"/>
+              </w:rPr>
+              <w:t>3</w:t>
+            </w:r>
+          </w:p>
+        </w:tc>
+        <w:tc>
+          <w:tcPr>
+            <w:tcW w:type="dxa" w:w="943"/>
+          </w:tcPr>
+          <w:p>
+            <w:r>
+              <w:rPr>
+                <w:rFonts w:ascii="Arial" w:hAnsi="Arial"/>
+                <w:sz w:val="12"/>
+              </w:rPr>
+              <w:t>gelu</w:t>
+            </w:r>
+          </w:p>
+        </w:tc>
+        <w:tc>
+          <w:tcPr>
+            <w:tcW w:type="dxa" w:w="943"/>
+          </w:tcPr>
+          <w:p>
+            <w:r>
+              <w:rPr>
+                <w:rFonts w:ascii="Arial" w:hAnsi="Arial"/>
+                <w:sz w:val="12"/>
+              </w:rPr>
+              <w:t>2</w:t>
+            </w:r>
+          </w:p>
+        </w:tc>
+        <w:tc>
+          <w:tcPr>
+            <w:tcW w:type="dxa" w:w="943"/>
+          </w:tcPr>
+          <w:p>
+            <w:r>
+              <w:rPr>
+                <w:rFonts w:ascii="Arial" w:hAnsi="Arial"/>
+                <w:sz w:val="12"/>
+              </w:rPr>
+              <w:t>0.4674</w:t>
+            </w:r>
+          </w:p>
+        </w:tc>
+        <w:tc>
+          <w:tcPr>
+            <w:tcW w:type="dxa" w:w="943"/>
+          </w:tcPr>
+          <w:p>
+            <w:r>
+              <w:rPr>
+                <w:rFonts w:ascii="Arial" w:hAnsi="Arial"/>
+                <w:sz w:val="12"/>
+              </w:rPr>
+              <w:t>tanh</w:t>
+            </w:r>
+          </w:p>
+        </w:tc>
+        <w:tc>
+          <w:tcPr>
+            <w:tcW w:type="dxa" w:w="943"/>
+          </w:tcPr>
+          <w:p>
+            <w:r>
+              <w:rPr>
+                <w:rFonts w:ascii="Arial" w:hAnsi="Arial"/>
+                <w:sz w:val="12"/>
+              </w:rPr>
+              <w:t>2</w:t>
+            </w:r>
+          </w:p>
+        </w:tc>
+        <w:tc>
+          <w:tcPr>
+            <w:tcW w:type="dxa" w:w="943"/>
+          </w:tcPr>
+          <w:p>
+            <w:r>
+              <w:rPr>
+                <w:rFonts w:ascii="Arial" w:hAnsi="Arial"/>
+                <w:sz w:val="12"/>
+              </w:rPr>
+              <w:t>0.4298</w:t>
+            </w:r>
+          </w:p>
+        </w:tc>
+        <w:tc>
+          <w:tcPr>
+            <w:tcW w:type="dxa" w:w="943"/>
+          </w:tcPr>
+          <w:p>
+            <w:r>
+              <w:rPr>
+                <w:rFonts w:ascii="Arial" w:hAnsi="Arial"/>
+                <w:sz w:val="12"/>
+              </w:rPr>
+              <w:t>0.0376</w:t>
+            </w:r>
+          </w:p>
+        </w:tc>
+        <w:tc>
+          <w:tcPr>
+            <w:tcW w:type="dxa" w:w="943"/>
+          </w:tcPr>
+          <w:p>
+            <w:r>
+              <w:rPr>
+                <w:rFonts w:ascii="Arial" w:hAnsi="Arial"/>
+                <w:sz w:val="12"/>
+              </w:rPr>
+              <w:t>2–26</w:t>
+            </w:r>
+          </w:p>
+        </w:tc>
+      </w:tr>
+      <w:tr>
+        <w:tc>
+          <w:tcPr>
+            <w:tcW w:type="dxa" w:w="943"/>
+          </w:tcPr>
+          <w:p>
+            <w:r>
+              <w:rPr>
+                <w:rFonts w:ascii="Arial" w:hAnsi="Arial"/>
+                <w:sz w:val="12"/>
+              </w:rPr>
+              <w:t>CREMA-D</w:t>
+            </w:r>
+          </w:p>
+        </w:tc>
+        <w:tc>
+          <w:tcPr>
+            <w:tcW w:type="dxa" w:w="943"/>
+          </w:tcPr>
+          <w:p>
+            <w:r>
+              <w:rPr>
+                <w:rFonts w:ascii="Arial" w:hAnsi="Arial"/>
+                <w:sz w:val="12"/>
+              </w:rPr>
+              <w:t>Batch normalization</w:t>
+            </w:r>
+          </w:p>
+        </w:tc>
+        <w:tc>
+          <w:tcPr>
+            <w:tcW w:type="dxa" w:w="943"/>
+          </w:tcPr>
+          <w:p>
+            <w:r>
+              <w:rPr>
+                <w:rFonts w:ascii="Arial" w:hAnsi="Arial"/>
+                <w:sz w:val="12"/>
+              </w:rPr>
+              <w:t>2</w:t>
+            </w:r>
+          </w:p>
+        </w:tc>
+        <w:tc>
+          <w:tcPr>
+            <w:tcW w:type="dxa" w:w="943"/>
+          </w:tcPr>
+          <w:p>
+            <w:r>
+              <w:rPr>
+                <w:rFonts w:ascii="Arial" w:hAnsi="Arial"/>
+                <w:sz w:val="12"/>
+              </w:rPr>
+              <w:t>true</w:t>
+            </w:r>
+          </w:p>
+        </w:tc>
+        <w:tc>
+          <w:tcPr>
+            <w:tcW w:type="dxa" w:w="943"/>
+          </w:tcPr>
+          <w:p>
+            <w:r>
+              <w:rPr>
+                <w:rFonts w:ascii="Arial" w:hAnsi="Arial"/>
+                <w:sz w:val="12"/>
+              </w:rPr>
+              <w:t>28</w:t>
+            </w:r>
+          </w:p>
+        </w:tc>
+        <w:tc>
+          <w:tcPr>
+            <w:tcW w:type="dxa" w:w="943"/>
+          </w:tcPr>
+          <w:p>
+            <w:r>
+              <w:rPr>
+                <w:rFonts w:ascii="Arial" w:hAnsi="Arial"/>
+                <w:sz w:val="12"/>
+              </w:rPr>
+              <w:t>0.4590</w:t>
+            </w:r>
+          </w:p>
+        </w:tc>
+        <w:tc>
+          <w:tcPr>
+            <w:tcW w:type="dxa" w:w="943"/>
+          </w:tcPr>
+          <w:p>
+            <w:r>
+              <w:rPr>
+                <w:rFonts w:ascii="Arial" w:hAnsi="Arial"/>
+                <w:sz w:val="12"/>
+              </w:rPr>
+              <w:t>false</w:t>
+            </w:r>
+          </w:p>
+        </w:tc>
+        <w:tc>
+          <w:tcPr>
+            <w:tcW w:type="dxa" w:w="943"/>
+          </w:tcPr>
+          <w:p>
+            <w:r>
+              <w:rPr>
+                <w:rFonts w:ascii="Arial" w:hAnsi="Arial"/>
+                <w:sz w:val="12"/>
+              </w:rPr>
+              <w:t>2</w:t>
+            </w:r>
+          </w:p>
+        </w:tc>
+        <w:tc>
+          <w:tcPr>
+            <w:tcW w:type="dxa" w:w="943"/>
+          </w:tcPr>
+          <w:p>
+            <w:r>
+              <w:rPr>
+                <w:rFonts w:ascii="Arial" w:hAnsi="Arial"/>
+                <w:sz w:val="12"/>
+              </w:rPr>
+              <w:t>0.4571</w:t>
+            </w:r>
+          </w:p>
+        </w:tc>
+        <w:tc>
+          <w:tcPr>
+            <w:tcW w:type="dxa" w:w="943"/>
+          </w:tcPr>
+          <w:p>
+            <w:r>
+              <w:rPr>
+                <w:rFonts w:ascii="Arial" w:hAnsi="Arial"/>
+                <w:sz w:val="12"/>
+              </w:rPr>
+              <w:t>0.0019</w:t>
+            </w:r>
+          </w:p>
+        </w:tc>
+        <w:tc>
+          <w:tcPr>
+            <w:tcW w:type="dxa" w:w="943"/>
+          </w:tcPr>
+          <w:p>
+            <w:r>
+              <w:rPr>
+                <w:rFonts w:ascii="Arial" w:hAnsi="Arial"/>
+                <w:sz w:val="12"/>
+              </w:rPr>
+              <w:t>2–28</w:t>
+            </w:r>
+          </w:p>
+        </w:tc>
+      </w:tr>
+      <w:tr>
+        <w:tc>
+          <w:tcPr>
+            <w:tcW w:type="dxa" w:w="943"/>
+          </w:tcPr>
+          <w:p>
+            <w:r>
+              <w:rPr>
+                <w:rFonts w:ascii="Arial" w:hAnsi="Arial"/>
+                <w:sz w:val="12"/>
+              </w:rPr>
+              <w:t>CREMA-D</w:t>
+            </w:r>
+          </w:p>
+        </w:tc>
+        <w:tc>
+          <w:tcPr>
+            <w:tcW w:type="dxa" w:w="943"/>
+          </w:tcPr>
+          <w:p>
+            <w:r>
+              <w:rPr>
+                <w:rFonts w:ascii="Arial" w:hAnsi="Arial"/>
+                <w:sz w:val="12"/>
+              </w:rPr>
+              <w:t>Dropout</w:t>
+            </w:r>
+          </w:p>
+        </w:tc>
+        <w:tc>
+          <w:tcPr>
+            <w:tcW w:type="dxa" w:w="943"/>
+          </w:tcPr>
+          <w:p>
+            <w:r>
+              <w:rPr>
+                <w:rFonts w:ascii="Arial" w:hAnsi="Arial"/>
+                <w:sz w:val="12"/>
+              </w:rPr>
+              <w:t>5</w:t>
+            </w:r>
+          </w:p>
+        </w:tc>
+        <w:tc>
+          <w:tcPr>
+            <w:tcW w:type="dxa" w:w="943"/>
+          </w:tcPr>
+          <w:p>
+            <w:r>
+              <w:rPr>
+                <w:rFonts w:ascii="Arial" w:hAnsi="Arial"/>
+                <w:sz w:val="12"/>
+              </w:rPr>
+              <w:t>0.2</w:t>
+            </w:r>
+          </w:p>
+        </w:tc>
+        <w:tc>
+          <w:tcPr>
+            <w:tcW w:type="dxa" w:w="943"/>
+          </w:tcPr>
+          <w:p>
+            <w:r>
+              <w:rPr>
+                <w:rFonts w:ascii="Arial" w:hAnsi="Arial"/>
+                <w:sz w:val="12"/>
+              </w:rPr>
+              <w:t>1</w:t>
+            </w:r>
+          </w:p>
+        </w:tc>
+        <w:tc>
+          <w:tcPr>
+            <w:tcW w:type="dxa" w:w="943"/>
+          </w:tcPr>
+          <w:p>
+            <w:r>
+              <w:rPr>
+                <w:rFonts w:ascii="Arial" w:hAnsi="Arial"/>
+                <w:sz w:val="12"/>
+              </w:rPr>
+              <w:t>0.4776</w:t>
+            </w:r>
+          </w:p>
+        </w:tc>
+        <w:tc>
+          <w:tcPr>
+            <w:tcW w:type="dxa" w:w="943"/>
+          </w:tcPr>
+          <w:p>
+            <w:r>
+              <w:rPr>
+                <w:rFonts w:ascii="Arial" w:hAnsi="Arial"/>
+                <w:sz w:val="12"/>
+              </w:rPr>
+              <w:t>0</w:t>
+            </w:r>
+          </w:p>
+        </w:tc>
+        <w:tc>
+          <w:tcPr>
+            <w:tcW w:type="dxa" w:w="943"/>
+          </w:tcPr>
+          <w:p>
+            <w:r>
+              <w:rPr>
+                <w:rFonts w:ascii="Arial" w:hAnsi="Arial"/>
+                <w:sz w:val="12"/>
+              </w:rPr>
+              <w:t>1</w:t>
+            </w:r>
+          </w:p>
+        </w:tc>
+        <w:tc>
+          <w:tcPr>
+            <w:tcW w:type="dxa" w:w="943"/>
+          </w:tcPr>
+          <w:p>
+            <w:r>
+              <w:rPr>
+                <w:rFonts w:ascii="Arial" w:hAnsi="Arial"/>
+                <w:sz w:val="12"/>
+              </w:rPr>
+              <w:t>0.4340</w:t>
+            </w:r>
+          </w:p>
+        </w:tc>
+        <w:tc>
+          <w:tcPr>
+            <w:tcW w:type="dxa" w:w="943"/>
+          </w:tcPr>
+          <w:p>
+            <w:r>
+              <w:rPr>
+                <w:rFonts w:ascii="Arial" w:hAnsi="Arial"/>
+                <w:sz w:val="12"/>
+              </w:rPr>
+              <w:t>0.0437</w:t>
+            </w:r>
+          </w:p>
+        </w:tc>
+        <w:tc>
+          <w:tcPr>
+            <w:tcW w:type="dxa" w:w="943"/>
+          </w:tcPr>
+          <w:p>
+            <w:r>
+              <w:rPr>
+                <w:rFonts w:ascii="Arial" w:hAnsi="Arial"/>
+                <w:sz w:val="12"/>
+              </w:rPr>
+              <w:t>1–26</w:t>
+            </w:r>
+          </w:p>
+        </w:tc>
+      </w:tr>
+      <w:tr>
+        <w:tc>
+          <w:tcPr>
+            <w:tcW w:type="dxa" w:w="943"/>
+          </w:tcPr>
+          <w:p>
+            <w:r>
+              <w:rPr>
+                <w:rFonts w:ascii="Arial" w:hAnsi="Arial"/>
+                <w:sz w:val="12"/>
+              </w:rPr>
+              <w:t>CREMA-D</w:t>
+            </w:r>
+          </w:p>
+        </w:tc>
+        <w:tc>
+          <w:tcPr>
+            <w:tcW w:type="dxa" w:w="943"/>
+          </w:tcPr>
+          <w:p>
+            <w:r>
+              <w:rPr>
+                <w:rFonts w:ascii="Arial" w:hAnsi="Arial"/>
+                <w:sz w:val="12"/>
+              </w:rPr>
+              <w:t>Weight decay</w:t>
+            </w:r>
+          </w:p>
+        </w:tc>
+        <w:tc>
+          <w:tcPr>
+            <w:tcW w:type="dxa" w:w="943"/>
+          </w:tcPr>
+          <w:p>
+            <w:r>
+              <w:rPr>
+                <w:rFonts w:ascii="Arial" w:hAnsi="Arial"/>
+                <w:sz w:val="12"/>
+              </w:rPr>
+              <w:t>2</w:t>
+            </w:r>
+          </w:p>
+        </w:tc>
+        <w:tc>
+          <w:tcPr>
+            <w:tcW w:type="dxa" w:w="943"/>
+          </w:tcPr>
+          <w:p>
+            <w:r>
+              <w:rPr>
+                <w:rFonts w:ascii="Arial" w:hAnsi="Arial"/>
+                <w:sz w:val="12"/>
+              </w:rPr>
+              <w:t>0</w:t>
+            </w:r>
+          </w:p>
+        </w:tc>
+        <w:tc>
+          <w:tcPr>
+            <w:tcW w:type="dxa" w:w="943"/>
+          </w:tcPr>
+          <w:p>
+            <w:r>
+              <w:rPr>
+                <w:rFonts w:ascii="Arial" w:hAnsi="Arial"/>
+                <w:sz w:val="12"/>
+              </w:rPr>
+              <w:t>2</w:t>
+            </w:r>
+          </w:p>
+        </w:tc>
+        <w:tc>
+          <w:tcPr>
+            <w:tcW w:type="dxa" w:w="943"/>
+          </w:tcPr>
+          <w:p>
+            <w:r>
+              <w:rPr>
+                <w:rFonts w:ascii="Arial" w:hAnsi="Arial"/>
+                <w:sz w:val="12"/>
+              </w:rPr>
+              <w:t>0.4690</w:t>
+            </w:r>
+          </w:p>
+        </w:tc>
+        <w:tc>
+          <w:tcPr>
+            <w:tcW w:type="dxa" w:w="943"/>
+          </w:tcPr>
+          <w:p>
+            <w:r>
+              <w:rPr>
+                <w:rFonts w:ascii="Arial" w:hAnsi="Arial"/>
+                <w:sz w:val="12"/>
+              </w:rPr>
+              <w:t>0.0001</w:t>
+            </w:r>
+          </w:p>
+        </w:tc>
+        <w:tc>
+          <w:tcPr>
+            <w:tcW w:type="dxa" w:w="943"/>
+          </w:tcPr>
+          <w:p>
+            <w:r>
+              <w:rPr>
+                <w:rFonts w:ascii="Arial" w:hAnsi="Arial"/>
+                <w:sz w:val="12"/>
+              </w:rPr>
+              <w:t>28</w:t>
+            </w:r>
+          </w:p>
+        </w:tc>
+        <w:tc>
+          <w:tcPr>
+            <w:tcW w:type="dxa" w:w="943"/>
+          </w:tcPr>
+          <w:p>
+            <w:r>
+              <w:rPr>
+                <w:rFonts w:ascii="Arial" w:hAnsi="Arial"/>
+                <w:sz w:val="12"/>
+              </w:rPr>
+              <w:t>0.4582</w:t>
+            </w:r>
+          </w:p>
+        </w:tc>
+        <w:tc>
+          <w:tcPr>
+            <w:tcW w:type="dxa" w:w="943"/>
+          </w:tcPr>
+          <w:p>
+            <w:r>
+              <w:rPr>
+                <w:rFonts w:ascii="Arial" w:hAnsi="Arial"/>
+                <w:sz w:val="12"/>
+              </w:rPr>
+              <w:t>0.0109</w:t>
+            </w:r>
+          </w:p>
+        </w:tc>
+        <w:tc>
+          <w:tcPr>
+            <w:tcW w:type="dxa" w:w="943"/>
+          </w:tcPr>
+          <w:p>
+            <w:r>
+              <w:rPr>
+                <w:rFonts w:ascii="Arial" w:hAnsi="Arial"/>
+                <w:sz w:val="12"/>
+              </w:rPr>
+              <w:t>2–28</w:t>
+            </w:r>
+          </w:p>
+        </w:tc>
+      </w:tr>
+      <w:tr>
+        <w:tc>
+          <w:tcPr>
+            <w:tcW w:type="dxa" w:w="943"/>
+          </w:tcPr>
+          <w:p>
+            <w:r>
+              <w:rPr>
+                <w:rFonts w:ascii="Arial" w:hAnsi="Arial"/>
+                <w:sz w:val="12"/>
+              </w:rPr>
+              <w:t>MELD</w:t>
+            </w:r>
+          </w:p>
+        </w:tc>
+        <w:tc>
+          <w:tcPr>
+            <w:tcW w:type="dxa" w:w="943"/>
+          </w:tcPr>
+          <w:p>
+            <w:r>
+              <w:rPr>
+                <w:rFonts w:ascii="Arial" w:hAnsi="Arial"/>
+                <w:sz w:val="12"/>
+              </w:rPr>
+              <w:t>Learning rate</w:t>
+            </w:r>
+          </w:p>
+        </w:tc>
+        <w:tc>
+          <w:tcPr>
+            <w:tcW w:type="dxa" w:w="943"/>
+          </w:tcPr>
+          <w:p>
+            <w:r>
+              <w:rPr>
+                <w:rFonts w:ascii="Arial" w:hAnsi="Arial"/>
+                <w:sz w:val="12"/>
+              </w:rPr>
+              <w:t>5</w:t>
+            </w:r>
+          </w:p>
+        </w:tc>
+        <w:tc>
+          <w:tcPr>
+            <w:tcW w:type="dxa" w:w="943"/>
+          </w:tcPr>
+          <w:p>
+            <w:r>
+              <w:rPr>
+                <w:rFonts w:ascii="Arial" w:hAnsi="Arial"/>
+                <w:sz w:val="12"/>
+              </w:rPr>
+              <w:t>0.0006</w:t>
+            </w:r>
+          </w:p>
+        </w:tc>
+        <w:tc>
+          <w:tcPr>
+            <w:tcW w:type="dxa" w:w="943"/>
+          </w:tcPr>
+          <w:p>
+            <w:r>
+              <w:rPr>
+                <w:rFonts w:ascii="Arial" w:hAnsi="Arial"/>
+                <w:sz w:val="12"/>
+              </w:rPr>
+              <w:t>1</w:t>
+            </w:r>
+          </w:p>
+        </w:tc>
+        <w:tc>
+          <w:tcPr>
+            <w:tcW w:type="dxa" w:w="943"/>
+          </w:tcPr>
+          <w:p>
+            <w:r>
+              <w:rPr>
+                <w:rFonts w:ascii="Arial" w:hAnsi="Arial"/>
+                <w:sz w:val="12"/>
+              </w:rPr>
+              <w:t>0.2414</w:t>
+            </w:r>
+          </w:p>
+        </w:tc>
+        <w:tc>
+          <w:tcPr>
+            <w:tcW w:type="dxa" w:w="943"/>
+          </w:tcPr>
+          <w:p>
+            <w:r>
+              <w:rPr>
+                <w:rFonts w:ascii="Arial" w:hAnsi="Arial"/>
+                <w:sz w:val="12"/>
+              </w:rPr>
+              <w:t>0.001</w:t>
+            </w:r>
+          </w:p>
+        </w:tc>
+        <w:tc>
+          <w:tcPr>
+            <w:tcW w:type="dxa" w:w="943"/>
+          </w:tcPr>
+          <w:p>
+            <w:r>
+              <w:rPr>
+                <w:rFonts w:ascii="Arial" w:hAnsi="Arial"/>
+                <w:sz w:val="12"/>
+              </w:rPr>
+              <w:t>1</w:t>
+            </w:r>
+          </w:p>
+        </w:tc>
+        <w:tc>
+          <w:tcPr>
+            <w:tcW w:type="dxa" w:w="943"/>
+          </w:tcPr>
+          <w:p>
+            <w:r>
+              <w:rPr>
+                <w:rFonts w:ascii="Arial" w:hAnsi="Arial"/>
+                <w:sz w:val="12"/>
+              </w:rPr>
+              <w:t>0.2137</w:t>
+            </w:r>
+          </w:p>
+        </w:tc>
+        <w:tc>
+          <w:tcPr>
+            <w:tcW w:type="dxa" w:w="943"/>
+          </w:tcPr>
+          <w:p>
+            <w:r>
+              <w:rPr>
+                <w:rFonts w:ascii="Arial" w:hAnsi="Arial"/>
+                <w:sz w:val="12"/>
+              </w:rPr>
+              <w:t>0.0277</w:t>
+            </w:r>
+          </w:p>
+        </w:tc>
+        <w:tc>
+          <w:tcPr>
+            <w:tcW w:type="dxa" w:w="943"/>
+          </w:tcPr>
+          <w:p>
+            <w:r>
+              <w:rPr>
+                <w:rFonts w:ascii="Arial" w:hAnsi="Arial"/>
+                <w:sz w:val="12"/>
+              </w:rPr>
+              <w:t>1–26</w:t>
+            </w:r>
+          </w:p>
+        </w:tc>
+      </w:tr>
+      <w:tr>
+        <w:tc>
+          <w:tcPr>
+            <w:tcW w:type="dxa" w:w="943"/>
+          </w:tcPr>
+          <w:p>
+            <w:r>
+              <w:rPr>
+                <w:rFonts w:ascii="Arial" w:hAnsi="Arial"/>
+                <w:sz w:val="12"/>
+              </w:rPr>
+              <w:t>MELD</w:t>
+            </w:r>
+          </w:p>
+        </w:tc>
+        <w:tc>
+          <w:tcPr>
+            <w:tcW w:type="dxa" w:w="943"/>
+          </w:tcPr>
+          <w:p>
+            <w:r>
+              <w:rPr>
+                <w:rFonts w:ascii="Arial" w:hAnsi="Arial"/>
+                <w:sz w:val="12"/>
+              </w:rPr>
+              <w:t>Gizli katman yapısı</w:t>
+            </w:r>
+          </w:p>
+        </w:tc>
+        <w:tc>
+          <w:tcPr>
+            <w:tcW w:type="dxa" w:w="943"/>
+          </w:tcPr>
+          <w:p>
+            <w:r>
+              <w:rPr>
+                <w:rFonts w:ascii="Arial" w:hAnsi="Arial"/>
+                <w:sz w:val="12"/>
+              </w:rPr>
+              <w:t>6</w:t>
+            </w:r>
+          </w:p>
+        </w:tc>
+        <w:tc>
+          <w:tcPr>
+            <w:tcW w:type="dxa" w:w="943"/>
+          </w:tcPr>
+          <w:p>
+            <w:r>
+              <w:rPr>
+                <w:rFonts w:ascii="Arial" w:hAnsi="Arial"/>
+                <w:sz w:val="12"/>
+              </w:rPr>
+              <w:t>512-256</w:t>
+            </w:r>
+          </w:p>
+        </w:tc>
+        <w:tc>
+          <w:tcPr>
+            <w:tcW w:type="dxa" w:w="943"/>
+          </w:tcPr>
+          <w:p>
+            <w:r>
+              <w:rPr>
+                <w:rFonts w:ascii="Arial" w:hAnsi="Arial"/>
+                <w:sz w:val="12"/>
+              </w:rPr>
+              <w:t>25</w:t>
+            </w:r>
+          </w:p>
+        </w:tc>
+        <w:tc>
+          <w:tcPr>
+            <w:tcW w:type="dxa" w:w="943"/>
+          </w:tcPr>
+          <w:p>
+            <w:r>
+              <w:rPr>
+                <w:rFonts w:ascii="Arial" w:hAnsi="Arial"/>
+                <w:sz w:val="12"/>
+              </w:rPr>
+              <w:t>0.2240</w:t>
+            </w:r>
+          </w:p>
+        </w:tc>
+        <w:tc>
+          <w:tcPr>
+            <w:tcW w:type="dxa" w:w="943"/>
+          </w:tcPr>
+          <w:p>
+            <w:r>
+              <w:rPr>
+                <w:rFonts w:ascii="Arial" w:hAnsi="Arial"/>
+                <w:sz w:val="12"/>
+              </w:rPr>
+              <w:t>512-256-128</w:t>
+            </w:r>
+          </w:p>
+        </w:tc>
+        <w:tc>
+          <w:tcPr>
+            <w:tcW w:type="dxa" w:w="943"/>
+          </w:tcPr>
+          <w:p>
+            <w:r>
+              <w:rPr>
+                <w:rFonts w:ascii="Arial" w:hAnsi="Arial"/>
+                <w:sz w:val="12"/>
+              </w:rPr>
+              <w:t>1</w:t>
+            </w:r>
+          </w:p>
+        </w:tc>
+        <w:tc>
+          <w:tcPr>
+            <w:tcW w:type="dxa" w:w="943"/>
+          </w:tcPr>
+          <w:p>
+            <w:r>
+              <w:rPr>
+                <w:rFonts w:ascii="Arial" w:hAnsi="Arial"/>
+                <w:sz w:val="12"/>
+              </w:rPr>
+              <w:t>0.2018</w:t>
+            </w:r>
+          </w:p>
+        </w:tc>
+        <w:tc>
+          <w:tcPr>
+            <w:tcW w:type="dxa" w:w="943"/>
+          </w:tcPr>
+          <w:p>
+            <w:r>
+              <w:rPr>
+                <w:rFonts w:ascii="Arial" w:hAnsi="Arial"/>
+                <w:sz w:val="12"/>
+              </w:rPr>
+              <w:t>0.0222</w:t>
+            </w:r>
+          </w:p>
+        </w:tc>
+        <w:tc>
+          <w:tcPr>
+            <w:tcW w:type="dxa" w:w="943"/>
+          </w:tcPr>
+          <w:p>
+            <w:r>
+              <w:rPr>
+                <w:rFonts w:ascii="Arial" w:hAnsi="Arial"/>
+                <w:sz w:val="12"/>
+              </w:rPr>
+              <w:t>1–25</w:t>
+            </w:r>
+          </w:p>
+        </w:tc>
+      </w:tr>
+      <w:tr>
+        <w:tc>
+          <w:tcPr>
+            <w:tcW w:type="dxa" w:w="943"/>
+          </w:tcPr>
+          <w:p>
+            <w:r>
+              <w:rPr>
+                <w:rFonts w:ascii="Arial" w:hAnsi="Arial"/>
+                <w:sz w:val="12"/>
+              </w:rPr>
+              <w:t>MELD</w:t>
+            </w:r>
+          </w:p>
+        </w:tc>
+        <w:tc>
+          <w:tcPr>
+            <w:tcW w:type="dxa" w:w="943"/>
+          </w:tcPr>
+          <w:p>
+            <w:r>
+              <w:rPr>
+                <w:rFonts w:ascii="Arial" w:hAnsi="Arial"/>
+                <w:sz w:val="12"/>
+              </w:rPr>
+              <w:t>Batch boyutu</w:t>
+            </w:r>
+          </w:p>
+        </w:tc>
+        <w:tc>
+          <w:tcPr>
+            <w:tcW w:type="dxa" w:w="943"/>
+          </w:tcPr>
+          <w:p>
+            <w:r>
+              <w:rPr>
+                <w:rFonts w:ascii="Arial" w:hAnsi="Arial"/>
+                <w:sz w:val="12"/>
+              </w:rPr>
+              <w:t>3</w:t>
+            </w:r>
+          </w:p>
+        </w:tc>
+        <w:tc>
+          <w:tcPr>
+            <w:tcW w:type="dxa" w:w="943"/>
+          </w:tcPr>
+          <w:p>
+            <w:r>
+              <w:rPr>
+                <w:rFonts w:ascii="Arial" w:hAnsi="Arial"/>
+                <w:sz w:val="12"/>
+              </w:rPr>
+              <w:t>32</w:t>
+            </w:r>
+          </w:p>
+        </w:tc>
+        <w:tc>
+          <w:tcPr>
+            <w:tcW w:type="dxa" w:w="943"/>
+          </w:tcPr>
+          <w:p>
+            <w:r>
+              <w:rPr>
+                <w:rFonts w:ascii="Arial" w:hAnsi="Arial"/>
+                <w:sz w:val="12"/>
+              </w:rPr>
+              <w:t>2</w:t>
+            </w:r>
+          </w:p>
+        </w:tc>
+        <w:tc>
+          <w:tcPr>
+            <w:tcW w:type="dxa" w:w="943"/>
+          </w:tcPr>
+          <w:p>
+            <w:r>
+              <w:rPr>
+                <w:rFonts w:ascii="Arial" w:hAnsi="Arial"/>
+                <w:sz w:val="12"/>
+              </w:rPr>
+              <w:t>0.2263</w:t>
+            </w:r>
+          </w:p>
+        </w:tc>
+        <w:tc>
+          <w:tcPr>
+            <w:tcW w:type="dxa" w:w="943"/>
+          </w:tcPr>
+          <w:p>
+            <w:r>
+              <w:rPr>
+                <w:rFonts w:ascii="Arial" w:hAnsi="Arial"/>
+                <w:sz w:val="12"/>
+              </w:rPr>
+              <w:t>64</w:t>
+            </w:r>
+          </w:p>
+        </w:tc>
+        <w:tc>
+          <w:tcPr>
+            <w:tcW w:type="dxa" w:w="943"/>
+          </w:tcPr>
+          <w:p>
+            <w:r>
+              <w:rPr>
+                <w:rFonts w:ascii="Arial" w:hAnsi="Arial"/>
+                <w:sz w:val="12"/>
+              </w:rPr>
+              <w:t>26</w:t>
+            </w:r>
+          </w:p>
+        </w:tc>
+        <w:tc>
+          <w:tcPr>
+            <w:tcW w:type="dxa" w:w="943"/>
+          </w:tcPr>
+          <w:p>
+            <w:r>
+              <w:rPr>
+                <w:rFonts w:ascii="Arial" w:hAnsi="Arial"/>
+                <w:sz w:val="12"/>
+              </w:rPr>
+              <w:t>0.2212</w:t>
+            </w:r>
+          </w:p>
+        </w:tc>
+        <w:tc>
+          <w:tcPr>
+            <w:tcW w:type="dxa" w:w="943"/>
+          </w:tcPr>
+          <w:p>
+            <w:r>
+              <w:rPr>
+                <w:rFonts w:ascii="Arial" w:hAnsi="Arial"/>
+                <w:sz w:val="12"/>
+              </w:rPr>
+              <w:t>0.0050</w:t>
+            </w:r>
+          </w:p>
+        </w:tc>
+        <w:tc>
+          <w:tcPr>
+            <w:tcW w:type="dxa" w:w="943"/>
+          </w:tcPr>
+          <w:p>
+            <w:r>
+              <w:rPr>
+                <w:rFonts w:ascii="Arial" w:hAnsi="Arial"/>
+                <w:sz w:val="12"/>
+              </w:rPr>
+              <w:t>2–26</w:t>
+            </w:r>
+          </w:p>
+        </w:tc>
+      </w:tr>
+      <w:tr>
+        <w:tc>
+          <w:tcPr>
+            <w:tcW w:type="dxa" w:w="943"/>
+          </w:tcPr>
+          <w:p>
+            <w:r>
+              <w:rPr>
+                <w:rFonts w:ascii="Arial" w:hAnsi="Arial"/>
+                <w:sz w:val="12"/>
+              </w:rPr>
+              <w:t>MELD</w:t>
+            </w:r>
+          </w:p>
+        </w:tc>
+        <w:tc>
+          <w:tcPr>
+            <w:tcW w:type="dxa" w:w="943"/>
+          </w:tcPr>
+          <w:p>
+            <w:r>
+              <w:rPr>
+                <w:rFonts w:ascii="Arial" w:hAnsi="Arial"/>
+                <w:sz w:val="12"/>
+              </w:rPr>
+              <w:t>Patience</w:t>
+            </w:r>
+          </w:p>
+        </w:tc>
+        <w:tc>
+          <w:tcPr>
+            <w:tcW w:type="dxa" w:w="943"/>
+          </w:tcPr>
+          <w:p>
+            <w:r>
+              <w:rPr>
+                <w:rFonts w:ascii="Arial" w:hAnsi="Arial"/>
+                <w:sz w:val="12"/>
+              </w:rPr>
+              <w:t>5</w:t>
+            </w:r>
+          </w:p>
+        </w:tc>
+        <w:tc>
+          <w:tcPr>
+            <w:tcW w:type="dxa" w:w="943"/>
+          </w:tcPr>
+          <w:p>
+            <w:r>
+              <w:rPr>
+                <w:rFonts w:ascii="Arial" w:hAnsi="Arial"/>
+                <w:sz w:val="12"/>
+              </w:rPr>
+              <w:t>10</w:t>
+            </w:r>
+          </w:p>
+        </w:tc>
+        <w:tc>
+          <w:tcPr>
+            <w:tcW w:type="dxa" w:w="943"/>
+          </w:tcPr>
+          <w:p>
+            <w:r>
+              <w:rPr>
+                <w:rFonts w:ascii="Arial" w:hAnsi="Arial"/>
+                <w:sz w:val="12"/>
+              </w:rPr>
+              <w:t>1</w:t>
+            </w:r>
+          </w:p>
+        </w:tc>
+        <w:tc>
+          <w:tcPr>
+            <w:tcW w:type="dxa" w:w="943"/>
+          </w:tcPr>
+          <w:p>
+            <w:r>
+              <w:rPr>
+                <w:rFonts w:ascii="Arial" w:hAnsi="Arial"/>
+                <w:sz w:val="12"/>
+              </w:rPr>
+              <w:t>0.2525</w:t>
+            </w:r>
+          </w:p>
+        </w:tc>
+        <w:tc>
+          <w:tcPr>
+            <w:tcW w:type="dxa" w:w="943"/>
+          </w:tcPr>
+          <w:p>
+            <w:r>
+              <w:rPr>
+                <w:rFonts w:ascii="Arial" w:hAnsi="Arial"/>
+                <w:sz w:val="12"/>
+              </w:rPr>
+              <w:t>5</w:t>
+            </w:r>
+          </w:p>
+        </w:tc>
+        <w:tc>
+          <w:tcPr>
+            <w:tcW w:type="dxa" w:w="943"/>
+          </w:tcPr>
+          <w:p>
+            <w:r>
+              <w:rPr>
+                <w:rFonts w:ascii="Arial" w:hAnsi="Arial"/>
+                <w:sz w:val="12"/>
+              </w:rPr>
+              <w:t>1</w:t>
+            </w:r>
+          </w:p>
+        </w:tc>
+        <w:tc>
+          <w:tcPr>
+            <w:tcW w:type="dxa" w:w="943"/>
+          </w:tcPr>
+          <w:p>
+            <w:r>
+              <w:rPr>
+                <w:rFonts w:ascii="Arial" w:hAnsi="Arial"/>
+                <w:sz w:val="12"/>
+              </w:rPr>
+              <w:t>0.2099</w:t>
+            </w:r>
+          </w:p>
+        </w:tc>
+        <w:tc>
+          <w:tcPr>
+            <w:tcW w:type="dxa" w:w="943"/>
+          </w:tcPr>
+          <w:p>
+            <w:r>
+              <w:rPr>
+                <w:rFonts w:ascii="Arial" w:hAnsi="Arial"/>
+                <w:sz w:val="12"/>
+              </w:rPr>
+              <w:t>0.0426</w:t>
+            </w:r>
+          </w:p>
+        </w:tc>
+        <w:tc>
+          <w:tcPr>
+            <w:tcW w:type="dxa" w:w="943"/>
+          </w:tcPr>
+          <w:p>
+            <w:r>
+              <w:rPr>
+                <w:rFonts w:ascii="Arial" w:hAnsi="Arial"/>
+                <w:sz w:val="12"/>
+              </w:rPr>
+              <w:t>1–26</w:t>
+            </w:r>
+          </w:p>
+        </w:tc>
+      </w:tr>
+      <w:tr>
+        <w:tc>
+          <w:tcPr>
+            <w:tcW w:type="dxa" w:w="943"/>
+          </w:tcPr>
+          <w:p>
+            <w:r>
+              <w:rPr>
+                <w:rFonts w:ascii="Arial" w:hAnsi="Arial"/>
+                <w:sz w:val="12"/>
+              </w:rPr>
+              <w:t>MELD</w:t>
+            </w:r>
+          </w:p>
+        </w:tc>
+        <w:tc>
+          <w:tcPr>
+            <w:tcW w:type="dxa" w:w="943"/>
+          </w:tcPr>
+          <w:p>
+            <w:r>
+              <w:rPr>
+                <w:rFonts w:ascii="Arial" w:hAnsi="Arial"/>
+                <w:sz w:val="12"/>
+              </w:rPr>
+              <w:t>Aktivasyon</w:t>
+            </w:r>
+          </w:p>
+        </w:tc>
+        <w:tc>
+          <w:tcPr>
+            <w:tcW w:type="dxa" w:w="943"/>
+          </w:tcPr>
+          <w:p>
+            <w:r>
+              <w:rPr>
+                <w:rFonts w:ascii="Arial" w:hAnsi="Arial"/>
+                <w:sz w:val="12"/>
+              </w:rPr>
+              <w:t>3</w:t>
+            </w:r>
+          </w:p>
+        </w:tc>
+        <w:tc>
+          <w:tcPr>
+            <w:tcW w:type="dxa" w:w="943"/>
+          </w:tcPr>
+          <w:p>
+            <w:r>
+              <w:rPr>
+                <w:rFonts w:ascii="Arial" w:hAnsi="Arial"/>
+                <w:sz w:val="12"/>
+              </w:rPr>
+              <w:t>relu</w:t>
+            </w:r>
+          </w:p>
+        </w:tc>
+        <w:tc>
+          <w:tcPr>
+            <w:tcW w:type="dxa" w:w="943"/>
+          </w:tcPr>
+          <w:p>
+            <w:r>
+              <w:rPr>
+                <w:rFonts w:ascii="Arial" w:hAnsi="Arial"/>
+                <w:sz w:val="12"/>
+              </w:rPr>
+              <w:t>26</w:t>
+            </w:r>
+          </w:p>
+        </w:tc>
+        <w:tc>
+          <w:tcPr>
+            <w:tcW w:type="dxa" w:w="943"/>
+          </w:tcPr>
+          <w:p>
+            <w:r>
+              <w:rPr>
+                <w:rFonts w:ascii="Arial" w:hAnsi="Arial"/>
+                <w:sz w:val="12"/>
+              </w:rPr>
+              <w:t>0.2234</w:t>
+            </w:r>
+          </w:p>
+        </w:tc>
+        <w:tc>
+          <w:tcPr>
+            <w:tcW w:type="dxa" w:w="943"/>
+          </w:tcPr>
+          <w:p>
+            <w:r>
+              <w:rPr>
+                <w:rFonts w:ascii="Arial" w:hAnsi="Arial"/>
+                <w:sz w:val="12"/>
+              </w:rPr>
+              <w:t>tanh</w:t>
+            </w:r>
+          </w:p>
+        </w:tc>
+        <w:tc>
+          <w:tcPr>
+            <w:tcW w:type="dxa" w:w="943"/>
+          </w:tcPr>
+          <w:p>
+            <w:r>
+              <w:rPr>
+                <w:rFonts w:ascii="Arial" w:hAnsi="Arial"/>
+                <w:sz w:val="12"/>
+              </w:rPr>
+              <w:t>2</w:t>
+            </w:r>
+          </w:p>
+        </w:tc>
+        <w:tc>
+          <w:tcPr>
+            <w:tcW w:type="dxa" w:w="943"/>
+          </w:tcPr>
+          <w:p>
+            <w:r>
+              <w:rPr>
+                <w:rFonts w:ascii="Arial" w:hAnsi="Arial"/>
+                <w:sz w:val="12"/>
+              </w:rPr>
+              <w:t>0.2104</w:t>
+            </w:r>
+          </w:p>
+        </w:tc>
+        <w:tc>
+          <w:tcPr>
+            <w:tcW w:type="dxa" w:w="943"/>
+          </w:tcPr>
+          <w:p>
+            <w:r>
+              <w:rPr>
+                <w:rFonts w:ascii="Arial" w:hAnsi="Arial"/>
+                <w:sz w:val="12"/>
+              </w:rPr>
+              <w:t>0.0130</w:t>
+            </w:r>
+          </w:p>
+        </w:tc>
+        <w:tc>
+          <w:tcPr>
+            <w:tcW w:type="dxa" w:w="943"/>
+          </w:tcPr>
+          <w:p>
+            <w:r>
+              <w:rPr>
+                <w:rFonts w:ascii="Arial" w:hAnsi="Arial"/>
+                <w:sz w:val="12"/>
+              </w:rPr>
+              <w:t>2–26</w:t>
+            </w:r>
+          </w:p>
+        </w:tc>
+      </w:tr>
+      <w:tr>
+        <w:tc>
+          <w:tcPr>
+            <w:tcW w:type="dxa" w:w="943"/>
+          </w:tcPr>
+          <w:p>
+            <w:r>
+              <w:rPr>
+                <w:rFonts w:ascii="Arial" w:hAnsi="Arial"/>
+                <w:sz w:val="12"/>
+              </w:rPr>
+              <w:t>MELD</w:t>
+            </w:r>
+          </w:p>
+        </w:tc>
+        <w:tc>
+          <w:tcPr>
+            <w:tcW w:type="dxa" w:w="943"/>
+          </w:tcPr>
+          <w:p>
+            <w:r>
+              <w:rPr>
+                <w:rFonts w:ascii="Arial" w:hAnsi="Arial"/>
+                <w:sz w:val="12"/>
+              </w:rPr>
+              <w:t>Batch normalization</w:t>
+            </w:r>
+          </w:p>
+        </w:tc>
+        <w:tc>
+          <w:tcPr>
+            <w:tcW w:type="dxa" w:w="943"/>
+          </w:tcPr>
+          <w:p>
+            <w:r>
+              <w:rPr>
+                <w:rFonts w:ascii="Arial" w:hAnsi="Arial"/>
+                <w:sz w:val="12"/>
+              </w:rPr>
+              <w:t>2</w:t>
+            </w:r>
+          </w:p>
+        </w:tc>
+        <w:tc>
+          <w:tcPr>
+            <w:tcW w:type="dxa" w:w="943"/>
+          </w:tcPr>
+          <w:p>
+            <w:r>
+              <w:rPr>
+                <w:rFonts w:ascii="Arial" w:hAnsi="Arial"/>
+                <w:sz w:val="12"/>
+              </w:rPr>
+              <w:t>true</w:t>
+            </w:r>
+          </w:p>
+        </w:tc>
+        <w:tc>
+          <w:tcPr>
+            <w:tcW w:type="dxa" w:w="943"/>
+          </w:tcPr>
+          <w:p>
+            <w:r>
+              <w:rPr>
+                <w:rFonts w:ascii="Arial" w:hAnsi="Arial"/>
+                <w:sz w:val="12"/>
+              </w:rPr>
+              <w:t>28</w:t>
+            </w:r>
+          </w:p>
+        </w:tc>
+        <w:tc>
+          <w:tcPr>
+            <w:tcW w:type="dxa" w:w="943"/>
+          </w:tcPr>
+          <w:p>
+            <w:r>
+              <w:rPr>
+                <w:rFonts w:ascii="Arial" w:hAnsi="Arial"/>
+                <w:sz w:val="12"/>
+              </w:rPr>
+              <w:t>0.2236</w:t>
+            </w:r>
+          </w:p>
+        </w:tc>
+        <w:tc>
+          <w:tcPr>
+            <w:tcW w:type="dxa" w:w="943"/>
+          </w:tcPr>
+          <w:p>
+            <w:r>
+              <w:rPr>
+                <w:rFonts w:ascii="Arial" w:hAnsi="Arial"/>
+                <w:sz w:val="12"/>
+              </w:rPr>
+              <w:t>false</w:t>
+            </w:r>
+          </w:p>
+        </w:tc>
+        <w:tc>
+          <w:tcPr>
+            <w:tcW w:type="dxa" w:w="943"/>
+          </w:tcPr>
+          <w:p>
+            <w:r>
+              <w:rPr>
+                <w:rFonts w:ascii="Arial" w:hAnsi="Arial"/>
+                <w:sz w:val="12"/>
+              </w:rPr>
+              <w:t>2</w:t>
+            </w:r>
+          </w:p>
+        </w:tc>
+        <w:tc>
+          <w:tcPr>
+            <w:tcW w:type="dxa" w:w="943"/>
+          </w:tcPr>
+          <w:p>
+            <w:r>
+              <w:rPr>
+                <w:rFonts w:ascii="Arial" w:hAnsi="Arial"/>
+                <w:sz w:val="12"/>
+              </w:rPr>
+              <w:t>0.1963</w:t>
+            </w:r>
+          </w:p>
+        </w:tc>
+        <w:tc>
+          <w:tcPr>
+            <w:tcW w:type="dxa" w:w="943"/>
+          </w:tcPr>
+          <w:p>
+            <w:r>
+              <w:rPr>
+                <w:rFonts w:ascii="Arial" w:hAnsi="Arial"/>
+                <w:sz w:val="12"/>
+              </w:rPr>
+              <w:t>0.0273</w:t>
+            </w:r>
+          </w:p>
+        </w:tc>
+        <w:tc>
+          <w:tcPr>
+            <w:tcW w:type="dxa" w:w="943"/>
+          </w:tcPr>
+          <w:p>
+            <w:r>
+              <w:rPr>
+                <w:rFonts w:ascii="Arial" w:hAnsi="Arial"/>
+                <w:sz w:val="12"/>
+              </w:rPr>
+              <w:t>2–28</w:t>
+            </w:r>
+          </w:p>
+        </w:tc>
+      </w:tr>
+      <w:tr>
+        <w:tc>
+          <w:tcPr>
+            <w:tcW w:type="dxa" w:w="943"/>
+          </w:tcPr>
+          <w:p>
+            <w:r>
+              <w:rPr>
+                <w:rFonts w:ascii="Arial" w:hAnsi="Arial"/>
+                <w:sz w:val="12"/>
+              </w:rPr>
+              <w:t>MELD</w:t>
+            </w:r>
+          </w:p>
+        </w:tc>
+        <w:tc>
+          <w:tcPr>
+            <w:tcW w:type="dxa" w:w="943"/>
+          </w:tcPr>
+          <w:p>
+            <w:r>
+              <w:rPr>
+                <w:rFonts w:ascii="Arial" w:hAnsi="Arial"/>
+                <w:sz w:val="12"/>
+              </w:rPr>
+              <w:t>Dropout</w:t>
+            </w:r>
+          </w:p>
+        </w:tc>
+        <w:tc>
+          <w:tcPr>
+            <w:tcW w:type="dxa" w:w="943"/>
+          </w:tcPr>
+          <w:p>
+            <w:r>
+              <w:rPr>
+                <w:rFonts w:ascii="Arial" w:hAnsi="Arial"/>
+                <w:sz w:val="12"/>
+              </w:rPr>
+              <w:t>5</w:t>
+            </w:r>
+          </w:p>
+        </w:tc>
+        <w:tc>
+          <w:tcPr>
+            <w:tcW w:type="dxa" w:w="943"/>
+          </w:tcPr>
+          <w:p>
+            <w:r>
+              <w:rPr>
+                <w:rFonts w:ascii="Arial" w:hAnsi="Arial"/>
+                <w:sz w:val="12"/>
+              </w:rPr>
+              <w:t>0.5</w:t>
+            </w:r>
+          </w:p>
+        </w:tc>
+        <w:tc>
+          <w:tcPr>
+            <w:tcW w:type="dxa" w:w="943"/>
+          </w:tcPr>
+          <w:p>
+            <w:r>
+              <w:rPr>
+                <w:rFonts w:ascii="Arial" w:hAnsi="Arial"/>
+                <w:sz w:val="12"/>
+              </w:rPr>
+              <w:t>13</w:t>
+            </w:r>
+          </w:p>
+        </w:tc>
+        <w:tc>
+          <w:tcPr>
+            <w:tcW w:type="dxa" w:w="943"/>
+          </w:tcPr>
+          <w:p>
+            <w:r>
+              <w:rPr>
+                <w:rFonts w:ascii="Arial" w:hAnsi="Arial"/>
+                <w:sz w:val="12"/>
+              </w:rPr>
+              <w:t>0.2299</w:t>
+            </w:r>
+          </w:p>
+        </w:tc>
+        <w:tc>
+          <w:tcPr>
+            <w:tcW w:type="dxa" w:w="943"/>
+          </w:tcPr>
+          <w:p>
+            <w:r>
+              <w:rPr>
+                <w:rFonts w:ascii="Arial" w:hAnsi="Arial"/>
+                <w:sz w:val="12"/>
+              </w:rPr>
+              <w:t>0.4</w:t>
+            </w:r>
+          </w:p>
+        </w:tc>
+        <w:tc>
+          <w:tcPr>
+            <w:tcW w:type="dxa" w:w="943"/>
+          </w:tcPr>
+          <w:p>
+            <w:r>
+              <w:rPr>
+                <w:rFonts w:ascii="Arial" w:hAnsi="Arial"/>
+                <w:sz w:val="12"/>
+              </w:rPr>
+              <w:t>1</w:t>
+            </w:r>
+          </w:p>
+        </w:tc>
+        <w:tc>
+          <w:tcPr>
+            <w:tcW w:type="dxa" w:w="943"/>
+          </w:tcPr>
+          <w:p>
+            <w:r>
+              <w:rPr>
+                <w:rFonts w:ascii="Arial" w:hAnsi="Arial"/>
+                <w:sz w:val="12"/>
+              </w:rPr>
+              <w:t>0.2137</w:t>
+            </w:r>
+          </w:p>
+        </w:tc>
+        <w:tc>
+          <w:tcPr>
+            <w:tcW w:type="dxa" w:w="943"/>
+          </w:tcPr>
+          <w:p>
+            <w:r>
+              <w:rPr>
+                <w:rFonts w:ascii="Arial" w:hAnsi="Arial"/>
+                <w:sz w:val="12"/>
+              </w:rPr>
+              <w:t>0.0161</w:t>
+            </w:r>
+          </w:p>
+        </w:tc>
+        <w:tc>
+          <w:tcPr>
+            <w:tcW w:type="dxa" w:w="943"/>
+          </w:tcPr>
+          <w:p>
+            <w:r>
+              <w:rPr>
+                <w:rFonts w:ascii="Arial" w:hAnsi="Arial"/>
+                <w:sz w:val="12"/>
+              </w:rPr>
+              <w:t>1–14</w:t>
+            </w:r>
+          </w:p>
+        </w:tc>
+      </w:tr>
+      <w:tr>
+        <w:tc>
+          <w:tcPr>
+            <w:tcW w:type="dxa" w:w="943"/>
+          </w:tcPr>
+          <w:p>
+            <w:r>
+              <w:rPr>
+                <w:rFonts w:ascii="Arial" w:hAnsi="Arial"/>
+                <w:sz w:val="12"/>
+              </w:rPr>
+              <w:t>MELD</w:t>
+            </w:r>
+          </w:p>
+        </w:tc>
+        <w:tc>
+          <w:tcPr>
+            <w:tcW w:type="dxa" w:w="943"/>
+          </w:tcPr>
+          <w:p>
+            <w:r>
+              <w:rPr>
+                <w:rFonts w:ascii="Arial" w:hAnsi="Arial"/>
+                <w:sz w:val="12"/>
+              </w:rPr>
+              <w:t>Weight decay</w:t>
+            </w:r>
+          </w:p>
+        </w:tc>
+        <w:tc>
+          <w:tcPr>
+            <w:tcW w:type="dxa" w:w="943"/>
+          </w:tcPr>
+          <w:p>
+            <w:r>
+              <w:rPr>
+                <w:rFonts w:ascii="Arial" w:hAnsi="Arial"/>
+                <w:sz w:val="12"/>
+              </w:rPr>
+              <w:t>2</w:t>
+            </w:r>
+          </w:p>
+        </w:tc>
+        <w:tc>
+          <w:tcPr>
+            <w:tcW w:type="dxa" w:w="943"/>
+          </w:tcPr>
+          <w:p>
+            <w:r>
+              <w:rPr>
+                <w:rFonts w:ascii="Arial" w:hAnsi="Arial"/>
+                <w:sz w:val="12"/>
+              </w:rPr>
+              <w:t>0</w:t>
+            </w:r>
+          </w:p>
+        </w:tc>
+        <w:tc>
+          <w:tcPr>
+            <w:tcW w:type="dxa" w:w="943"/>
+          </w:tcPr>
+          <w:p>
+            <w:r>
+              <w:rPr>
+                <w:rFonts w:ascii="Arial" w:hAnsi="Arial"/>
+                <w:sz w:val="12"/>
+              </w:rPr>
+              <w:t>2</w:t>
+            </w:r>
+          </w:p>
+        </w:tc>
+        <w:tc>
+          <w:tcPr>
+            <w:tcW w:type="dxa" w:w="943"/>
+          </w:tcPr>
+          <w:p>
+            <w:r>
+              <w:rPr>
+                <w:rFonts w:ascii="Arial" w:hAnsi="Arial"/>
+                <w:sz w:val="12"/>
+              </w:rPr>
+              <w:t>0.2343</w:t>
+            </w:r>
+          </w:p>
+        </w:tc>
+        <w:tc>
+          <w:tcPr>
+            <w:tcW w:type="dxa" w:w="943"/>
+          </w:tcPr>
+          <w:p>
+            <w:r>
+              <w:rPr>
+                <w:rFonts w:ascii="Arial" w:hAnsi="Arial"/>
+                <w:sz w:val="12"/>
+              </w:rPr>
+              <w:t>0.0001</w:t>
+            </w:r>
+          </w:p>
+        </w:tc>
+        <w:tc>
+          <w:tcPr>
+            <w:tcW w:type="dxa" w:w="943"/>
+          </w:tcPr>
+          <w:p>
+            <w:r>
+              <w:rPr>
+                <w:rFonts w:ascii="Arial" w:hAnsi="Arial"/>
+                <w:sz w:val="12"/>
+              </w:rPr>
+              <w:t>28</w:t>
+            </w:r>
+          </w:p>
+        </w:tc>
+        <w:tc>
+          <w:tcPr>
+            <w:tcW w:type="dxa" w:w="943"/>
+          </w:tcPr>
+          <w:p>
+            <w:r>
+              <w:rPr>
+                <w:rFonts w:ascii="Arial" w:hAnsi="Arial"/>
+                <w:sz w:val="12"/>
+              </w:rPr>
+              <w:t>0.2209</w:t>
+            </w:r>
+          </w:p>
+        </w:tc>
+        <w:tc>
+          <w:tcPr>
+            <w:tcW w:type="dxa" w:w="943"/>
+          </w:tcPr>
+          <w:p>
+            <w:r>
+              <w:rPr>
+                <w:rFonts w:ascii="Arial" w:hAnsi="Arial"/>
+                <w:sz w:val="12"/>
+              </w:rPr>
+              <w:t>0.0135</w:t>
+            </w:r>
+          </w:p>
+        </w:tc>
+        <w:tc>
+          <w:tcPr>
+            <w:tcW w:type="dxa" w:w="943"/>
+          </w:tcPr>
+          <w:p>
+            <w:r>
+              <w:rPr>
+                <w:rFonts w:ascii="Arial" w:hAnsi="Arial"/>
+                <w:sz w:val="12"/>
+              </w:rPr>
+              <w:t>2–28</w:t>
+            </w:r>
+          </w:p>
+        </w:tc>
+      </w:tr>
+    </w:tbl>
+    <w:p/>
+    <w:p>
+      <w:pPr>
+        <w:spacing w:after="120"/>
+      </w:pPr>
+      <w:r>
+        <w:t>Etki özeti, iki veri kümesindeki toplam 60 benzersiz tarama/iyileştirme konfigürasyonunu kullanmıştır. Aynı yapıların seed tekrarı olan 4 stability satırı bu hesaba katılmamıştır.</w:t>
+      </w:r>
+    </w:p>
+    <w:p>
+      <w:pPr>
+        <w:spacing w:after="120"/>
+      </w:pPr>
+      <w:r>
+        <w:t>CREMA-D için en geniş grup-ortalaması aralığı Gizli katman yapısı değişkeninde görülmüştür: 768-384-192 (n=1, macro-F1=0.4754) ile 256 (n=1, macro-F1=0.4237) arasındaki betimsel fark 0.0517 değerindedir.</w:t>
+      </w:r>
+    </w:p>
+    <w:p>
+      <w:pPr>
+        <w:spacing w:after="120"/>
+      </w:pPr>
+      <w:r>
+        <w:t>MELD için en geniş grup-ortalaması aralığı Patience değişkeninde görülmüştür: 10 (n=1, macro-F1=0.2525) ile 5 (n=1, macro-F1=0.2099) arasındaki betimsel fark 0.0426 değerindedir.</w:t>
+      </w:r>
+    </w:p>
+    <w:p>
+      <w:pPr>
+        <w:spacing w:after="120"/>
+      </w:pPr>
+      <w:r>
+        <w:t>Arama dengeli tam faktöriyel değildir ve konfigürasyonlarda birden çok parametre birlikte değişmektedir. Bu nedenle tablo izole nedensel etki kanıtı değil, sonraki kontrollü deneyleri yönlendiren betimsel ilişki olarak okunmalıdır; özellikle n=1 gruplar genellenmemelidir.</w:t>
+      </w:r>
+    </w:p>
+    <w:p>
+      <w:pPr>
+        <w:pStyle w:val="Heading2"/>
+      </w:pPr>
+      <w:r>
         <w:t>Çoklu Seed Kararlılık Sonuçları</w:t>
       </w:r>
     </w:p>
@@ -31233,7 +34243,7 @@
         <w:rPr>
           <w:b/>
         </w:rPr>
-        <w:t>Tablo 11. Seçilen yapıların seed duyarlılığı</w:t>
+        <w:t>Tablo 12. Seçilen yapıların seed duyarlılığı</w:t>
       </w:r>
     </w:p>
     <w:tbl>
@@ -36459,7 +39469,7 @@
         <w:spacing w:after="120"/>
       </w:pPr>
       <w:r>
-        <w:t>Bu aşamada 2 veri kümesi için toplam 64 hiperparametre/seed koşusu, 16 özellik ablation koşusu ve 12 çoklu-seed özellik doğrulama koşusu tamamlanmıştır. Her veri kümesi için bağımsız, sıfırdan PyTorch MLP modeli; train-only normalizasyon; sınıf ağırlıklı kayıp; erken durdurma; kaydedilmiş checkpoint; test tahminleri, karmaşıklık matrisi, bootstrap belirsizliği, validation-temelli temperature scaling ve güvenilirlik diyagramları üretilmiştir. Ölçekleme her iki veri kümesinde test NLL, Brier ve ECE değerlerini düşürmüş; sınıf tahminlerini ve sınıflandırma metriklerini değiştirmemiştir.</w:t>
+        <w:t>Bu aşamada 2 veri kümesi için toplam 64 hiperparametre/seed koşusu, 16 özellik ablation koşusu ve 12 çoklu-seed özellik doğrulama koşusu tamamlanmıştır. Her veri kümesi için bağımsız, sıfırdan PyTorch MLP modeli; train-only normalizasyon; sınıf ağırlıklı kayıp; erken durdurma; kaydedilmiş checkpoint; test tahminleri, karmaşıklık matrisi, bootstrap belirsizliği, validation-temelli temperature scaling ve güvenilirlik diyagramları üretilmiştir. Ölçekleme her iki veri kümesinde test NLL, Brier ve ECE değerlerini düşürmüş; sınıf tahminlerini ve sınıflandırma metriklerini değiştirmemiştir. Mevcut koşuların 60 benzersiz konfigürasyonu ayrıca parametre değerlerine göre betimsel olarak gruplanmış; 4 stability tekrarı bu analizden ayrılmıştır.</w:t>
       </w:r>
     </w:p>
     <w:p>
@@ -36844,6 +39854,50 @@
                 <w:sz w:val="16"/>
               </w:rPr>
               <w:t>validation_results.csv tabloları</w:t>
+            </w:r>
+          </w:p>
+        </w:tc>
+      </w:tr>
+      <w:tr>
+        <w:tc>
+          <w:tcPr>
+            <w:tcW w:type="dxa" w:w="3456"/>
+          </w:tcPr>
+          <w:p>
+            <w:r>
+              <w:rPr>
+                <w:rFonts w:ascii="Arial" w:hAnsi="Arial"/>
+                <w:sz w:val="16"/>
+              </w:rPr>
+              <w:t>Hiperparametre ilişkileri koşu sayılarıyla incelendi</w:t>
+            </w:r>
+          </w:p>
+        </w:tc>
+        <w:tc>
+          <w:tcPr>
+            <w:tcW w:type="dxa" w:w="3456"/>
+          </w:tcPr>
+          <w:p>
+            <w:r>
+              <w:rPr>
+                <w:rFonts w:ascii="Arial" w:hAnsi="Arial"/>
+                <w:sz w:val="16"/>
+              </w:rPr>
+              <w:t>Evet</w:t>
+            </w:r>
+          </w:p>
+        </w:tc>
+        <w:tc>
+          <w:tcPr>
+            <w:tcW w:type="dxa" w:w="3456"/>
+          </w:tcPr>
+          <w:p>
+            <w:r>
+              <w:rPr>
+                <w:rFonts w:ascii="Arial" w:hAnsi="Arial"/>
+                <w:sz w:val="16"/>
+              </w:rPr>
+              <w:t>parameter_effects.csv ve parameter_effect_overview.csv</w:t>
             </w:r>
           </w:p>
         </w:tc>

</xml_diff>